<commit_message>
chore(config): 🔨 更新 vcm 报告 docx 模板
Why: 模板样式/字段调整, 二进制文件直接替换
</commit_message>
<xml_diff>
--- a/public/vcm_report_template_cn.docx
+++ b/public/vcm_report_template_cn.docx
@@ -1,11 +1,11 @@
 
 <file path=word/document.xml><?xml version="1.0" encoding="utf-8"?>
-<w:document xmlns:wpc="http://schemas.microsoft.com/office/word/2010/wordprocessingCanvas" xmlns:cx="http://schemas.microsoft.com/office/drawing/2014/chartex" xmlns:cx1="http://schemas.microsoft.com/office/drawing/2015/9/8/chartex" xmlns:cx2="http://schemas.microsoft.com/office/drawing/2015/10/21/chartex" xmlns:cx3="http://schemas.microsoft.com/office/drawing/2016/5/9/chartex" xmlns:cx4="http://schemas.microsoft.com/office/drawing/2016/5/10/chartex" xmlns:cx5="http://schemas.microsoft.com/office/drawing/2016/5/11/chartex" xmlns:cx6="http://schemas.microsoft.com/office/drawing/2016/5/12/chartex" xmlns:cx7="http://schemas.microsoft.com/office/drawing/2016/5/13/chartex" xmlns:cx8="http://schemas.microsoft.com/office/drawing/2016/5/14/chartex" xmlns:mc="http://schemas.openxmlformats.org/markup-compatibility/2006" xmlns:aink="http://schemas.microsoft.com/office/drawing/2016/ink" xmlns:am3d="http://schemas.microsoft.com/office/drawing/2017/model3d" xmlns:o="urn:schemas-microsoft-com:office:office" xmlns:r="http://schemas.openxmlformats.org/officeDocument/2006/relationships" xmlns:m="http://schemas.openxmlformats.org/officeDocument/2006/math" xmlns:v="urn:schemas-microsoft-com:vml" xmlns:wp14="http://schemas.microsoft.com/office/word/2010/wordprocessingDrawing" xmlns:wp="http://schemas.openxmlformats.org/drawingml/2006/wordprocessingDrawing" xmlns:w10="urn:schemas-microsoft-com:office:word" xmlns:w="http://schemas.openxmlformats.org/wordprocessingml/2006/main" xmlns:w14="http://schemas.microsoft.com/office/word/2010/wordml" xmlns:w15="http://schemas.microsoft.com/office/word/2012/wordml" xmlns:w16cex="http://schemas.microsoft.com/office/word/2018/wordml/cex" xmlns:w16cid="http://schemas.microsoft.com/office/word/2016/wordml/cid" xmlns:w16="http://schemas.microsoft.com/office/word/2018/wordml" xmlns:w16sdtdh="http://schemas.microsoft.com/office/word/2020/wordml/sdtdatahash" xmlns:w16se="http://schemas.microsoft.com/office/word/2015/wordml/symex" xmlns:wpg="http://schemas.microsoft.com/office/word/2010/wordprocessingGroup" xmlns:wpi="http://schemas.microsoft.com/office/word/2010/wordprocessingInk" xmlns:wne="http://schemas.microsoft.com/office/word/2006/wordml" xmlns:wps="http://schemas.microsoft.com/office/word/2010/wordprocessingShape" mc:Ignorable="w14 w15 w16se w16cid w16 w16cex w16sdtdh wp14">
+<w:document xmlns:wpc="http://schemas.microsoft.com/office/word/2010/wordprocessingCanvas" xmlns:cx="http://schemas.microsoft.com/office/drawing/2014/chartex" xmlns:cx1="http://schemas.microsoft.com/office/drawing/2015/9/8/chartex" xmlns:cx2="http://schemas.microsoft.com/office/drawing/2015/10/21/chartex" xmlns:cx3="http://schemas.microsoft.com/office/drawing/2016/5/9/chartex" xmlns:cx4="http://schemas.microsoft.com/office/drawing/2016/5/10/chartex" xmlns:cx5="http://schemas.microsoft.com/office/drawing/2016/5/11/chartex" xmlns:cx6="http://schemas.microsoft.com/office/drawing/2016/5/12/chartex" xmlns:cx7="http://schemas.microsoft.com/office/drawing/2016/5/13/chartex" xmlns:cx8="http://schemas.microsoft.com/office/drawing/2016/5/14/chartex" xmlns:mc="http://schemas.openxmlformats.org/markup-compatibility/2006" xmlns:aink="http://schemas.microsoft.com/office/drawing/2016/ink" xmlns:am3d="http://schemas.microsoft.com/office/drawing/2017/model3d" xmlns:o="urn:schemas-microsoft-com:office:office" xmlns:oel="http://schemas.microsoft.com/office/2019/extlst" xmlns:r="http://schemas.openxmlformats.org/officeDocument/2006/relationships" xmlns:m="http://schemas.openxmlformats.org/officeDocument/2006/math" xmlns:v="urn:schemas-microsoft-com:vml" xmlns:wp14="http://schemas.microsoft.com/office/word/2010/wordprocessingDrawing" xmlns:wp="http://schemas.openxmlformats.org/drawingml/2006/wordprocessingDrawing" xmlns:w10="urn:schemas-microsoft-com:office:word" xmlns:w="http://schemas.openxmlformats.org/wordprocessingml/2006/main" xmlns:w14="http://schemas.microsoft.com/office/word/2010/wordml" xmlns:w15="http://schemas.microsoft.com/office/word/2012/wordml" xmlns:w16cex="http://schemas.microsoft.com/office/word/2018/wordml/cex" xmlns:w16cid="http://schemas.microsoft.com/office/word/2016/wordml/cid" xmlns:w16="http://schemas.microsoft.com/office/word/2018/wordml" xmlns:w16du="http://schemas.microsoft.com/office/word/2023/wordml/word16du" xmlns:w16sdtdh="http://schemas.microsoft.com/office/word/2020/wordml/sdtdatahash" xmlns:w16sdtfl="http://schemas.microsoft.com/office/word/2024/wordml/sdtformatlock" xmlns:w16se="http://schemas.microsoft.com/office/word/2015/wordml/symex" xmlns:wpg="http://schemas.microsoft.com/office/word/2010/wordprocessingGroup" xmlns:wpi="http://schemas.microsoft.com/office/word/2010/wordprocessingInk" xmlns:wne="http://schemas.microsoft.com/office/word/2006/wordml" xmlns:wps="http://schemas.microsoft.com/office/word/2010/wordprocessingShape" mc:Ignorable="w14 w15 w16se w16cid w16 w16cex w16sdtdh w16sdtfl w16du wp14">
   <w:body>
     <w:p>
       <w:pPr>
         <w:rPr>
-          <w:rFonts w:ascii="宋体" w:eastAsia="宋体" w:hAnsi="宋体"/>
+          <w:rFonts w:ascii="宋体" w:eastAsia="宋体" w:hAnsi="宋体" w:hint="eastAsia"/>
         </w:rPr>
       </w:pPr>
       <w:r>
@@ -18,7 +18,7 @@
         <mc:AlternateContent>
           <mc:Choice Requires="wpg">
             <w:drawing>
-              <wp:anchor distT="0" distB="0" distL="114300" distR="114300" simplePos="0" relativeHeight="251659264" behindDoc="1" locked="0" layoutInCell="1" allowOverlap="1" wp14:anchorId="2D696FC1" wp14:editId="40F11BF3">
+              <wp:anchor distT="0" distB="0" distL="114300" distR="114300" simplePos="0" relativeHeight="251659264" behindDoc="1" locked="0" layoutInCell="1" allowOverlap="1" wp14:anchorId="24658FA8" wp14:editId="13C93E47">
                 <wp:simplePos x="0" y="0"/>
                 <wp:positionH relativeFrom="page">
                   <wp:align>right</wp:align>
@@ -30,12 +30,16 @@
                 <wp:effectExtent l="0" t="0" r="0" b="0"/>
                 <wp:wrapNone/>
                 <wp:docPr id="31" name="组合 31"/>
-                <wp:cNvGraphicFramePr/>
+                <wp:cNvGraphicFramePr>
+                  <a:graphicFrameLocks xmlns:a="http://schemas.openxmlformats.org/drawingml/2006/main"/>
+                </wp:cNvGraphicFramePr>
                 <a:graphic xmlns:a="http://schemas.openxmlformats.org/drawingml/2006/main">
                   <a:graphicData uri="http://schemas.microsoft.com/office/word/2010/wordprocessingGroup">
                     <wpg:wgp>
-                      <wpg:cNvGrpSpPr/>
-                      <wpg:grpSpPr>
+                      <wpg:cNvGrpSpPr>
+                        <a:grpSpLocks/>
+                      </wpg:cNvGrpSpPr>
+                      <wpg:grpSpPr bwMode="auto">
                         <a:xfrm>
                           <a:off x="0" y="0"/>
                           <a:ext cx="7545705" cy="10692130"/>
@@ -51,7 +55,7 @@
                           </pic:cNvPicPr>
                         </pic:nvPicPr>
                         <pic:blipFill>
-                          <a:blip r:embed="rId6">
+                          <a:blip r:embed="rId7">
                             <a:duotone>
                               <a:prstClr val="black"/>
                               <a:schemeClr val="accent3">
@@ -70,7 +74,7 @@
                             <a:fillRect/>
                           </a:stretch>
                         </pic:blipFill>
-                        <pic:spPr>
+                        <pic:spPr bwMode="auto">
                           <a:xfrm>
                             <a:off x="22" y="0"/>
                             <a:ext cx="11883" cy="16838"/>
@@ -79,11 +83,22 @@
                             <a:avLst/>
                           </a:prstGeom>
                           <a:noFill/>
+                          <a:extLst>
+                            <a:ext uri="{909E8E84-426E-40DD-AFC4-6F175D3DCCD1}">
+                              <a14:hiddenFill xmlns:a14="http://schemas.microsoft.com/office/drawing/2010/main">
+                                <a:solidFill>
+                                  <a:srgbClr val="FFFFFF"/>
+                                </a:solidFill>
+                              </a14:hiddenFill>
+                            </a:ext>
+                          </a:extLst>
                         </pic:spPr>
                       </pic:pic>
                       <wps:wsp>
                         <wps:cNvPr id="33" name="Freeform 34"/>
-                        <wps:cNvSpPr/>
+                        <wps:cNvSpPr>
+                          <a:spLocks/>
+                        </wps:cNvSpPr>
                         <wps:spPr bwMode="auto">
                           <a:xfrm>
                             <a:off x="2567" y="7535"/>
@@ -319,6 +334,18 @@
                           <a:ln>
                             <a:noFill/>
                           </a:ln>
+                          <a:extLst>
+                            <a:ext uri="{91240B29-F687-4F45-9708-019B960494DF}">
+                              <a14:hiddenLine xmlns:a14="http://schemas.microsoft.com/office/drawing/2010/main" w="9525">
+                                <a:solidFill>
+                                  <a:srgbClr val="000000"/>
+                                </a:solidFill>
+                                <a:round/>
+                                <a:headEnd/>
+                                <a:tailEnd/>
+                              </a14:hiddenLine>
+                            </a:ext>
+                          </a:extLst>
                         </wps:spPr>
                         <wps:bodyPr rot="0" vert="horz" wrap="square" lIns="91440" tIns="45720" rIns="91440" bIns="45720" anchor="t" anchorCtr="0" upright="1">
                           <a:noAutofit/>
@@ -343,7 +370,16 @@
                               <a:srgbClr val="FFFFFF"/>
                             </a:solidFill>
                             <a:round/>
+                            <a:headEnd/>
+                            <a:tailEnd/>
                           </a:ln>
+                          <a:extLst>
+                            <a:ext uri="{909E8E84-426E-40DD-AFC4-6F175D3DCCD1}">
+                              <a14:hiddenFill xmlns:a14="http://schemas.microsoft.com/office/drawing/2010/main">
+                                <a:noFill/>
+                              </a14:hiddenFill>
+                            </a:ext>
+                          </a:extLst>
                         </wps:spPr>
                         <wps:bodyPr/>
                       </wps:wsp>
@@ -366,45 +402,62 @@
                               <a:srgbClr val="FFFFFF"/>
                             </a:solidFill>
                             <a:round/>
+                            <a:headEnd/>
+                            <a:tailEnd/>
                           </a:ln>
+                          <a:extLst>
+                            <a:ext uri="{909E8E84-426E-40DD-AFC4-6F175D3DCCD1}">
+                              <a14:hiddenFill xmlns:a14="http://schemas.microsoft.com/office/drawing/2010/main">
+                                <a:noFill/>
+                              </a14:hiddenFill>
+                            </a:ext>
+                          </a:extLst>
                         </wps:spPr>
                         <wps:bodyPr/>
                       </wps:wsp>
                     </wpg:wgp>
                   </a:graphicData>
                 </a:graphic>
+                <wp14:sizeRelH relativeFrom="page">
+                  <wp14:pctWidth>0</wp14:pctWidth>
+                </wp14:sizeRelH>
+                <wp14:sizeRelV relativeFrom="page">
+                  <wp14:pctHeight>0</wp14:pctHeight>
+                </wp14:sizeRelV>
               </wp:anchor>
             </w:drawing>
           </mc:Choice>
-          <mc:Fallback xmlns:wpsCustomData="http://www.wps.cn/officeDocument/2013/wpsCustomData">
+          <mc:Fallback>
             <w:pict>
-              <v:group id="_x0000_s1026" o:spid="_x0000_s1026" o:spt="203" style="position:absolute;left:0pt;margin-top:6pt;height:841.9pt;width:594.15pt;mso-position-horizontal:right;mso-position-horizontal-relative:page;mso-position-vertical-relative:page;z-index:-251657216;mso-width-relative:page;mso-height-relative:page;" coordorigin="22,0" coordsize="11883,16838" o:gfxdata="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">
-                <o:lock v:ext="edit" aspectratio="f"/>
-                <v:shape id="Picture 33" o:spid="_x0000_s1026" o:spt="75" type="#_x0000_t75" style="position:absolute;left:22;top:0;height:16838;width:11883;" filled="f" o:preferrelative="t" stroked="f" coordsize="21600,21600" o:gfxdata="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">
-                  <v:fill on="f" focussize="0,0"/>
-                  <v:stroke on="f"/>
-                  <v:imagedata r:id="rId10" recolortarget="#000000" o:title=""/>
+              <v:group w14:anchorId="1DC70FE6" id="组合 31" o:spid="_x0000_s1026" style="position:absolute;margin-left:542.95pt;margin-top:6pt;width:594.15pt;height:841.9pt;z-index:-251657216;mso-position-horizontal:right;mso-position-horizontal-relative:page;mso-position-vertical-relative:page" coordorigin="22" coordsize="11883,16838" o:gfxdata="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">
+                <v:shapetype id="_x0000_t75" coordsize="21600,21600" o:spt="75" o:preferrelative="t" path="m@4@5l@4@11@9@11@9@5xe" filled="f" stroked="f">
+                  <v:stroke joinstyle="miter"/>
+                  <v:formulas>
+                    <v:f eqn="if lineDrawn pixelLineWidth 0"/>
+                    <v:f eqn="sum @0 1 0"/>
+                    <v:f eqn="sum 0 0 @1"/>
+                    <v:f eqn="prod @2 1 2"/>
+                    <v:f eqn="prod @3 21600 pixelWidth"/>
+                    <v:f eqn="prod @3 21600 pixelHeight"/>
+                    <v:f eqn="sum @0 0 1"/>
+                    <v:f eqn="prod @6 1 2"/>
+                    <v:f eqn="prod @7 21600 pixelWidth"/>
+                    <v:f eqn="sum @8 21600 0"/>
+                    <v:f eqn="prod @7 21600 pixelHeight"/>
+                    <v:f eqn="sum @10 21600 0"/>
+                  </v:formulas>
+                  <v:path o:extrusionok="f" gradientshapeok="t" o:connecttype="rect"/>
                   <o:lock v:ext="edit" aspectratio="t"/>
+                </v:shapetype>
+                <v:shape id="Picture 33" o:spid="_x0000_s1027" type="#_x0000_t75" style="position:absolute;left:22;width:11883;height:16838;visibility:visible;mso-wrap-style:square" o:gfxdata="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">
+                  <v:imagedata r:id="rId8" o:title="" recolortarget="black"/>
                 </v:shape>
-                <v:shape id="Freeform 34" o:spid="_x0000_s1026" o:spt="100" style="position:absolute;left:2567;top:7535;height:523;width:2128;" fillcolor="#FFFFFF" filled="t" stroked="f" coordsize="2128,523" o:gfxdata="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" path="m2027,0l100,0,61,8,29,30,8,62,0,100,0,423,8,462,29,494,61,515,100,523,2027,523,2066,515,2098,494,2119,462,2127,423,2127,100,2119,62,2098,30,2066,8,2027,0xe">
-                  <v:path o:connectlocs="2027,7235;100,7235;61,7243;29,7265;8,7297;0,7335;0,7658;8,7697;29,7729;61,7750;100,7758;2027,7758;2066,7750;2098,7729;2119,7697;2127,7658;2127,7335;2119,7297;2098,7265;2066,7243;2027,7235" o:connectangles="0,0,0,0,0,0,0,0,0,0,0,0,0,0,0,0,0,0,0,0,0"/>
-                  <v:fill on="t" focussize="0,0"/>
-                  <v:stroke on="f"/>
-                  <v:imagedata o:title=""/>
-                  <o:lock v:ext="edit" aspectratio="f"/>
+                <v:shape id="Freeform 34" o:spid="_x0000_s1028" style="position:absolute;left:2567;top:7535;width:2128;height:523;visibility:visible;mso-wrap-style:square;v-text-anchor:top" coordsize="2128,523" o:gfxdata="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" path="m2027,l100,,61,8,29,30,8,62,,100,,423r8,39l29,494r32,21l100,523r1927,l2066,515r32,-21l2119,462r8,-39l2127,100r-8,-38l2098,30,2066,8,2027,xe" stroked="f">
+                  <v:path arrowok="t" o:connecttype="custom" o:connectlocs="2027,7235;100,7235;61,7243;29,7265;8,7297;0,7335;0,7658;8,7697;29,7729;61,7750;100,7758;2027,7758;2066,7750;2098,7729;2119,7697;2127,7658;2127,7335;2119,7297;2098,7265;2066,7243;2027,7235" o:connectangles="0,0,0,0,0,0,0,0,0,0,0,0,0,0,0,0,0,0,0,0,0"/>
                 </v:shape>
-                <v:line id="Line 35" o:spid="_x0000_s1026" o:spt="20" style="position:absolute;left:2579;top:8180;height:0;width:8179;" filled="f" stroked="t" coordsize="21600,21600" o:gfxdata="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">
-                  <v:fill on="f" focussize="0,0"/>
-                  <v:stroke weight="1pt" color="#FFFFFF" joinstyle="round"/>
-                  <v:imagedata o:title=""/>
-                  <o:lock v:ext="edit" aspectratio="f"/>
-                </v:line>
-                <v:line id="Line 36" o:spid="_x0000_s1026" o:spt="20" style="position:absolute;left:1272;top:9660;height:4563;width:0;" filled="f" stroked="t" coordsize="21600,21600" o:gfxdata="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">
-                  <v:fill on="f" focussize="0,0"/>
-                  <v:stroke weight="3.97102362204724pt" color="#FFFFFF" joinstyle="round"/>
-                  <v:imagedata o:title=""/>
-                  <o:lock v:ext="edit" aspectratio="f"/>
-                </v:line>
+                <v:line id="Line 35" o:spid="_x0000_s1029" style="position:absolute;visibility:visible;mso-wrap-style:square" from="2579,8180" to="10758,8180" o:connectortype="straight" o:gfxdata="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" strokecolor="white" strokeweight="1pt"/>
+                <v:line id="Line 36" o:spid="_x0000_s1030" style="position:absolute;visibility:visible;mso-wrap-style:square" from="1272,9660" to="1272,14223" o:connectortype="straight" o:gfxdata="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" strokecolor="white" strokeweight="1.40089mm"/>
+                <w10:wrap anchorx="page" anchory="page"/>
               </v:group>
             </w:pict>
           </mc:Fallback>
@@ -414,77 +467,77 @@
     <w:p>
       <w:pPr>
         <w:rPr>
-          <w:rFonts w:ascii="宋体" w:eastAsia="宋体" w:hAnsi="宋体"/>
-        </w:rPr>
-      </w:pPr>
-    </w:p>
-    <w:p>
-      <w:pPr>
-        <w:rPr>
-          <w:rFonts w:ascii="宋体" w:eastAsia="宋体" w:hAnsi="宋体"/>
-        </w:rPr>
-      </w:pPr>
-    </w:p>
-    <w:p>
-      <w:pPr>
-        <w:rPr>
-          <w:rFonts w:ascii="宋体" w:eastAsia="宋体" w:hAnsi="宋体"/>
-        </w:rPr>
-      </w:pPr>
-    </w:p>
-    <w:p>
-      <w:pPr>
-        <w:rPr>
-          <w:rFonts w:ascii="宋体" w:eastAsia="宋体" w:hAnsi="宋体"/>
-        </w:rPr>
-      </w:pPr>
-    </w:p>
-    <w:p>
-      <w:pPr>
-        <w:rPr>
-          <w:rFonts w:ascii="宋体" w:eastAsia="宋体" w:hAnsi="宋体"/>
-        </w:rPr>
-      </w:pPr>
-    </w:p>
-    <w:p>
-      <w:pPr>
-        <w:rPr>
-          <w:rFonts w:ascii="宋体" w:eastAsia="宋体" w:hAnsi="宋体"/>
-        </w:rPr>
-      </w:pPr>
-    </w:p>
-    <w:p>
-      <w:pPr>
-        <w:rPr>
-          <w:rFonts w:ascii="宋体" w:eastAsia="宋体" w:hAnsi="宋体"/>
-        </w:rPr>
-      </w:pPr>
-    </w:p>
-    <w:p>
-      <w:pPr>
-        <w:rPr>
-          <w:rFonts w:ascii="宋体" w:eastAsia="宋体" w:hAnsi="宋体"/>
-        </w:rPr>
-      </w:pPr>
-    </w:p>
-    <w:p>
-      <w:pPr>
-        <w:rPr>
-          <w:rFonts w:ascii="宋体" w:eastAsia="宋体" w:hAnsi="宋体"/>
-        </w:rPr>
-      </w:pPr>
-    </w:p>
-    <w:p>
-      <w:pPr>
-        <w:rPr>
-          <w:rFonts w:ascii="宋体" w:eastAsia="宋体" w:hAnsi="宋体"/>
-        </w:rPr>
-      </w:pPr>
-    </w:p>
-    <w:p>
-      <w:pPr>
-        <w:rPr>
-          <w:rFonts w:ascii="宋体" w:eastAsia="宋体" w:hAnsi="宋体"/>
+          <w:rFonts w:ascii="宋体" w:eastAsia="宋体" w:hAnsi="宋体" w:hint="eastAsia"/>
+        </w:rPr>
+      </w:pPr>
+    </w:p>
+    <w:p>
+      <w:pPr>
+        <w:rPr>
+          <w:rFonts w:ascii="宋体" w:eastAsia="宋体" w:hAnsi="宋体" w:hint="eastAsia"/>
+        </w:rPr>
+      </w:pPr>
+    </w:p>
+    <w:p>
+      <w:pPr>
+        <w:rPr>
+          <w:rFonts w:ascii="宋体" w:eastAsia="宋体" w:hAnsi="宋体" w:hint="eastAsia"/>
+        </w:rPr>
+      </w:pPr>
+    </w:p>
+    <w:p>
+      <w:pPr>
+        <w:rPr>
+          <w:rFonts w:ascii="宋体" w:eastAsia="宋体" w:hAnsi="宋体" w:hint="eastAsia"/>
+        </w:rPr>
+      </w:pPr>
+    </w:p>
+    <w:p>
+      <w:pPr>
+        <w:rPr>
+          <w:rFonts w:ascii="宋体" w:eastAsia="宋体" w:hAnsi="宋体" w:hint="eastAsia"/>
+        </w:rPr>
+      </w:pPr>
+    </w:p>
+    <w:p>
+      <w:pPr>
+        <w:rPr>
+          <w:rFonts w:ascii="宋体" w:eastAsia="宋体" w:hAnsi="宋体" w:hint="eastAsia"/>
+        </w:rPr>
+      </w:pPr>
+    </w:p>
+    <w:p>
+      <w:pPr>
+        <w:rPr>
+          <w:rFonts w:ascii="宋体" w:eastAsia="宋体" w:hAnsi="宋体" w:hint="eastAsia"/>
+        </w:rPr>
+      </w:pPr>
+    </w:p>
+    <w:p>
+      <w:pPr>
+        <w:rPr>
+          <w:rFonts w:ascii="宋体" w:eastAsia="宋体" w:hAnsi="宋体" w:hint="eastAsia"/>
+        </w:rPr>
+      </w:pPr>
+    </w:p>
+    <w:p>
+      <w:pPr>
+        <w:rPr>
+          <w:rFonts w:ascii="宋体" w:eastAsia="宋体" w:hAnsi="宋体" w:hint="eastAsia"/>
+        </w:rPr>
+      </w:pPr>
+    </w:p>
+    <w:p>
+      <w:pPr>
+        <w:rPr>
+          <w:rFonts w:ascii="宋体" w:eastAsia="宋体" w:hAnsi="宋体" w:hint="eastAsia"/>
+        </w:rPr>
+      </w:pPr>
+    </w:p>
+    <w:p>
+      <w:pPr>
+        <w:rPr>
+          <w:rFonts w:ascii="宋体" w:eastAsia="宋体" w:hAnsi="宋体" w:hint="eastAsia"/>
         </w:rPr>
       </w:pPr>
     </w:p>
@@ -524,7 +577,7 @@
         <w:ind w:left="855"/>
         <w:jc w:val="right"/>
         <w:rPr>
-          <w:rFonts w:ascii="宋体" w:eastAsia="宋体" w:hAnsi="宋体" w:cs="微软雅黑"/>
+          <w:rFonts w:ascii="宋体" w:eastAsia="宋体" w:hAnsi="宋体" w:cs="微软雅黑" w:hint="eastAsia"/>
           <w:b/>
           <w:kern w:val="0"/>
           <w:sz w:val="103"/>
@@ -545,320 +598,275 @@
     <w:p>
       <w:pPr>
         <w:rPr>
-          <w:rFonts w:ascii="宋体" w:eastAsia="宋体" w:hAnsi="宋体"/>
+          <w:rFonts w:ascii="宋体" w:eastAsia="宋体" w:hAnsi="宋体" w:hint="eastAsia"/>
         </w:rPr>
       </w:pPr>
     </w:p>
     <w:p>
       <w:pPr>
         <w:jc w:val="right"/>
+        <w:rPr>
+          <w:rFonts w:ascii="宋体" w:eastAsia="宋体" w:hAnsi="宋体" w:hint="eastAsia"/>
+          <w:color w:val="FFFFFF" w:themeColor="background1"/>
+          <w:sz w:val="28"/>
+          <w:szCs w:val="32"/>
+        </w:rPr>
+      </w:pPr>
+      <w:r>
+        <w:rPr>
+          <w:rFonts w:ascii="宋体" w:eastAsia="宋体" w:hAnsi="宋体" w:hint="eastAsia"/>
+          <w:color w:val="FFFFFF" w:themeColor="background1"/>
+          <w:sz w:val="28"/>
+          <w:szCs w:val="32"/>
+        </w:rPr>
+        <w:t>阀门健康状况监控</w:t>
+      </w:r>
+    </w:p>
+    <w:p>
+      <w:pPr>
+        <w:rPr>
+          <w:rFonts w:ascii="宋体" w:eastAsia="宋体" w:hAnsi="宋体" w:hint="eastAsia"/>
+        </w:rPr>
+      </w:pPr>
+    </w:p>
+    <w:p>
+      <w:pPr>
+        <w:rPr>
+          <w:rFonts w:ascii="宋体" w:eastAsia="宋体" w:hAnsi="宋体" w:hint="eastAsia"/>
+        </w:rPr>
+      </w:pPr>
+    </w:p>
+    <w:p>
+      <w:pPr>
+        <w:rPr>
+          <w:rFonts w:ascii="宋体" w:eastAsia="宋体" w:hAnsi="宋体" w:hint="eastAsia"/>
+        </w:rPr>
+      </w:pPr>
+    </w:p>
+    <w:p>
+      <w:pPr>
+        <w:rPr>
+          <w:rFonts w:ascii="宋体" w:eastAsia="宋体" w:hAnsi="宋体" w:hint="eastAsia"/>
+        </w:rPr>
+      </w:pPr>
+    </w:p>
+    <w:p>
+      <w:pPr>
+        <w:rPr>
+          <w:rFonts w:ascii="宋体" w:eastAsia="宋体" w:hAnsi="宋体" w:hint="eastAsia"/>
+        </w:rPr>
+      </w:pPr>
+    </w:p>
+    <w:p>
+      <w:pPr>
+        <w:rPr>
+          <w:rFonts w:ascii="宋体" w:eastAsia="宋体" w:hAnsi="宋体" w:hint="eastAsia"/>
+        </w:rPr>
+      </w:pPr>
+    </w:p>
+    <w:p>
+      <w:pPr>
+        <w:rPr>
+          <w:rFonts w:ascii="宋体" w:eastAsia="宋体" w:hAnsi="宋体" w:hint="eastAsia"/>
+        </w:rPr>
+      </w:pPr>
+    </w:p>
+    <w:p>
+      <w:pPr>
+        <w:rPr>
+          <w:rFonts w:ascii="宋体" w:eastAsia="宋体" w:hAnsi="宋体" w:hint="eastAsia"/>
+        </w:rPr>
+      </w:pPr>
+    </w:p>
+    <w:p>
+      <w:pPr>
+        <w:rPr>
+          <w:rFonts w:ascii="宋体" w:eastAsia="宋体" w:hAnsi="宋体" w:hint="eastAsia"/>
+        </w:rPr>
+      </w:pPr>
+    </w:p>
+    <w:p>
+      <w:pPr>
+        <w:rPr>
+          <w:rFonts w:ascii="宋体" w:eastAsia="宋体" w:hAnsi="宋体" w:hint="eastAsia"/>
+        </w:rPr>
+      </w:pPr>
+    </w:p>
+    <w:p>
+      <w:pPr>
+        <w:rPr>
+          <w:rFonts w:ascii="宋体" w:eastAsia="宋体" w:hAnsi="宋体" w:hint="eastAsia"/>
+        </w:rPr>
+      </w:pPr>
+    </w:p>
+    <w:p>
+      <w:pPr>
+        <w:rPr>
+          <w:rFonts w:ascii="宋体" w:eastAsia="宋体" w:hAnsi="宋体" w:hint="eastAsia"/>
+          <w:color w:val="FFFFFF" w:themeColor="background1"/>
+          <w:sz w:val="28"/>
+          <w:szCs w:val="32"/>
+        </w:rPr>
+      </w:pPr>
+      <w:r>
+        <w:rPr>
+          <w:rFonts w:ascii="宋体" w:eastAsia="宋体" w:hAnsi="宋体" w:hint="eastAsia"/>
+          <w:color w:val="FFFFFF" w:themeColor="background1"/>
+          <w:sz w:val="28"/>
+          <w:szCs w:val="32"/>
+        </w:rPr>
+        <w:t>报告时间：{{</w:t>
+      </w:r>
+      <w:proofErr w:type="spellStart"/>
+      <w:r>
+        <w:rPr>
+          <w:rFonts w:ascii="宋体" w:eastAsia="宋体" w:hAnsi="宋体" w:hint="eastAsia"/>
+          <w:color w:val="FFFFFF" w:themeColor="background1"/>
+          <w:sz w:val="28"/>
+          <w:szCs w:val="32"/>
+        </w:rPr>
+        <w:t>report_time</w:t>
+      </w:r>
+      <w:proofErr w:type="spellEnd"/>
+      <w:r>
+        <w:rPr>
+          <w:rFonts w:ascii="宋体" w:eastAsia="宋体" w:hAnsi="宋体" w:hint="eastAsia"/>
+          <w:color w:val="FFFFFF" w:themeColor="background1"/>
+          <w:sz w:val="28"/>
+          <w:szCs w:val="32"/>
+        </w:rPr>
+        <w:t>}}</w:t>
+      </w:r>
+    </w:p>
+    <w:p>
+      <w:pPr>
+        <w:rPr>
+          <w:rFonts w:ascii="宋体" w:eastAsia="宋体" w:hAnsi="宋体" w:hint="eastAsia"/>
+          <w:color w:val="FFFFFF" w:themeColor="background1"/>
+          <w:sz w:val="28"/>
+          <w:szCs w:val="32"/>
+        </w:rPr>
+      </w:pPr>
+      <w:r>
+        <w:rPr>
+          <w:rFonts w:ascii="宋体" w:eastAsia="宋体" w:hAnsi="宋体" w:hint="eastAsia"/>
+          <w:color w:val="FFFFFF" w:themeColor="background1"/>
+          <w:sz w:val="28"/>
+          <w:szCs w:val="32"/>
+        </w:rPr>
+        <w:t>最终用户：{{</w:t>
+      </w:r>
+      <w:proofErr w:type="spellStart"/>
+      <w:r>
+        <w:rPr>
+          <w:rFonts w:ascii="宋体" w:eastAsia="宋体" w:hAnsi="宋体" w:hint="eastAsia"/>
+          <w:color w:val="FFFFFF" w:themeColor="background1"/>
+          <w:sz w:val="28"/>
+          <w:szCs w:val="32"/>
+        </w:rPr>
+        <w:t>report_for</w:t>
+      </w:r>
+      <w:proofErr w:type="spellEnd"/>
+      <w:r>
+        <w:rPr>
+          <w:rFonts w:ascii="宋体" w:eastAsia="宋体" w:hAnsi="宋体" w:hint="eastAsia"/>
+          <w:color w:val="FFFFFF" w:themeColor="background1"/>
+          <w:sz w:val="28"/>
+          <w:szCs w:val="32"/>
+        </w:rPr>
+        <w:t>}}</w:t>
+      </w:r>
+    </w:p>
+    <w:p>
+      <w:pPr>
+        <w:rPr>
+          <w:rFonts w:ascii="宋体" w:eastAsia="宋体" w:hAnsi="宋体" w:hint="eastAsia"/>
+        </w:rPr>
+      </w:pPr>
+    </w:p>
+    <w:p>
+      <w:pPr>
+        <w:rPr>
+          <w:rFonts w:ascii="宋体" w:eastAsia="宋体" w:hAnsi="宋体" w:hint="eastAsia"/>
+        </w:rPr>
+      </w:pPr>
+    </w:p>
+    <w:p>
+      <w:pPr>
+        <w:rPr>
+          <w:rFonts w:ascii="宋体" w:eastAsia="宋体" w:hAnsi="宋体" w:hint="eastAsia"/>
+        </w:rPr>
+      </w:pPr>
+    </w:p>
+    <w:p>
+      <w:pPr>
+        <w:rPr>
+          <w:rFonts w:ascii="宋体" w:eastAsia="宋体" w:hAnsi="宋体" w:hint="eastAsia"/>
+        </w:rPr>
+      </w:pPr>
+    </w:p>
+    <w:p>
+      <w:pPr>
+        <w:rPr>
+          <w:rFonts w:ascii="宋体" w:eastAsia="宋体" w:hAnsi="宋体" w:hint="eastAsia"/>
+        </w:rPr>
+      </w:pPr>
+    </w:p>
+    <w:p>
+      <w:pPr>
+        <w:jc w:val="right"/>
+        <w:rPr>
+          <w:rFonts w:ascii="宋体" w:eastAsia="宋体" w:hAnsi="宋体" w:hint="eastAsia"/>
+          <w:color w:val="FFFFFF" w:themeColor="background1"/>
+          <w:sz w:val="28"/>
+          <w:szCs w:val="32"/>
+        </w:rPr>
+      </w:pPr>
+      <w:proofErr w:type="gramStart"/>
+      <w:r>
+        <w:rPr>
+          <w:rFonts w:ascii="宋体" w:eastAsia="宋体" w:hAnsi="宋体" w:hint="eastAsia"/>
+          <w:color w:val="FFFFFF" w:themeColor="background1"/>
+          <w:sz w:val="28"/>
+          <w:szCs w:val="32"/>
+        </w:rPr>
+        <w:t>星优阀</w:t>
+      </w:r>
+      <w:proofErr w:type="gramEnd"/>
+      <w:r>
+        <w:rPr>
+          <w:rFonts w:ascii="微软雅黑" w:eastAsia="微软雅黑" w:hAnsi="微软雅黑" w:cs="微软雅黑" w:hint="eastAsia"/>
+          <w:color w:val="FFFFFF" w:themeColor="background1"/>
+          <w:sz w:val="28"/>
+          <w:szCs w:val="32"/>
+        </w:rPr>
+        <w:t>⻔</w:t>
+      </w:r>
+      <w:r>
         <w:rPr>
           <w:rFonts w:ascii="宋体" w:eastAsia="宋体" w:hAnsi="宋体"/>
           <w:color w:val="FFFFFF" w:themeColor="background1"/>
           <w:sz w:val="28"/>
           <w:szCs w:val="32"/>
         </w:rPr>
-      </w:pPr>
-      <w:r>
-        <w:rPr>
-          <w:rFonts w:ascii="宋体" w:eastAsia="宋体" w:hAnsi="宋体" w:hint="eastAsia"/>
-          <w:color w:val="FFFFFF" w:themeColor="background1"/>
-          <w:sz w:val="28"/>
-          <w:szCs w:val="32"/>
-        </w:rPr>
-        <w:t>阀门健康状况监控</w:t>
-      </w:r>
-    </w:p>
-    <w:p>
-      <w:pPr>
-        <w:rPr>
-          <w:rFonts w:ascii="宋体" w:eastAsia="宋体" w:hAnsi="宋体"/>
-        </w:rPr>
-      </w:pPr>
-    </w:p>
-    <w:p>
-      <w:pPr>
-        <w:rPr>
-          <w:rFonts w:ascii="宋体" w:eastAsia="宋体" w:hAnsi="宋体"/>
-        </w:rPr>
-      </w:pPr>
-    </w:p>
-    <w:p>
-      <w:pPr>
-        <w:rPr>
-          <w:rFonts w:ascii="宋体" w:eastAsia="宋体" w:hAnsi="宋体"/>
-        </w:rPr>
-      </w:pPr>
-    </w:p>
-    <w:p>
-      <w:pPr>
-        <w:rPr>
-          <w:rFonts w:ascii="宋体" w:eastAsia="宋体" w:hAnsi="宋体"/>
-        </w:rPr>
-      </w:pPr>
-    </w:p>
-    <w:p>
-      <w:pPr>
-        <w:rPr>
-          <w:rFonts w:ascii="宋体" w:eastAsia="宋体" w:hAnsi="宋体"/>
-        </w:rPr>
-      </w:pPr>
-    </w:p>
-    <w:p>
-      <w:pPr>
-        <w:rPr>
-          <w:rFonts w:ascii="宋体" w:eastAsia="宋体" w:hAnsi="宋体"/>
-        </w:rPr>
-      </w:pPr>
-    </w:p>
-    <w:p>
-      <w:pPr>
-        <w:rPr>
-          <w:rFonts w:ascii="宋体" w:eastAsia="宋体" w:hAnsi="宋体"/>
-        </w:rPr>
-      </w:pPr>
-    </w:p>
-    <w:p>
-      <w:pPr>
-        <w:rPr>
-          <w:rFonts w:ascii="宋体" w:eastAsia="宋体" w:hAnsi="宋体"/>
-        </w:rPr>
-      </w:pPr>
-    </w:p>
-    <w:p>
-      <w:pPr>
-        <w:rPr>
-          <w:rFonts w:ascii="宋体" w:eastAsia="宋体" w:hAnsi="宋体"/>
-        </w:rPr>
-      </w:pPr>
-    </w:p>
-    <w:p>
-      <w:pPr>
-        <w:rPr>
-          <w:rFonts w:ascii="宋体" w:eastAsia="宋体" w:hAnsi="宋体"/>
-        </w:rPr>
-      </w:pPr>
-    </w:p>
-    <w:p>
-      <w:pPr>
-        <w:rPr>
-          <w:rFonts w:ascii="宋体" w:eastAsia="宋体" w:hAnsi="宋体"/>
-        </w:rPr>
-      </w:pPr>
-    </w:p>
-    <w:p>
-      <w:pPr>
-        <w:rPr>
-          <w:rFonts w:ascii="宋体" w:eastAsia="宋体" w:hAnsi="宋体"/>
-          <w:color w:val="FFFFFF" w:themeColor="background1"/>
-          <w:sz w:val="28"/>
-          <w:szCs w:val="32"/>
-        </w:rPr>
-      </w:pPr>
-      <w:r>
-        <w:rPr>
-          <w:rFonts w:ascii="宋体" w:eastAsia="宋体" w:hAnsi="宋体" w:hint="eastAsia"/>
-          <w:color w:val="FFFFFF" w:themeColor="background1"/>
-          <w:sz w:val="28"/>
-          <w:szCs w:val="32"/>
-        </w:rPr>
-        <w:t>报告时间：</w:t>
-      </w:r>
-      <w:r>
-        <w:rPr>
-          <w:rFonts w:ascii="宋体" w:eastAsia="宋体" w:hAnsi="宋体" w:hint="eastAsia"/>
-          <w:color w:val="FFFFFF" w:themeColor="background1"/>
-          <w:sz w:val="28"/>
-          <w:szCs w:val="32"/>
-        </w:rPr>
-        <w:t>{{</w:t>
-      </w:r>
-      <w:proofErr w:type="spellStart"/>
-      <w:r>
-        <w:rPr>
-          <w:rFonts w:ascii="宋体" w:eastAsia="宋体" w:hAnsi="宋体" w:hint="eastAsia"/>
-          <w:color w:val="FFFFFF" w:themeColor="background1"/>
-          <w:sz w:val="28"/>
-          <w:szCs w:val="32"/>
-        </w:rPr>
-        <w:t>report_time</w:t>
-      </w:r>
-      <w:proofErr w:type="spellEnd"/>
-      <w:r>
-        <w:rPr>
-          <w:rFonts w:ascii="宋体" w:eastAsia="宋体" w:hAnsi="宋体" w:hint="eastAsia"/>
-          <w:color w:val="FFFFFF" w:themeColor="background1"/>
-          <w:sz w:val="28"/>
-          <w:szCs w:val="32"/>
-        </w:rPr>
-        <w:t>}}</w:t>
-      </w:r>
-    </w:p>
-    <w:p>
-      <w:pPr>
-        <w:rPr>
-          <w:rFonts w:ascii="宋体" w:eastAsia="宋体" w:hAnsi="宋体"/>
-          <w:color w:val="FFFFFF" w:themeColor="background1"/>
-          <w:sz w:val="28"/>
-          <w:szCs w:val="32"/>
-        </w:rPr>
-      </w:pPr>
-      <w:r>
-        <w:rPr>
-          <w:rFonts w:ascii="宋体" w:eastAsia="宋体" w:hAnsi="宋体" w:hint="eastAsia"/>
-          <w:color w:val="FFFFFF" w:themeColor="background1"/>
-          <w:sz w:val="28"/>
-          <w:szCs w:val="32"/>
-        </w:rPr>
-        <w:t>最终用户：</w:t>
-      </w:r>
-      <w:r>
-        <w:rPr>
-          <w:rFonts w:ascii="宋体" w:eastAsia="宋体" w:hAnsi="宋体" w:hint="eastAsia"/>
-          <w:color w:val="FFFFFF" w:themeColor="background1"/>
-          <w:sz w:val="28"/>
-          <w:szCs w:val="32"/>
-        </w:rPr>
-        <w:t>{{</w:t>
-      </w:r>
-      <w:proofErr w:type="spellStart"/>
-      <w:r>
-        <w:rPr>
-          <w:rFonts w:ascii="宋体" w:eastAsia="宋体" w:hAnsi="宋体" w:hint="eastAsia"/>
-          <w:color w:val="FFFFFF" w:themeColor="background1"/>
-          <w:sz w:val="28"/>
-          <w:szCs w:val="32"/>
-        </w:rPr>
-        <w:t>report_for</w:t>
-      </w:r>
-      <w:proofErr w:type="spellEnd"/>
-      <w:r>
-        <w:rPr>
-          <w:rFonts w:ascii="宋体" w:eastAsia="宋体" w:hAnsi="宋体" w:hint="eastAsia"/>
-          <w:color w:val="FFFFFF" w:themeColor="background1"/>
-          <w:sz w:val="28"/>
-          <w:szCs w:val="32"/>
-        </w:rPr>
-        <w:t>}}</w:t>
-      </w:r>
-    </w:p>
-    <w:p>
-      <w:pPr>
-        <w:rPr>
-          <w:rFonts w:ascii="宋体" w:eastAsia="宋体" w:hAnsi="宋体"/>
-        </w:rPr>
-      </w:pPr>
-    </w:p>
-    <w:p>
-      <w:pPr>
-        <w:rPr>
-          <w:rFonts w:ascii="宋体" w:eastAsia="宋体" w:hAnsi="宋体"/>
-        </w:rPr>
-      </w:pPr>
-    </w:p>
-    <w:p>
-      <w:pPr>
-        <w:rPr>
-          <w:rFonts w:ascii="宋体" w:eastAsia="宋体" w:hAnsi="宋体"/>
-        </w:rPr>
-      </w:pPr>
-    </w:p>
-    <w:p>
-      <w:pPr>
-        <w:rPr>
-          <w:rFonts w:ascii="宋体" w:eastAsia="宋体" w:hAnsi="宋体"/>
-        </w:rPr>
-      </w:pPr>
-    </w:p>
-    <w:p>
-      <w:pPr>
-        <w:rPr>
-          <w:rFonts w:ascii="宋体" w:eastAsia="宋体" w:hAnsi="宋体"/>
-        </w:rPr>
-      </w:pPr>
-    </w:p>
-    <w:p>
-      <w:pPr>
-        <w:jc w:val="right"/>
-        <w:rPr>
-          <w:rFonts w:ascii="宋体" w:eastAsia="宋体" w:hAnsi="宋体"/>
-          <w:color w:val="FFFFFF" w:themeColor="background1"/>
-          <w:sz w:val="28"/>
-          <w:szCs w:val="32"/>
-        </w:rPr>
-      </w:pPr>
-      <w:proofErr w:type="gramStart"/>
-      <w:r>
-        <w:rPr>
-          <w:rFonts w:ascii="宋体" w:eastAsia="宋体" w:hAnsi="宋体" w:hint="eastAsia"/>
-          <w:color w:val="FFFFFF" w:themeColor="background1"/>
-          <w:sz w:val="28"/>
-          <w:szCs w:val="32"/>
-        </w:rPr>
-        <w:t>星优阀</w:t>
-      </w:r>
-      <w:proofErr w:type="gramEnd"/>
-      <w:r>
-        <w:rPr>
-          <w:rFonts w:ascii="微软雅黑" w:eastAsia="微软雅黑" w:hAnsi="微软雅黑" w:cs="微软雅黑" w:hint="eastAsia"/>
-          <w:color w:val="FFFFFF" w:themeColor="background1"/>
-          <w:sz w:val="28"/>
-          <w:szCs w:val="32"/>
-        </w:rPr>
-        <w:t>⻔</w:t>
-      </w:r>
-      <w:r>
-        <w:rPr>
-          <w:rFonts w:ascii="宋体" w:eastAsia="宋体" w:hAnsi="宋体"/>
-          <w:color w:val="FFFFFF" w:themeColor="background1"/>
-          <w:sz w:val="28"/>
-          <w:szCs w:val="32"/>
-        </w:rPr>
-        <w:t xml:space="preserve"> </w:t>
-      </w:r>
-      <w:r>
-        <w:rPr>
-          <w:rFonts w:ascii="宋体" w:eastAsia="宋体" w:hAnsi="宋体"/>
-          <w:color w:val="FFFFFF" w:themeColor="background1"/>
-          <w:sz w:val="28"/>
-          <w:szCs w:val="32"/>
-        </w:rPr>
-        <w:t>（上海）</w:t>
-      </w:r>
-      <w:r>
-        <w:rPr>
-          <w:rFonts w:ascii="宋体" w:eastAsia="宋体" w:hAnsi="宋体"/>
-          <w:color w:val="FFFFFF" w:themeColor="background1"/>
-          <w:sz w:val="28"/>
-          <w:szCs w:val="32"/>
-        </w:rPr>
-        <w:t xml:space="preserve"> </w:t>
-      </w:r>
-      <w:r>
-        <w:rPr>
-          <w:rFonts w:ascii="宋体" w:eastAsia="宋体" w:hAnsi="宋体"/>
-          <w:color w:val="FFFFFF" w:themeColor="background1"/>
-          <w:sz w:val="28"/>
-          <w:szCs w:val="32"/>
-        </w:rPr>
-        <w:t>有限公司</w:t>
-      </w:r>
-    </w:p>
-    <w:p>
-      <w:pPr>
-        <w:rPr>
-          <w:rFonts w:ascii="宋体" w:eastAsia="宋体" w:hAnsi="宋体"/>
-        </w:rPr>
-      </w:pPr>
-    </w:p>
-    <w:p>
-      <w:pPr>
-        <w:pStyle w:val="a3"/>
+        <w:t xml:space="preserve"> （上海） 有限公司</w:t>
+      </w:r>
+    </w:p>
+    <w:p>
+      <w:pPr>
+        <w:rPr>
+          <w:rFonts w:ascii="宋体" w:eastAsia="宋体" w:hAnsi="宋体" w:hint="eastAsia"/>
+        </w:rPr>
+      </w:pPr>
+    </w:p>
+    <w:p>
+      <w:pPr>
+        <w:pStyle w:val="af4"/>
         <w:tabs>
           <w:tab w:val="left" w:pos="10889"/>
         </w:tabs>
         <w:rPr>
-          <w:rFonts w:ascii="宋体" w:eastAsia="宋体" w:hAnsi="宋体" w:cs="DTL Argo T"/>
+          <w:rFonts w:ascii="宋体" w:eastAsia="宋体" w:hAnsi="宋体" w:cs="DTL Argo T" w:hint="eastAsia"/>
           <w:b/>
           <w:bCs/>
           <w:color w:val="43545C"/>
@@ -903,7 +911,7 @@
     <w:p>
       <w:pPr>
         <w:rPr>
-          <w:rFonts w:ascii="宋体" w:eastAsia="宋体" w:hAnsi="宋体" w:cs="DTL Argo T"/>
+          <w:rFonts w:ascii="宋体" w:eastAsia="宋体" w:hAnsi="宋体" w:cs="DTL Argo T" w:hint="eastAsia"/>
           <w:bCs/>
           <w:color w:val="4C4D4F"/>
         </w:rPr>
@@ -912,7 +920,7 @@
     <w:p>
       <w:pPr>
         <w:rPr>
-          <w:rFonts w:ascii="宋体" w:eastAsia="宋体" w:hAnsi="宋体" w:cs="DTL Argo T"/>
+          <w:rFonts w:ascii="宋体" w:eastAsia="宋体" w:hAnsi="宋体" w:cs="DTL Argo T" w:hint="eastAsia"/>
           <w:bCs/>
           <w:color w:val="4C4D4F"/>
         </w:rPr>
@@ -928,9 +936,9 @@
     </w:p>
     <w:p>
       <w:pPr>
-        <w:pStyle w:val="a3"/>
-        <w:rPr>
-          <w:rFonts w:ascii="宋体" w:eastAsia="宋体" w:hAnsi="宋体"/>
+        <w:pStyle w:val="af4"/>
+        <w:rPr>
+          <w:rFonts w:ascii="宋体" w:eastAsia="宋体" w:hAnsi="宋体" w:hint="eastAsia"/>
           <w:sz w:val="22"/>
           <w:szCs w:val="22"/>
           <w:lang w:eastAsia="zh-CN"/>
@@ -947,23 +955,27 @@
         <mc:AlternateContent>
           <mc:Choice Requires="wps">
             <w:drawing>
-              <wp:anchor distT="0" distB="0" distL="114935" distR="114935" simplePos="0" relativeHeight="251660288" behindDoc="0" locked="0" layoutInCell="0" allowOverlap="1" wp14:anchorId="7CCA1523" wp14:editId="6F99D413">
+              <wp:anchor distT="0" distB="0" distL="115189" distR="115189" simplePos="0" relativeHeight="251661312" behindDoc="0" locked="0" layoutInCell="0" allowOverlap="1" wp14:anchorId="2D5D3DBB" wp14:editId="4C88D27D">
                 <wp:simplePos x="0" y="0"/>
                 <wp:positionH relativeFrom="page">
-                  <wp:posOffset>857250</wp:posOffset>
+                  <wp:posOffset>857738</wp:posOffset>
                 </wp:positionH>
                 <wp:positionV relativeFrom="paragraph">
-                  <wp:posOffset>200025</wp:posOffset>
+                  <wp:posOffset>200074</wp:posOffset>
                 </wp:positionV>
-                <wp:extent cx="78105" cy="560705"/>
+                <wp:extent cx="78105" cy="560754"/>
                 <wp:effectExtent l="0" t="0" r="0" b="0"/>
                 <wp:wrapNone/>
                 <wp:docPr id="89" name="Freeform 33"/>
-                <wp:cNvGraphicFramePr/>
+                <wp:cNvGraphicFramePr>
+                  <a:graphicFrameLocks xmlns:a="http://schemas.openxmlformats.org/drawingml/2006/main"/>
+                </wp:cNvGraphicFramePr>
                 <a:graphic xmlns:a="http://schemas.openxmlformats.org/drawingml/2006/main">
                   <a:graphicData uri="http://schemas.microsoft.com/office/word/2010/wordprocessingShape">
                     <wps:wsp>
-                      <wps:cNvSpPr/>
+                      <wps:cNvSpPr>
+                        <a:spLocks/>
+                      </wps:cNvSpPr>
                       <wps:spPr bwMode="auto">
                         <a:xfrm>
                           <a:off x="0" y="0"/>
@@ -1029,6 +1041,18 @@
                         <a:ln>
                           <a:noFill/>
                         </a:ln>
+                        <a:extLst>
+                          <a:ext uri="{91240B29-F687-4F45-9708-019B960494DF}">
+                            <a14:hiddenLine xmlns:a14="http://schemas.microsoft.com/office/drawing/2010/main" w="12700">
+                              <a:solidFill>
+                                <a:srgbClr val="000000"/>
+                              </a:solidFill>
+                              <a:round/>
+                              <a:headEnd/>
+                              <a:tailEnd/>
+                            </a14:hiddenLine>
+                          </a:ext>
+                        </a:extLst>
                       </wps:spPr>
                       <wps:bodyPr rot="0" vert="horz" wrap="square" lIns="91440" tIns="45720" rIns="91440" bIns="45720" anchor="t" anchorCtr="0" upright="1">
                         <a:noAutofit/>
@@ -1036,17 +1060,20 @@
                     </wps:wsp>
                   </a:graphicData>
                 </a:graphic>
+                <wp14:sizeRelH relativeFrom="page">
+                  <wp14:pctWidth>0</wp14:pctWidth>
+                </wp14:sizeRelH>
+                <wp14:sizeRelV relativeFrom="page">
+                  <wp14:pctHeight>0</wp14:pctHeight>
+                </wp14:sizeRelV>
               </wp:anchor>
             </w:drawing>
           </mc:Choice>
-          <mc:Fallback xmlns:wpsCustomData="http://www.wps.cn/officeDocument/2013/wpsCustomData">
+          <mc:Fallback>
             <w:pict>
-              <v:shape id="Freeform 33" o:spid="_x0000_s1026" o:spt="100" style="position:absolute;left:0pt;margin-left:67.5pt;margin-top:15.75pt;height:44.15pt;width:6.15pt;mso-position-horizontal-relative:page;z-index:251660288;mso-width-relative:page;mso-height-relative:page;" fillcolor="#D31145" filled="t" stroked="f" coordsize="123,1338" o:allowincell="f" o:gfxdata="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" path="m122,0l0,0,0,1337,122,1337,122,0xe">
-                <v:path o:connectlocs="77470,0;0,0;0,560334;77470,560334;77470,0" o:connectangles="0,0,0,0,0"/>
-                <v:fill on="t" focussize="0,0"/>
-                <v:stroke on="f"/>
-                <v:imagedata o:title=""/>
-                <o:lock v:ext="edit" aspectratio="f"/>
+              <v:shape w14:anchorId="19B98B15" id="Freeform 33" o:spid="_x0000_s1026" style="position:absolute;margin-left:67.55pt;margin-top:15.75pt;width:6.15pt;height:44.15pt;z-index:251661312;visibility:visible;mso-wrap-style:square;mso-width-percent:0;mso-height-percent:0;mso-wrap-distance-left:9.07pt;mso-wrap-distance-top:0;mso-wrap-distance-right:9.07pt;mso-wrap-distance-bottom:0;mso-position-horizontal:absolute;mso-position-horizontal-relative:page;mso-position-vertical:absolute;mso-position-vertical-relative:text;mso-width-percent:0;mso-height-percent:0;mso-width-relative:page;mso-height-relative:page;v-text-anchor:top" coordsize="123,1338" o:gfxdata="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" o:allowincell="f" path="m122,l,,,1337r122,l122,xe" fillcolor="#d31145" stroked="f" strokeweight="1pt">
+                <v:path arrowok="t" o:connecttype="custom" o:connectlocs="77470,0;0,0;0,560335;77470,560335;77470,0" o:connectangles="0,0,0,0,0"/>
+                <w10:wrap anchorx="page"/>
               </v:shape>
             </w:pict>
           </mc:Fallback>
@@ -1056,7 +1083,7 @@
     <w:p>
       <w:pPr>
         <w:rPr>
-          <w:rFonts w:ascii="宋体" w:eastAsia="宋体" w:hAnsi="宋体" w:cs="DTL Argo T"/>
+          <w:rFonts w:ascii="宋体" w:eastAsia="宋体" w:hAnsi="宋体" w:cs="DTL Argo T" w:hint="eastAsia"/>
           <w:bCs/>
           <w:color w:val="4C4D4F"/>
         </w:rPr>
@@ -1075,30 +1102,14 @@
           <w:bCs/>
           <w:color w:val="4C4D4F"/>
         </w:rPr>
-        <w:t>需要注意</w:t>
-      </w:r>
-      <w:r>
-        <w:rPr>
-          <w:rFonts w:ascii="宋体" w:eastAsia="宋体" w:hAnsi="宋体" w:cs="DTL Argo T" w:hint="eastAsia"/>
-          <w:bCs/>
-          <w:color w:val="4C4D4F"/>
-        </w:rPr>
-        <w:t xml:space="preserve"> - </w:t>
-      </w:r>
-      <w:r>
-        <w:rPr>
-          <w:rFonts w:ascii="宋体" w:eastAsia="宋体" w:hAnsi="宋体" w:cs="DTL Argo T" w:hint="eastAsia"/>
-          <w:bCs/>
-          <w:color w:val="4C4D4F"/>
-        </w:rPr>
-        <w:t>将控制阀组件的状况定义为“重大影响”表示基本操作已失败或失败的可能性非常高。这些都是紧急情况，需要立即或尽早予以关注。它们是客户的最高优先级，可能会导致运营停机。</w:t>
-      </w:r>
-    </w:p>
-    <w:p>
-      <w:pPr>
-        <w:pStyle w:val="a3"/>
-        <w:rPr>
-          <w:rFonts w:ascii="宋体" w:eastAsia="宋体" w:hAnsi="宋体"/>
+        <w:t>需要注意 - 将控制阀组件的状况定义为“重大影响”表示基本操作已失败或失败的可能性非常高。这些都是紧急情况，需要立即或尽早予以关注。它们是客户的最高优先级，可能会导致运营停机。</w:t>
+      </w:r>
+    </w:p>
+    <w:p>
+      <w:pPr>
+        <w:pStyle w:val="af4"/>
+        <w:rPr>
+          <w:rFonts w:ascii="宋体" w:eastAsia="宋体" w:hAnsi="宋体" w:hint="eastAsia"/>
           <w:sz w:val="40"/>
           <w:szCs w:val="40"/>
           <w:lang w:eastAsia="zh-CN"/>
@@ -1115,23 +1126,27 @@
         <mc:AlternateContent>
           <mc:Choice Requires="wps">
             <w:drawing>
-              <wp:anchor distT="0" distB="0" distL="114935" distR="114935" simplePos="0" relativeHeight="251661312" behindDoc="0" locked="0" layoutInCell="0" allowOverlap="1" wp14:anchorId="7B69E08C" wp14:editId="27D8609C">
+              <wp:anchor distT="0" distB="0" distL="115189" distR="115189" simplePos="0" relativeHeight="251662336" behindDoc="0" locked="0" layoutInCell="0" allowOverlap="1" wp14:anchorId="7DBDCF3E" wp14:editId="248A82AA">
                 <wp:simplePos x="0" y="0"/>
                 <wp:positionH relativeFrom="page">
-                  <wp:posOffset>861060</wp:posOffset>
+                  <wp:posOffset>861646</wp:posOffset>
                 </wp:positionH>
                 <wp:positionV relativeFrom="paragraph">
-                  <wp:posOffset>427355</wp:posOffset>
+                  <wp:posOffset>427502</wp:posOffset>
                 </wp:positionV>
-                <wp:extent cx="78105" cy="734695"/>
+                <wp:extent cx="78154" cy="734646"/>
                 <wp:effectExtent l="0" t="0" r="0" b="8890"/>
                 <wp:wrapNone/>
                 <wp:docPr id="88" name="Freeform 34"/>
-                <wp:cNvGraphicFramePr/>
+                <wp:cNvGraphicFramePr>
+                  <a:graphicFrameLocks xmlns:a="http://schemas.openxmlformats.org/drawingml/2006/main"/>
+                </wp:cNvGraphicFramePr>
                 <a:graphic xmlns:a="http://schemas.openxmlformats.org/drawingml/2006/main">
                   <a:graphicData uri="http://schemas.microsoft.com/office/word/2010/wordprocessingShape">
                     <wps:wsp>
-                      <wps:cNvSpPr/>
+                      <wps:cNvSpPr>
+                        <a:spLocks/>
+                      </wps:cNvSpPr>
                       <wps:spPr bwMode="auto">
                         <a:xfrm>
                           <a:off x="0" y="0"/>
@@ -1197,6 +1212,18 @@
                         <a:ln>
                           <a:noFill/>
                         </a:ln>
+                        <a:extLst>
+                          <a:ext uri="{91240B29-F687-4F45-9708-019B960494DF}">
+                            <a14:hiddenLine xmlns:a14="http://schemas.microsoft.com/office/drawing/2010/main" w="12700">
+                              <a:solidFill>
+                                <a:srgbClr val="000000"/>
+                              </a:solidFill>
+                              <a:round/>
+                              <a:headEnd/>
+                              <a:tailEnd/>
+                            </a14:hiddenLine>
+                          </a:ext>
+                        </a:extLst>
                       </wps:spPr>
                       <wps:bodyPr rot="0" vert="horz" wrap="square" lIns="91440" tIns="45720" rIns="91440" bIns="45720" anchor="t" anchorCtr="0" upright="1">
                         <a:noAutofit/>
@@ -1204,17 +1231,20 @@
                     </wps:wsp>
                   </a:graphicData>
                 </a:graphic>
+                <wp14:sizeRelH relativeFrom="page">
+                  <wp14:pctWidth>0</wp14:pctWidth>
+                </wp14:sizeRelH>
+                <wp14:sizeRelV relativeFrom="page">
+                  <wp14:pctHeight>0</wp14:pctHeight>
+                </wp14:sizeRelV>
               </wp:anchor>
             </w:drawing>
           </mc:Choice>
-          <mc:Fallback xmlns:wpsCustomData="http://www.wps.cn/officeDocument/2013/wpsCustomData">
+          <mc:Fallback>
             <w:pict>
-              <v:shape id="Freeform 34" o:spid="_x0000_s1026" o:spt="100" style="position:absolute;left:0pt;margin-left:67.8pt;margin-top:33.65pt;height:57.85pt;width:6.15pt;mso-position-horizontal-relative:page;z-index:251661312;mso-width-relative:page;mso-height-relative:page;" fillcolor="#FFCF22" filled="t" stroked="f" coordsize="123,2202" o:allowincell="f" o:gfxdata="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" path="m122,0l0,0,0,2201,122,2201,122,0xe">
-                <v:path o:connectlocs="77518,0;0,0;0,734312;77518,734312;77518,0" o:connectangles="0,0,0,0,0"/>
-                <v:fill on="t" focussize="0,0"/>
-                <v:stroke on="f"/>
-                <v:imagedata o:title=""/>
-                <o:lock v:ext="edit" aspectratio="f"/>
+              <v:shape w14:anchorId="77427A69" id="Freeform 34" o:spid="_x0000_s1026" style="position:absolute;margin-left:67.85pt;margin-top:33.65pt;width:6.15pt;height:57.85pt;z-index:251662336;visibility:visible;mso-wrap-style:square;mso-width-percent:0;mso-height-percent:0;mso-wrap-distance-left:9.07pt;mso-wrap-distance-top:0;mso-wrap-distance-right:9.07pt;mso-wrap-distance-bottom:0;mso-position-horizontal:absolute;mso-position-horizontal-relative:page;mso-position-vertical:absolute;mso-position-vertical-relative:text;mso-width-percent:0;mso-height-percent:0;mso-width-relative:page;mso-height-relative:page;v-text-anchor:top" coordsize="123,2202" o:gfxdata="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" o:allowincell="f" path="m122,l,,,2201r122,l122,xe" fillcolor="#ffcf22" stroked="f" strokeweight="1pt">
+                <v:path arrowok="t" o:connecttype="custom" o:connectlocs="77519,0;0,0;0,734312;77519,734312;77519,0" o:connectangles="0,0,0,0,0"/>
+                <w10:wrap anchorx="page"/>
               </v:shape>
             </w:pict>
           </mc:Fallback>
@@ -1224,7 +1254,7 @@
     <w:p>
       <w:pPr>
         <w:rPr>
-          <w:rFonts w:ascii="宋体" w:eastAsia="宋体" w:hAnsi="宋体" w:cs="DTL Argo T"/>
+          <w:rFonts w:ascii="宋体" w:eastAsia="宋体" w:hAnsi="宋体" w:cs="DTL Argo T" w:hint="eastAsia"/>
           <w:bCs/>
           <w:color w:val="4C4D4F"/>
         </w:rPr>
@@ -1243,80 +1273,32 @@
           <w:bCs/>
           <w:color w:val="4C4D4F"/>
         </w:rPr>
-        <w:t>需要注意</w:t>
-      </w:r>
+        <w:t>需要注意 - 将控制阀组件的状况定义为“轻微影响”表示存在基本操作，但存在抑制因素。抑制因素包括性能明显下降的指示、发现可能退化的已知指标以及设置、调整或校准不当的指示。这些情况需要详细监控和/或持续关注，以便稍后确定维护和/或其他故障排除。这些情况不太可能导致立即运行停机并确定需要</w:t>
+      </w:r>
+      <w:proofErr w:type="gramStart"/>
       <w:r>
         <w:rPr>
           <w:rFonts w:ascii="宋体" w:eastAsia="宋体" w:hAnsi="宋体" w:cs="DTL Argo T" w:hint="eastAsia"/>
           <w:bCs/>
           <w:color w:val="4C4D4F"/>
         </w:rPr>
-        <w:t xml:space="preserve"> - </w:t>
-      </w:r>
+        <w:t>尽快或</w:t>
+      </w:r>
+      <w:proofErr w:type="gramEnd"/>
       <w:r>
         <w:rPr>
           <w:rFonts w:ascii="宋体" w:eastAsia="宋体" w:hAnsi="宋体" w:cs="DTL Argo T" w:hint="eastAsia"/>
           <w:bCs/>
           <w:color w:val="4C4D4F"/>
         </w:rPr>
-        <w:t>将控制阀组件的状况定义为“轻微影响”表示存在基本操作，但存在抑制因素。抑制因素包括性能明显下降的指示、发现可能退化的已知指标以及设置、调整或校准不当的指示。这些情况需要详细监控和</w:t>
-      </w:r>
-      <w:r>
-        <w:rPr>
-          <w:rFonts w:ascii="宋体" w:eastAsia="宋体" w:hAnsi="宋体" w:cs="DTL Argo T" w:hint="eastAsia"/>
-          <w:bCs/>
-          <w:color w:val="4C4D4F"/>
-        </w:rPr>
-        <w:t>/</w:t>
-      </w:r>
-      <w:r>
-        <w:rPr>
-          <w:rFonts w:ascii="宋体" w:eastAsia="宋体" w:hAnsi="宋体" w:cs="DTL Argo T" w:hint="eastAsia"/>
-          <w:bCs/>
-          <w:color w:val="4C4D4F"/>
-        </w:rPr>
-        <w:t>或持续关注，以便稍后确定维护和</w:t>
-      </w:r>
-      <w:r>
-        <w:rPr>
-          <w:rFonts w:ascii="宋体" w:eastAsia="宋体" w:hAnsi="宋体" w:cs="DTL Argo T" w:hint="eastAsia"/>
-          <w:bCs/>
-          <w:color w:val="4C4D4F"/>
-        </w:rPr>
-        <w:t>/</w:t>
-      </w:r>
-      <w:r>
-        <w:rPr>
-          <w:rFonts w:ascii="宋体" w:eastAsia="宋体" w:hAnsi="宋体" w:cs="DTL Argo T" w:hint="eastAsia"/>
-          <w:bCs/>
-          <w:color w:val="4C4D4F"/>
-        </w:rPr>
-        <w:t>或其他故障排除。这些情况不太可能导致立即运行停机并确定需要</w:t>
-      </w:r>
-      <w:proofErr w:type="gramStart"/>
-      <w:r>
-        <w:rPr>
-          <w:rFonts w:ascii="宋体" w:eastAsia="宋体" w:hAnsi="宋体" w:cs="DTL Argo T" w:hint="eastAsia"/>
-          <w:bCs/>
-          <w:color w:val="4C4D4F"/>
-        </w:rPr>
-        <w:t>尽快或</w:t>
-      </w:r>
-      <w:proofErr w:type="gramEnd"/>
-      <w:r>
-        <w:rPr>
-          <w:rFonts w:ascii="宋体" w:eastAsia="宋体" w:hAnsi="宋体" w:cs="DTL Argo T" w:hint="eastAsia"/>
-          <w:bCs/>
-          <w:color w:val="4C4D4F"/>
-        </w:rPr>
         <w:t>尽早进行维护。</w:t>
       </w:r>
     </w:p>
     <w:p>
       <w:pPr>
-        <w:pStyle w:val="a3"/>
-        <w:rPr>
-          <w:rFonts w:ascii="宋体" w:eastAsia="宋体" w:hAnsi="宋体"/>
+        <w:pStyle w:val="af4"/>
+        <w:rPr>
+          <w:rFonts w:ascii="宋体" w:eastAsia="宋体" w:hAnsi="宋体" w:hint="eastAsia"/>
           <w:sz w:val="40"/>
           <w:szCs w:val="40"/>
           <w:lang w:eastAsia="zh-CN"/>
@@ -1333,23 +1315,27 @@
         <mc:AlternateContent>
           <mc:Choice Requires="wps">
             <w:drawing>
-              <wp:anchor distT="0" distB="0" distL="114935" distR="114935" simplePos="0" relativeHeight="251662336" behindDoc="0" locked="0" layoutInCell="0" allowOverlap="1" wp14:anchorId="32FEFCFE" wp14:editId="7B3C5836">
+              <wp:anchor distT="0" distB="0" distL="115189" distR="115189" simplePos="0" relativeHeight="251663360" behindDoc="0" locked="0" layoutInCell="0" allowOverlap="1" wp14:anchorId="0BAB3641" wp14:editId="235FFD2D">
                 <wp:simplePos x="0" y="0"/>
                 <wp:positionH relativeFrom="page">
-                  <wp:posOffset>857250</wp:posOffset>
+                  <wp:posOffset>857738</wp:posOffset>
                 </wp:positionH>
                 <wp:positionV relativeFrom="paragraph">
-                  <wp:posOffset>424180</wp:posOffset>
+                  <wp:posOffset>424766</wp:posOffset>
                 </wp:positionV>
-                <wp:extent cx="78105" cy="525780"/>
+                <wp:extent cx="78105" cy="525585"/>
                 <wp:effectExtent l="0" t="0" r="0" b="8255"/>
                 <wp:wrapNone/>
                 <wp:docPr id="87" name="Freeform 35"/>
-                <wp:cNvGraphicFramePr/>
+                <wp:cNvGraphicFramePr>
+                  <a:graphicFrameLocks xmlns:a="http://schemas.openxmlformats.org/drawingml/2006/main"/>
+                </wp:cNvGraphicFramePr>
                 <a:graphic xmlns:a="http://schemas.openxmlformats.org/drawingml/2006/main">
                   <a:graphicData uri="http://schemas.microsoft.com/office/word/2010/wordprocessingShape">
                     <wps:wsp>
-                      <wps:cNvSpPr/>
+                      <wps:cNvSpPr>
+                        <a:spLocks/>
+                      </wps:cNvSpPr>
                       <wps:spPr bwMode="auto">
                         <a:xfrm>
                           <a:off x="0" y="0"/>
@@ -1415,6 +1401,18 @@
                         <a:ln>
                           <a:noFill/>
                         </a:ln>
+                        <a:extLst>
+                          <a:ext uri="{91240B29-F687-4F45-9708-019B960494DF}">
+                            <a14:hiddenLine xmlns:a14="http://schemas.microsoft.com/office/drawing/2010/main" w="12700">
+                              <a:solidFill>
+                                <a:srgbClr val="000000"/>
+                              </a:solidFill>
+                              <a:round/>
+                              <a:headEnd/>
+                              <a:tailEnd/>
+                            </a14:hiddenLine>
+                          </a:ext>
+                        </a:extLst>
                       </wps:spPr>
                       <wps:bodyPr rot="0" vert="horz" wrap="square" lIns="91440" tIns="45720" rIns="91440" bIns="45720" anchor="t" anchorCtr="0" upright="1">
                         <a:noAutofit/>
@@ -1422,17 +1420,20 @@
                     </wps:wsp>
                   </a:graphicData>
                 </a:graphic>
+                <wp14:sizeRelH relativeFrom="page">
+                  <wp14:pctWidth>0</wp14:pctWidth>
+                </wp14:sizeRelH>
+                <wp14:sizeRelV relativeFrom="page">
+                  <wp14:pctHeight>0</wp14:pctHeight>
+                </wp14:sizeRelV>
               </wp:anchor>
             </w:drawing>
           </mc:Choice>
-          <mc:Fallback xmlns:wpsCustomData="http://www.wps.cn/officeDocument/2013/wpsCustomData">
+          <mc:Fallback>
             <w:pict>
-              <v:shape id="Freeform 35" o:spid="_x0000_s1026" o:spt="100" style="position:absolute;left:0pt;margin-left:67.5pt;margin-top:33.4pt;height:41.4pt;width:6.15pt;mso-position-horizontal-relative:page;z-index:251662336;mso-width-relative:page;mso-height-relative:page;" fillcolor="#62BB46" filled="t" stroked="f" coordsize="123,1050" o:allowincell="f" o:gfxdata="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" path="m122,0l0,0,0,1049,122,1049,122,0xe">
-                <v:path o:connectlocs="77470,0;0,0;0,525084;77470,525084;77470,0" o:connectangles="0,0,0,0,0"/>
-                <v:fill on="t" focussize="0,0"/>
-                <v:stroke on="f"/>
-                <v:imagedata o:title=""/>
-                <o:lock v:ext="edit" aspectratio="f"/>
+              <v:shape w14:anchorId="31DE765C" id="Freeform 35" o:spid="_x0000_s1026" style="position:absolute;margin-left:67.55pt;margin-top:33.45pt;width:6.15pt;height:41.4pt;z-index:251663360;visibility:visible;mso-wrap-style:square;mso-width-percent:0;mso-height-percent:0;mso-wrap-distance-left:9.07pt;mso-wrap-distance-top:0;mso-wrap-distance-right:9.07pt;mso-wrap-distance-bottom:0;mso-position-horizontal:absolute;mso-position-horizontal-relative:page;mso-position-vertical:absolute;mso-position-vertical-relative:text;mso-width-percent:0;mso-height-percent:0;mso-width-relative:page;mso-height-relative:page;v-text-anchor:top" coordsize="123,1050" o:gfxdata="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" o:allowincell="f" path="m122,l,,,1049r122,l122,xe" fillcolor="#62bb46" stroked="f" strokeweight="1pt">
+                <v:path arrowok="t" o:connecttype="custom" o:connectlocs="77470,0;0,0;0,525084;77470,525084;77470,0" o:connectangles="0,0,0,0,0"/>
+                <w10:wrap anchorx="page"/>
               </v:shape>
             </w:pict>
           </mc:Fallback>
@@ -1442,7 +1443,7 @@
     <w:p>
       <w:pPr>
         <w:rPr>
-          <w:rFonts w:ascii="宋体" w:eastAsia="宋体" w:hAnsi="宋体" w:cs="DTL Argo T"/>
+          <w:rFonts w:ascii="宋体" w:eastAsia="宋体" w:hAnsi="宋体" w:cs="DTL Argo T" w:hint="eastAsia"/>
           <w:bCs/>
           <w:color w:val="4C4D4F"/>
         </w:rPr>
@@ -1461,30 +1462,14 @@
           <w:bCs/>
           <w:color w:val="4C4D4F"/>
         </w:rPr>
-        <w:t>正常</w:t>
-      </w:r>
-      <w:r>
-        <w:rPr>
-          <w:rFonts w:ascii="宋体" w:eastAsia="宋体" w:hAnsi="宋体" w:cs="DTL Argo T" w:hint="eastAsia"/>
-          <w:bCs/>
-          <w:color w:val="4C4D4F"/>
-        </w:rPr>
-        <w:t xml:space="preserve"> - </w:t>
-      </w:r>
-      <w:r>
-        <w:rPr>
-          <w:rFonts w:ascii="宋体" w:eastAsia="宋体" w:hAnsi="宋体" w:cs="DTL Argo T" w:hint="eastAsia"/>
-          <w:bCs/>
-          <w:color w:val="4C4D4F"/>
-        </w:rPr>
-        <w:t>将控制阀组件的状况定义为“无影响”表示存在基本操作并且没有明显的抑制因素。根据分析的所有数据，无法发现任何问题。这些情况不需要额外的维护或进一步的操作。</w:t>
-      </w:r>
-    </w:p>
-    <w:p>
-      <w:pPr>
-        <w:pStyle w:val="a3"/>
-        <w:rPr>
-          <w:rFonts w:ascii="宋体" w:eastAsia="宋体" w:hAnsi="宋体"/>
+        <w:t>正常 - 将控制阀组件的状况定义为“无影响”表示存在基本操作并且没有明显的抑制因素。根据分析的所有数据，无法发现任何问题。这些情况不需要额外的维护或进一步的操作。</w:t>
+      </w:r>
+    </w:p>
+    <w:p>
+      <w:pPr>
+        <w:pStyle w:val="af4"/>
+        <w:rPr>
+          <w:rFonts w:ascii="宋体" w:eastAsia="宋体" w:hAnsi="宋体" w:hint="eastAsia"/>
           <w:sz w:val="40"/>
           <w:szCs w:val="40"/>
           <w:lang w:eastAsia="zh-CN"/>
@@ -1499,23 +1484,27 @@
         <mc:AlternateContent>
           <mc:Choice Requires="wps">
             <w:drawing>
-              <wp:anchor distT="0" distB="0" distL="114935" distR="114935" simplePos="0" relativeHeight="251663360" behindDoc="0" locked="0" layoutInCell="0" allowOverlap="1" wp14:anchorId="55111BCF" wp14:editId="0C64A859">
+              <wp:anchor distT="0" distB="0" distL="115189" distR="115189" simplePos="0" relativeHeight="251664384" behindDoc="0" locked="0" layoutInCell="0" allowOverlap="1" wp14:anchorId="23709E33" wp14:editId="22021572">
                 <wp:simplePos x="0" y="0"/>
                 <wp:positionH relativeFrom="page">
-                  <wp:posOffset>857250</wp:posOffset>
+                  <wp:posOffset>857738</wp:posOffset>
                 </wp:positionH>
                 <wp:positionV relativeFrom="paragraph">
-                  <wp:posOffset>424180</wp:posOffset>
+                  <wp:posOffset>424766</wp:posOffset>
                 </wp:positionV>
-                <wp:extent cx="78105" cy="554990"/>
+                <wp:extent cx="78105" cy="554892"/>
                 <wp:effectExtent l="0" t="0" r="0" b="0"/>
                 <wp:wrapNone/>
                 <wp:docPr id="86" name="Freeform 36"/>
-                <wp:cNvGraphicFramePr/>
+                <wp:cNvGraphicFramePr>
+                  <a:graphicFrameLocks xmlns:a="http://schemas.openxmlformats.org/drawingml/2006/main"/>
+                </wp:cNvGraphicFramePr>
                 <a:graphic xmlns:a="http://schemas.openxmlformats.org/drawingml/2006/main">
                   <a:graphicData uri="http://schemas.microsoft.com/office/word/2010/wordprocessingShape">
                     <wps:wsp>
-                      <wps:cNvSpPr/>
+                      <wps:cNvSpPr>
+                        <a:spLocks/>
+                      </wps:cNvSpPr>
                       <wps:spPr bwMode="auto">
                         <a:xfrm>
                           <a:off x="0" y="0"/>
@@ -1581,6 +1570,18 @@
                         <a:ln>
                           <a:noFill/>
                         </a:ln>
+                        <a:extLst>
+                          <a:ext uri="{91240B29-F687-4F45-9708-019B960494DF}">
+                            <a14:hiddenLine xmlns:a14="http://schemas.microsoft.com/office/drawing/2010/main" w="12700">
+                              <a:solidFill>
+                                <a:srgbClr val="000000"/>
+                              </a:solidFill>
+                              <a:round/>
+                              <a:headEnd/>
+                              <a:tailEnd/>
+                            </a14:hiddenLine>
+                          </a:ext>
+                        </a:extLst>
                       </wps:spPr>
                       <wps:bodyPr rot="0" vert="horz" wrap="square" lIns="91440" tIns="45720" rIns="91440" bIns="45720" anchor="t" anchorCtr="0" upright="1">
                         <a:noAutofit/>
@@ -1588,17 +1589,20 @@
                     </wps:wsp>
                   </a:graphicData>
                 </a:graphic>
+                <wp14:sizeRelH relativeFrom="page">
+                  <wp14:pctWidth>0</wp14:pctWidth>
+                </wp14:sizeRelH>
+                <wp14:sizeRelV relativeFrom="page">
+                  <wp14:pctHeight>0</wp14:pctHeight>
+                </wp14:sizeRelV>
               </wp:anchor>
             </w:drawing>
           </mc:Choice>
-          <mc:Fallback xmlns:wpsCustomData="http://www.wps.cn/officeDocument/2013/wpsCustomData">
+          <mc:Fallback>
             <w:pict>
-              <v:shape id="Freeform 36" o:spid="_x0000_s1026" o:spt="100" style="position:absolute;left:0pt;margin-left:67.5pt;margin-top:33.4pt;height:43.7pt;width:6.15pt;mso-position-horizontal-relative:page;z-index:251663360;mso-width-relative:page;mso-height-relative:page;" fillcolor="#6E298D" filled="t" stroked="f" coordsize="123,1412" o:allowincell="f" o:gfxdata="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" path="m122,0l0,0,0,1411,122,1411,122,0xe">
-                <v:path o:connectlocs="77470,0;0,0;0,554499;77470,554499;77470,0" o:connectangles="0,0,0,0,0"/>
-                <v:fill on="t" focussize="0,0"/>
-                <v:stroke on="f"/>
-                <v:imagedata o:title=""/>
-                <o:lock v:ext="edit" aspectratio="f"/>
+              <v:shape w14:anchorId="634ABCB0" id="Freeform 36" o:spid="_x0000_s1026" style="position:absolute;margin-left:67.55pt;margin-top:33.45pt;width:6.15pt;height:43.7pt;z-index:251664384;visibility:visible;mso-wrap-style:square;mso-width-percent:0;mso-height-percent:0;mso-wrap-distance-left:9.07pt;mso-wrap-distance-top:0;mso-wrap-distance-right:9.07pt;mso-wrap-distance-bottom:0;mso-position-horizontal:absolute;mso-position-horizontal-relative:page;mso-position-vertical:absolute;mso-position-vertical-relative:text;mso-width-percent:0;mso-height-percent:0;mso-width-relative:page;mso-height-relative:page;v-text-anchor:top" coordsize="123,1412" o:gfxdata="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" o:allowincell="f" path="m122,l,,,1411r122,l122,xe" fillcolor="#6e298d" stroked="f" strokeweight="1pt">
+                <v:path arrowok="t" o:connecttype="custom" o:connectlocs="77470,0;0,0;0,554499;77470,554499;77470,0" o:connectangles="0,0,0,0,0"/>
+                <w10:wrap anchorx="page"/>
               </v:shape>
             </w:pict>
           </mc:Fallback>
@@ -1608,7 +1612,7 @@
     <w:p>
       <w:pPr>
         <w:rPr>
-          <w:rFonts w:ascii="宋体" w:eastAsia="宋体" w:hAnsi="宋体"/>
+          <w:rFonts w:ascii="宋体" w:eastAsia="宋体" w:hAnsi="宋体" w:hint="eastAsia"/>
         </w:rPr>
       </w:pPr>
       <w:r>
@@ -1626,60 +1630,20 @@
           <w:bCs/>
           <w:color w:val="4C4D4F"/>
         </w:rPr>
-        <w:t>未知影响</w:t>
-      </w:r>
-      <w:r>
-        <w:rPr>
-          <w:rFonts w:ascii="宋体" w:eastAsia="宋体" w:hAnsi="宋体" w:cs="DTL Argo T" w:hint="eastAsia"/>
-          <w:bCs/>
-          <w:color w:val="4C4D4F"/>
-        </w:rPr>
-        <w:t xml:space="preserve"> - </w:t>
-      </w:r>
-      <w:r>
-        <w:rPr>
-          <w:rFonts w:ascii="宋体" w:eastAsia="宋体" w:hAnsi="宋体" w:cs="DTL Argo T" w:hint="eastAsia"/>
-          <w:bCs/>
-          <w:color w:val="4C4D4F"/>
-        </w:rPr>
-        <w:t>将控制阀组件的状况</w:t>
-      </w:r>
-      <w:r>
-        <w:rPr>
-          <w:rFonts w:ascii="宋体" w:eastAsia="宋体" w:hAnsi="宋体" w:cs="DTL Argo T" w:hint="eastAsia"/>
-          <w:bCs/>
-          <w:color w:val="4C4D4F"/>
-        </w:rPr>
-        <w:t>定义为“无数据</w:t>
-      </w:r>
-      <w:r>
-        <w:rPr>
-          <w:rFonts w:ascii="宋体" w:eastAsia="宋体" w:hAnsi="宋体" w:cs="DTL Argo T" w:hint="eastAsia"/>
-          <w:bCs/>
-          <w:color w:val="4C4D4F"/>
-        </w:rPr>
-        <w:t>/</w:t>
-      </w:r>
-      <w:r>
-        <w:rPr>
-          <w:rFonts w:ascii="宋体" w:eastAsia="宋体" w:hAnsi="宋体" w:cs="DTL Argo T" w:hint="eastAsia"/>
-          <w:bCs/>
-          <w:color w:val="4C4D4F"/>
-        </w:rPr>
-        <w:t>未知影响”表示没有可用于分析以确定影响的诊断数据。因此，由于无法进行详细评估，因此影响未知。这些情况需要采取进一步行动来收集预期的诊断数据或恢复捕获数据的方法。</w:t>
-      </w:r>
-    </w:p>
-    <w:p>
-      <w:pPr>
-        <w:rPr>
-          <w:rFonts w:ascii="宋体" w:eastAsia="宋体" w:hAnsi="宋体"/>
-        </w:rPr>
-      </w:pPr>
-    </w:p>
-    <w:p>
-      <w:pPr>
-        <w:rPr>
-          <w:rFonts w:ascii="宋体" w:eastAsia="宋体" w:hAnsi="宋体"/>
+        <w:t>未知影响 - 将控制阀组件的状况定义为“无数据/未知影响”表示没有可用于分析以确定影响的诊断数据。因此，由于无法进行详细评估，因此影响未知。这些情况需要采取进一步行动来收集预期的诊断数据或恢复捕获数据的方法。</w:t>
+      </w:r>
+    </w:p>
+    <w:p>
+      <w:pPr>
+        <w:rPr>
+          <w:rFonts w:ascii="宋体" w:eastAsia="宋体" w:hAnsi="宋体" w:hint="eastAsia"/>
+        </w:rPr>
+      </w:pPr>
+    </w:p>
+    <w:p>
+      <w:pPr>
+        <w:rPr>
+          <w:rFonts w:ascii="宋体" w:eastAsia="宋体" w:hAnsi="宋体" w:hint="eastAsia"/>
         </w:rPr>
       </w:pPr>
     </w:p>
@@ -1688,7 +1652,7 @@
         <w:widowControl/>
         <w:jc w:val="left"/>
         <w:rPr>
-          <w:rFonts w:ascii="宋体" w:eastAsia="宋体" w:hAnsi="宋体"/>
+          <w:rFonts w:ascii="宋体" w:eastAsia="宋体" w:hAnsi="宋体" w:hint="eastAsia"/>
         </w:rPr>
       </w:pPr>
       <w:r>
@@ -1700,12 +1664,12 @@
     </w:p>
     <w:p>
       <w:pPr>
-        <w:pStyle w:val="a3"/>
+        <w:pStyle w:val="af4"/>
         <w:tabs>
           <w:tab w:val="left" w:pos="10889"/>
         </w:tabs>
         <w:rPr>
-          <w:rFonts w:ascii="宋体" w:eastAsia="宋体" w:hAnsi="宋体" w:cs="DTL Argo T"/>
+          <w:rFonts w:ascii="宋体" w:eastAsia="宋体" w:hAnsi="宋体" w:cs="DTL Argo T" w:hint="eastAsia"/>
           <w:b/>
           <w:bCs/>
           <w:color w:val="43545C"/>
@@ -1729,27 +1693,13 @@
           <w:lang w:eastAsia="zh-CN"/>
         </w:rPr>
         <w:lastRenderedPageBreak/>
-        <w:t>总体情况</w:t>
-      </w:r>
-      <w:r>
-        <w:rPr>
-          <w:rFonts w:ascii="宋体" w:eastAsia="宋体" w:hAnsi="宋体" w:cs="DTL Argo T" w:hint="eastAsia"/>
-          <w:b/>
-          <w:bCs/>
-          <w:color w:val="43545C"/>
-          <w:spacing w:val="-5"/>
-          <w:sz w:val="48"/>
-          <w:szCs w:val="48"/>
-          <w:u w:val="thick" w:color="A0CF67"/>
-          <w:lang w:eastAsia="zh-CN"/>
-        </w:rPr>
-        <w:t xml:space="preserve">                           </w:t>
-      </w:r>
-    </w:p>
-    <w:p>
-      <w:pPr>
-        <w:rPr>
-          <w:rFonts w:ascii="宋体" w:eastAsia="宋体" w:hAnsi="宋体"/>
+        <w:t xml:space="preserve">总体情况                           </w:t>
+      </w:r>
+    </w:p>
+    <w:p>
+      <w:pPr>
+        <w:rPr>
+          <w:rFonts w:ascii="宋体" w:eastAsia="宋体" w:hAnsi="宋体" w:hint="eastAsia"/>
         </w:rPr>
       </w:pPr>
     </w:p>
@@ -1757,7 +1707,7 @@
       <w:pPr>
         <w:jc w:val="distribute"/>
         <w:rPr>
-          <w:rFonts w:ascii="宋体" w:eastAsia="宋体" w:hAnsi="宋体"/>
+          <w:rFonts w:ascii="宋体" w:eastAsia="宋体" w:hAnsi="宋体" w:hint="eastAsia"/>
         </w:rPr>
       </w:pPr>
       <w:r>
@@ -1806,14 +1756,14 @@
     <w:p>
       <w:pPr>
         <w:rPr>
-          <w:rFonts w:ascii="宋体" w:eastAsia="宋体" w:hAnsi="宋体"/>
-        </w:rPr>
-      </w:pPr>
-    </w:p>
-    <w:p>
-      <w:pPr>
-        <w:rPr>
-          <w:rFonts w:ascii="宋体" w:eastAsia="宋体" w:hAnsi="宋体"/>
+          <w:rFonts w:ascii="宋体" w:eastAsia="宋体" w:hAnsi="宋体" w:hint="eastAsia"/>
+        </w:rPr>
+      </w:pPr>
+    </w:p>
+    <w:p>
+      <w:pPr>
+        <w:rPr>
+          <w:rFonts w:ascii="宋体" w:eastAsia="宋体" w:hAnsi="宋体" w:hint="eastAsia"/>
         </w:rPr>
       </w:pPr>
       <w:r>
@@ -1826,7 +1776,7 @@
     <w:p>
       <w:pPr>
         <w:rPr>
-          <w:rFonts w:ascii="宋体" w:eastAsia="宋体" w:hAnsi="宋体"/>
+          <w:rFonts w:ascii="宋体" w:eastAsia="宋体" w:hAnsi="宋体" w:hint="eastAsia"/>
         </w:rPr>
       </w:pPr>
     </w:p>
@@ -1839,13 +1789,14 @@
         <w:ind w:right="-58"/>
         <w:jc w:val="center"/>
         <w:rPr>
-          <w:rFonts w:ascii="宋体" w:eastAsia="宋体" w:hAnsi="宋体" w:cs="DTL Argo T"/>
+          <w:rFonts w:ascii="宋体" w:eastAsia="宋体" w:hAnsi="宋体" w:cs="DTL Argo T" w:hint="eastAsia"/>
           <w:b/>
           <w:bCs/>
           <w:color w:val="45545D"/>
           <w:kern w:val="0"/>
           <w:sz w:val="40"/>
           <w:szCs w:val="40"/>
+          <w:specVanish/>
         </w:rPr>
       </w:pPr>
       <w:r>
@@ -1857,6 +1808,7 @@
           <w:kern w:val="0"/>
           <w:sz w:val="40"/>
           <w:szCs w:val="40"/>
+          <w:specVanish/>
         </w:rPr>
         <w:t>新问题</w:t>
       </w:r>
@@ -1864,7 +1816,7 @@
     <w:p>
       <w:pPr>
         <w:rPr>
-          <w:rFonts w:ascii="宋体" w:eastAsia="宋体" w:hAnsi="宋体"/>
+          <w:rFonts w:ascii="宋体" w:eastAsia="宋体" w:hAnsi="宋体" w:hint="eastAsia"/>
         </w:rPr>
       </w:pPr>
       <w:r>
@@ -1891,7 +1843,7 @@
     <w:p>
       <w:pPr>
         <w:rPr>
-          <w:rFonts w:ascii="宋体" w:eastAsia="宋体" w:hAnsi="宋体"/>
+          <w:rFonts w:ascii="宋体" w:eastAsia="宋体" w:hAnsi="宋体" w:hint="eastAsia"/>
         </w:rPr>
       </w:pPr>
     </w:p>
@@ -1904,13 +1856,14 @@
         <w:ind w:right="-58"/>
         <w:jc w:val="center"/>
         <w:rPr>
-          <w:rFonts w:ascii="宋体" w:eastAsia="宋体" w:hAnsi="宋体" w:cs="DTL Argo T"/>
+          <w:rFonts w:ascii="宋体" w:eastAsia="宋体" w:hAnsi="宋体" w:cs="DTL Argo T" w:hint="eastAsia"/>
           <w:b/>
           <w:bCs/>
           <w:color w:val="45545D"/>
           <w:kern w:val="0"/>
           <w:sz w:val="40"/>
           <w:szCs w:val="40"/>
+          <w:specVanish/>
         </w:rPr>
       </w:pPr>
       <w:r>
@@ -1922,6 +1875,7 @@
           <w:kern w:val="0"/>
           <w:sz w:val="40"/>
           <w:szCs w:val="40"/>
+          <w:specVanish/>
         </w:rPr>
         <w:t>已知问题</w:t>
       </w:r>
@@ -1929,7 +1883,7 @@
     <w:p>
       <w:pPr>
         <w:rPr>
-          <w:rFonts w:ascii="宋体" w:eastAsia="宋体" w:hAnsi="宋体"/>
+          <w:rFonts w:ascii="宋体" w:eastAsia="宋体" w:hAnsi="宋体" w:hint="eastAsia"/>
         </w:rPr>
       </w:pPr>
       <w:r>
@@ -1956,7 +1910,7 @@
     <w:p>
       <w:pPr>
         <w:rPr>
-          <w:rFonts w:ascii="宋体" w:eastAsia="宋体" w:hAnsi="宋体"/>
+          <w:rFonts w:ascii="宋体" w:eastAsia="宋体" w:hAnsi="宋体" w:hint="eastAsia"/>
         </w:rPr>
       </w:pPr>
     </w:p>
@@ -1965,7 +1919,7 @@
         <w:widowControl/>
         <w:jc w:val="left"/>
         <w:rPr>
-          <w:rFonts w:ascii="宋体" w:eastAsia="宋体" w:hAnsi="宋体" w:cs="DTL Argo T"/>
+          <w:rFonts w:ascii="宋体" w:eastAsia="宋体" w:hAnsi="宋体" w:cs="DTL Argo T" w:hint="eastAsia"/>
           <w:b/>
           <w:bCs/>
           <w:color w:val="45545D"/>
@@ -1996,7 +1950,7 @@
         <w:ind w:right="-58"/>
         <w:jc w:val="center"/>
         <w:rPr>
-          <w:rFonts w:ascii="宋体" w:eastAsia="宋体" w:hAnsi="宋体" w:cs="DTL Argo T"/>
+          <w:rFonts w:ascii="宋体" w:eastAsia="宋体" w:hAnsi="宋体" w:cs="DTL Argo T" w:hint="eastAsia"/>
           <w:b/>
           <w:bCs/>
           <w:color w:val="45545D"/>
@@ -2014,19 +1968,27 @@
           <w:kern w:val="0"/>
           <w:sz w:val="40"/>
           <w:szCs w:val="40"/>
+          <w:specVanish/>
         </w:rPr>
         <w:lastRenderedPageBreak/>
         <w:t>季度阀门状况状态</w:t>
       </w:r>
     </w:p>
-    <w:p/>
-    <w:p>
-      <w:pPr>
-        <w:pStyle w:val="a3"/>
+    <w:p>
+      <w:pPr>
+        <w:rPr>
+          <w:rFonts w:hint="eastAsia"/>
+          <w:specVanish/>
+        </w:rPr>
+      </w:pPr>
+    </w:p>
+    <w:p>
+      <w:pPr>
+        <w:pStyle w:val="af4"/>
         <w:spacing w:before="11"/>
         <w:ind w:right="1440"/>
         <w:rPr>
-          <w:rFonts w:ascii="宋体" w:eastAsia="宋体" w:hAnsi="宋体" w:cs="DTL Argo T"/>
+          <w:rFonts w:ascii="宋体" w:eastAsia="宋体" w:hAnsi="宋体" w:cs="DTL Argo T" w:hint="eastAsia"/>
           <w:b/>
           <w:bCs/>
           <w:sz w:val="18"/>
@@ -2045,7 +2007,7 @@
         <mc:AlternateContent>
           <mc:Choice Requires="wps">
             <w:drawing>
-              <wp:anchor distT="0" distB="0" distL="0" distR="0" simplePos="0" relativeHeight="251664384" behindDoc="0" locked="0" layoutInCell="0" allowOverlap="1" wp14:anchorId="0C9B1123" wp14:editId="33ED2509">
+              <wp:anchor distT="0" distB="0" distL="0" distR="0" simplePos="0" relativeHeight="251666432" behindDoc="0" locked="0" layoutInCell="0" allowOverlap="1" wp14:anchorId="43931490" wp14:editId="7C889FF1">
                 <wp:simplePos x="0" y="0"/>
                 <wp:positionH relativeFrom="margin">
                   <wp:align>left</wp:align>
@@ -2057,11 +2019,15 @@
                 <wp:effectExtent l="0" t="0" r="0" b="0"/>
                 <wp:wrapTopAndBottom/>
                 <wp:docPr id="233" name="Freeform 53"/>
-                <wp:cNvGraphicFramePr/>
+                <wp:cNvGraphicFramePr>
+                  <a:graphicFrameLocks xmlns:a="http://schemas.openxmlformats.org/drawingml/2006/main"/>
+                </wp:cNvGraphicFramePr>
                 <a:graphic xmlns:a="http://schemas.openxmlformats.org/drawingml/2006/main">
                   <a:graphicData uri="http://schemas.microsoft.com/office/word/2010/wordprocessingShape">
                     <wps:wsp>
-                      <wps:cNvSpPr/>
+                      <wps:cNvSpPr>
+                        <a:spLocks/>
+                      </wps:cNvSpPr>
                       <wps:spPr bwMode="auto">
                         <a:xfrm>
                           <a:off x="0" y="0"/>
@@ -2102,7 +2068,18 @@
                             <a:srgbClr val="9FA1A4"/>
                           </a:solidFill>
                           <a:round/>
+                          <a:headEnd/>
+                          <a:tailEnd/>
                         </a:ln>
+                        <a:extLst>
+                          <a:ext uri="{909E8E84-426E-40DD-AFC4-6F175D3DCCD1}">
+                            <a14:hiddenFill xmlns:a14="http://schemas.microsoft.com/office/drawing/2010/main">
+                              <a:solidFill>
+                                <a:srgbClr val="FFFFFF"/>
+                              </a:solidFill>
+                            </a14:hiddenFill>
+                          </a:ext>
+                        </a:extLst>
                       </wps:spPr>
                       <wps:bodyPr rot="0" vert="horz" wrap="square" lIns="91440" tIns="45720" rIns="91440" bIns="45720" anchor="t" anchorCtr="0" upright="1">
                         <a:noAutofit/>
@@ -2110,18 +2087,20 @@
                     </wps:wsp>
                   </a:graphicData>
                 </a:graphic>
+                <wp14:sizeRelH relativeFrom="page">
+                  <wp14:pctWidth>0</wp14:pctWidth>
+                </wp14:sizeRelH>
+                <wp14:sizeRelV relativeFrom="page">
+                  <wp14:pctHeight>0</wp14:pctHeight>
+                </wp14:sizeRelV>
               </wp:anchor>
             </w:drawing>
           </mc:Choice>
-          <mc:Fallback xmlns:wpsCustomData="http://www.wps.cn/officeDocument/2013/wpsCustomData">
+          <mc:Fallback>
             <w:pict>
-              <v:shape id="Freeform 53" o:spid="_x0000_s1026" o:spt="100" style="position:absolute;left:0pt;margin-top:1.15pt;height:0pt;width:477pt;mso-position-horizontal:left;mso-position-horizontal-relative:margin;mso-wrap-distance-bottom:0pt;mso-wrap-distance-top:0pt;z-index:251664384;mso-width-relative:page;mso-height-relative:page;" filled="f" stroked="t" coordsize="9540,20" o:allowincell="f" o:gfxdata="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" path="m0,0l9540,0e">
-                <v:path o:connectlocs="0,0;6057900,0" o:connectangles="0,0"/>
-                <v:fill on="f" focussize="0,0"/>
-                <v:stroke weight="1pt" color="#9FA1A4" joinstyle="round"/>
-                <v:imagedata o:title=""/>
-                <o:lock v:ext="edit" aspectratio="f"/>
-                <w10:wrap type="topAndBottom"/>
+              <v:shape w14:anchorId="0CF7E274" id="Freeform 53" o:spid="_x0000_s1026" style="position:absolute;margin-left:0;margin-top:1.15pt;width:477pt;height:0;z-index:251666432;visibility:visible;mso-wrap-style:square;mso-width-percent:0;mso-height-percent:0;mso-wrap-distance-left:0;mso-wrap-distance-top:0;mso-wrap-distance-right:0;mso-wrap-distance-bottom:0;mso-position-horizontal:left;mso-position-horizontal-relative:margin;mso-position-vertical:absolute;mso-position-vertical-relative:text;mso-width-percent:0;mso-height-percent:0;mso-width-relative:page;mso-height-relative:page;v-text-anchor:top" coordsize="9540,20" o:gfxdata="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" o:allowincell="f" path="m,l9540,e" filled="f" strokecolor="#9fa1a4" strokeweight="1pt">
+                <v:path arrowok="t" o:connecttype="custom" o:connectlocs="0,0;6057900,0" o:connectangles="0,0"/>
+                <w10:wrap type="topAndBottom" anchorx="margin"/>
               </v:shape>
             </w:pict>
           </mc:Fallback>
@@ -2130,9 +2109,9 @@
     </w:p>
     <w:p>
       <w:pPr>
-        <w:jc w:val="left"/>
-        <w:rPr>
-          <w:rFonts w:ascii="宋体" w:eastAsia="宋体" w:hAnsi="宋体"/>
+        <w:jc w:val="center"/>
+        <w:rPr>
+          <w:rFonts w:ascii="宋体" w:eastAsia="宋体" w:hAnsi="宋体" w:hint="eastAsia"/>
         </w:rPr>
       </w:pPr>
       <w:r>
@@ -2159,14 +2138,14 @@
     <w:p>
       <w:pPr>
         <w:rPr>
-          <w:rFonts w:ascii="宋体" w:eastAsia="宋体" w:hAnsi="宋体"/>
-        </w:rPr>
-      </w:pPr>
-    </w:p>
-    <w:p>
-      <w:pPr>
-        <w:rPr>
-          <w:rFonts w:ascii="宋体" w:eastAsia="宋体" w:hAnsi="宋体"/>
+          <w:rFonts w:ascii="宋体" w:eastAsia="宋体" w:hAnsi="宋体" w:hint="eastAsia"/>
+        </w:rPr>
+      </w:pPr>
+    </w:p>
+    <w:p>
+      <w:pPr>
+        <w:rPr>
+          <w:rFonts w:ascii="宋体" w:eastAsia="宋体" w:hAnsi="宋体" w:hint="eastAsia"/>
         </w:rPr>
       </w:pPr>
       <w:r>
@@ -2179,7 +2158,7 @@
     <w:p>
       <w:pPr>
         <w:rPr>
-          <w:rFonts w:ascii="宋体" w:eastAsia="宋体" w:hAnsi="宋体"/>
+          <w:rFonts w:ascii="宋体" w:eastAsia="宋体" w:hAnsi="宋体" w:hint="eastAsia"/>
         </w:rPr>
       </w:pPr>
     </w:p>
@@ -2188,7 +2167,7 @@
         <w:widowControl/>
         <w:jc w:val="left"/>
         <w:rPr>
-          <w:rFonts w:ascii="宋体" w:eastAsia="宋体" w:hAnsi="宋体" w:cs="DTL Argo T"/>
+          <w:rFonts w:ascii="宋体" w:eastAsia="宋体" w:hAnsi="宋体" w:cs="DTL Argo T" w:hint="eastAsia"/>
           <w:b/>
           <w:bCs/>
           <w:color w:val="45545D"/>
@@ -2219,7 +2198,7 @@
         <w:ind w:right="-58"/>
         <w:jc w:val="center"/>
         <w:rPr>
-          <w:rFonts w:ascii="宋体" w:eastAsia="宋体" w:hAnsi="宋体" w:cs="DTL Argo T"/>
+          <w:rFonts w:ascii="宋体" w:eastAsia="宋体" w:hAnsi="宋体" w:cs="DTL Argo T" w:hint="eastAsia"/>
           <w:b/>
           <w:bCs/>
           <w:color w:val="45545D"/>
@@ -2242,19 +2221,11 @@
         <w:t>阀门健康趋势</w:t>
       </w:r>
     </w:p>
-    <w:p/>
-    <w:p>
-      <w:pPr>
-        <w:pStyle w:val="a3"/>
-        <w:spacing w:before="11"/>
-        <w:ind w:right="1440"/>
-        <w:rPr>
-          <w:rFonts w:ascii="宋体" w:eastAsia="宋体" w:hAnsi="宋体" w:cs="DTL Argo T"/>
-          <w:b/>
-          <w:bCs/>
-          <w:sz w:val="18"/>
-          <w:szCs w:val="18"/>
-          <w:lang w:eastAsia="zh-CN"/>
+    <w:p>
+      <w:pPr>
+        <w:rPr>
+          <w:rFonts w:hint="eastAsia"/>
+          <w:specVanish/>
         </w:rPr>
       </w:pPr>
       <w:r>
@@ -2263,32 +2234,35 @@
           <w:noProof/>
           <w:sz w:val="44"/>
           <w:szCs w:val="44"/>
-          <w:lang w:eastAsia="zh-CN"/>
         </w:rPr>
         <mc:AlternateContent>
           <mc:Choice Requires="wps">
             <w:drawing>
-              <wp:anchor distT="0" distB="0" distL="0" distR="0" simplePos="0" relativeHeight="251665408" behindDoc="0" locked="0" layoutInCell="0" allowOverlap="1" wp14:anchorId="2BB2A263" wp14:editId="7F0C7AD1">
+              <wp:anchor distT="0" distB="0" distL="0" distR="0" simplePos="0" relativeHeight="251668480" behindDoc="0" locked="0" layoutInCell="0" allowOverlap="1" wp14:anchorId="52F2A4F4" wp14:editId="3DC90D18">
                 <wp:simplePos x="0" y="0"/>
                 <wp:positionH relativeFrom="margin">
-                  <wp:align>left</wp:align>
+                  <wp:posOffset>36195</wp:posOffset>
                 </wp:positionH>
                 <wp:positionV relativeFrom="paragraph">
-                  <wp:posOffset>14605</wp:posOffset>
+                  <wp:posOffset>222885</wp:posOffset>
                 </wp:positionV>
-                <wp:extent cx="6057900" cy="0"/>
+                <wp:extent cx="5220970" cy="45085"/>
                 <wp:effectExtent l="0" t="0" r="0" b="0"/>
                 <wp:wrapTopAndBottom/>
                 <wp:docPr id="71" name="Freeform 53"/>
-                <wp:cNvGraphicFramePr/>
+                <wp:cNvGraphicFramePr>
+                  <a:graphicFrameLocks xmlns:a="http://schemas.openxmlformats.org/drawingml/2006/main"/>
+                </wp:cNvGraphicFramePr>
                 <a:graphic xmlns:a="http://schemas.openxmlformats.org/drawingml/2006/main">
                   <a:graphicData uri="http://schemas.microsoft.com/office/word/2010/wordprocessingShape">
                     <wps:wsp>
-                      <wps:cNvSpPr/>
+                      <wps:cNvSpPr>
+                        <a:spLocks/>
+                      </wps:cNvSpPr>
                       <wps:spPr bwMode="auto">
                         <a:xfrm>
                           <a:off x="0" y="0"/>
-                          <a:ext cx="6057900" cy="0"/>
+                          <a:ext cx="5220970" cy="45085"/>
                         </a:xfrm>
                         <a:custGeom>
                           <a:avLst/>
@@ -2325,7 +2299,18 @@
                             <a:srgbClr val="9FA1A4"/>
                           </a:solidFill>
                           <a:round/>
+                          <a:headEnd/>
+                          <a:tailEnd/>
                         </a:ln>
+                        <a:extLst>
+                          <a:ext uri="{909E8E84-426E-40DD-AFC4-6F175D3DCCD1}">
+                            <a14:hiddenFill xmlns:a14="http://schemas.microsoft.com/office/drawing/2010/main">
+                              <a:solidFill>
+                                <a:srgbClr val="FFFFFF"/>
+                              </a:solidFill>
+                            </a14:hiddenFill>
+                          </a:ext>
+                        </a:extLst>
                       </wps:spPr>
                       <wps:bodyPr rot="0" vert="horz" wrap="square" lIns="91440" tIns="45720" rIns="91440" bIns="45720" anchor="t" anchorCtr="0" upright="1">
                         <a:noAutofit/>
@@ -2333,18 +2318,20 @@
                     </wps:wsp>
                   </a:graphicData>
                 </a:graphic>
+                <wp14:sizeRelH relativeFrom="page">
+                  <wp14:pctWidth>0</wp14:pctWidth>
+                </wp14:sizeRelH>
+                <wp14:sizeRelV relativeFrom="page">
+                  <wp14:pctHeight>0</wp14:pctHeight>
+                </wp14:sizeRelV>
               </wp:anchor>
             </w:drawing>
           </mc:Choice>
-          <mc:Fallback xmlns:wpsCustomData="http://www.wps.cn/officeDocument/2013/wpsCustomData">
+          <mc:Fallback>
             <w:pict>
-              <v:shape id="Freeform 53" o:spid="_x0000_s1026" o:spt="100" style="position:absolute;left:0pt;margin-top:1.15pt;height:0pt;width:477pt;mso-position-horizontal:left;mso-position-horizontal-relative:margin;mso-wrap-distance-bottom:0pt;mso-wrap-distance-top:0pt;z-index:251665408;mso-width-relative:page;mso-height-relative:page;" filled="f" stroked="t" coordsize="9540,20" o:allowincell="f" o:gfxdata="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" path="m0,0l9540,0e">
-                <v:path o:connectlocs="0,0;6057900,0" o:connectangles="0,0"/>
-                <v:fill on="f" focussize="0,0"/>
-                <v:stroke weight="1pt" color="#9FA1A4" joinstyle="round"/>
-                <v:imagedata o:title=""/>
-                <o:lock v:ext="edit" aspectratio="f"/>
-                <w10:wrap type="topAndBottom"/>
+              <v:shape w14:anchorId="37AFBA86" id="Freeform 53" o:spid="_x0000_s1026" style="position:absolute;margin-left:2.85pt;margin-top:17.55pt;width:411.1pt;height:3.55pt;z-index:251668480;visibility:visible;mso-wrap-style:square;mso-width-percent:0;mso-height-percent:0;mso-wrap-distance-left:0;mso-wrap-distance-top:0;mso-wrap-distance-right:0;mso-wrap-distance-bottom:0;mso-position-horizontal:absolute;mso-position-horizontal-relative:margin;mso-position-vertical:absolute;mso-position-vertical-relative:text;mso-width-percent:0;mso-height-percent:0;mso-width-relative:page;mso-height-relative:page;v-text-anchor:top" coordsize="9540,20" o:gfxdata="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" o:allowincell="f" path="m,l9540,e" filled="f" strokecolor="#9fa1a4" strokeweight="1pt">
+                <v:path arrowok="t" o:connecttype="custom" o:connectlocs="0,0;5220970,0" o:connectangles="0,0"/>
+                <w10:wrap type="topAndBottom" anchorx="margin"/>
               </v:shape>
             </w:pict>
           </mc:Fallback>
@@ -2353,9 +2340,24 @@
     </w:p>
     <w:p>
       <w:pPr>
+        <w:pStyle w:val="af4"/>
+        <w:spacing w:before="11"/>
+        <w:ind w:right="1440"/>
+        <w:rPr>
+          <w:rFonts w:ascii="宋体" w:eastAsia="宋体" w:hAnsi="宋体" w:cs="DTL Argo T" w:hint="eastAsia"/>
+          <w:b/>
+          <w:bCs/>
+          <w:sz w:val="18"/>
+          <w:szCs w:val="18"/>
+          <w:lang w:eastAsia="zh-CN"/>
+        </w:rPr>
+      </w:pPr>
+    </w:p>
+    <w:p>
+      <w:pPr>
         <w:jc w:val="left"/>
         <w:rPr>
-          <w:rFonts w:ascii="宋体" w:eastAsia="宋体" w:hAnsi="宋体"/>
+          <w:rFonts w:ascii="宋体" w:eastAsia="宋体" w:hAnsi="宋体" w:hint="eastAsia"/>
         </w:rPr>
       </w:pPr>
       <w:r>
@@ -2382,27 +2384,33 @@
     <w:p>
       <w:pPr>
         <w:rPr>
-          <w:rFonts w:ascii="宋体" w:eastAsia="宋体" w:hAnsi="宋体"/>
-        </w:rPr>
-      </w:pPr>
-    </w:p>
-    <w:p>
-      <w:pPr>
-        <w:rPr>
-          <w:rFonts w:ascii="宋体" w:eastAsia="宋体" w:hAnsi="宋体"/>
-        </w:rPr>
-      </w:pPr>
-      <w:r>
-        <w:rPr>
-          <w:rFonts w:ascii="宋体" w:eastAsia="宋体" w:hAnsi="宋体" w:hint="eastAsia"/>
-        </w:rPr>
-        <w:t>数据展示：各个阀门的健康评分趋势</w:t>
-      </w:r>
-    </w:p>
-    <w:p>
-      <w:pPr>
-        <w:rPr>
-          <w:rFonts w:ascii="宋体" w:eastAsia="宋体" w:hAnsi="宋体"/>
+          <w:rFonts w:ascii="宋体" w:eastAsia="宋体" w:hAnsi="宋体" w:hint="eastAsia"/>
+        </w:rPr>
+      </w:pPr>
+    </w:p>
+    <w:p>
+      <w:pPr>
+        <w:rPr>
+          <w:rFonts w:ascii="宋体" w:eastAsia="宋体" w:hAnsi="宋体" w:hint="eastAsia"/>
+        </w:rPr>
+      </w:pPr>
+      <w:r>
+        <w:rPr>
+          <w:rFonts w:ascii="宋体" w:eastAsia="宋体" w:hAnsi="宋体" w:hint="eastAsia"/>
+        </w:rPr>
+        <w:t>数据展示：各个阀门的健康评分</w:t>
+      </w:r>
+      <w:r>
+        <w:rPr>
+          <w:rFonts w:ascii="宋体" w:eastAsia="宋体" w:hAnsi="宋体" w:hint="eastAsia"/>
+        </w:rPr>
+        <w:t>趋势</w:t>
+      </w:r>
+    </w:p>
+    <w:p>
+      <w:pPr>
+        <w:rPr>
+          <w:rFonts w:ascii="宋体" w:eastAsia="宋体" w:hAnsi="宋体" w:hint="eastAsia"/>
         </w:rPr>
       </w:pPr>
     </w:p>
@@ -2411,7 +2419,7 @@
         <w:widowControl/>
         <w:jc w:val="left"/>
         <w:rPr>
-          <w:rFonts w:ascii="宋体" w:eastAsia="宋体" w:hAnsi="宋体" w:cs="DTL Argo T"/>
+          <w:rFonts w:ascii="宋体" w:eastAsia="宋体" w:hAnsi="宋体" w:cs="DTL Argo T" w:hint="eastAsia"/>
           <w:b/>
           <w:bCs/>
           <w:color w:val="45545D"/>
@@ -2420,6 +2428,8 @@
           <w:szCs w:val="40"/>
         </w:rPr>
         <w:sectPr>
+          <w:footerReference w:type="default" r:id="rId9"/>
+          <w:footerReference w:type="first" r:id="rId10"/>
           <w:pgSz w:w="11906" w:h="16838"/>
           <w:pgMar w:top="1440" w:right="1800" w:bottom="1440" w:left="1800" w:header="851" w:footer="992" w:gutter="0"/>
           <w:cols w:space="425"/>
@@ -2449,13 +2459,14 @@
         <w:ind w:right="-58"/>
         <w:jc w:val="center"/>
         <w:rPr>
-          <w:rFonts w:ascii="宋体" w:eastAsia="宋体" w:hAnsi="宋体" w:cs="DTL Argo T"/>
+          <w:rFonts w:ascii="宋体" w:eastAsia="宋体" w:hAnsi="宋体" w:cs="DTL Argo T" w:hint="eastAsia"/>
           <w:b/>
           <w:bCs/>
           <w:color w:val="45545D"/>
           <w:kern w:val="0"/>
           <w:sz w:val="40"/>
           <w:szCs w:val="40"/>
+          <w:specVanish/>
         </w:rPr>
       </w:pPr>
       <w:r>
@@ -2467,6 +2478,7 @@
           <w:kern w:val="0"/>
           <w:sz w:val="40"/>
           <w:szCs w:val="40"/>
+          <w:specVanish/>
         </w:rPr>
         <w:lastRenderedPageBreak/>
         <w:t>阀门行程历史记录</w:t>
@@ -2474,24 +2486,11 @@
     </w:p>
     <w:p>
       <w:pPr>
-        <w:pStyle w:val="a3"/>
+        <w:pStyle w:val="af4"/>
         <w:spacing w:before="11"/>
         <w:ind w:right="1440"/>
         <w:rPr>
-          <w:rFonts w:ascii="宋体" w:eastAsia="宋体" w:hAnsi="宋体" w:cs="DTL Argo T"/>
-          <w:sz w:val="18"/>
-          <w:szCs w:val="18"/>
-          <w:lang w:eastAsia="zh-CN"/>
-        </w:rPr>
-      </w:pPr>
-    </w:p>
-    <w:p>
-      <w:pPr>
-        <w:pStyle w:val="a3"/>
-        <w:spacing w:before="11"/>
-        <w:ind w:right="1440"/>
-        <w:rPr>
-          <w:rFonts w:ascii="宋体" w:eastAsia="宋体" w:hAnsi="宋体" w:cs="DTL Argo T"/>
+          <w:rFonts w:ascii="宋体" w:eastAsia="宋体" w:hAnsi="宋体" w:cs="DTL Argo T" w:hint="eastAsia"/>
           <w:sz w:val="18"/>
           <w:szCs w:val="18"/>
           <w:lang w:eastAsia="zh-CN"/>
@@ -2508,27 +2507,31 @@
         <mc:AlternateContent>
           <mc:Choice Requires="wps">
             <w:drawing>
-              <wp:anchor distT="0" distB="0" distL="0" distR="0" simplePos="0" relativeHeight="251667456" behindDoc="0" locked="0" layoutInCell="0" allowOverlap="1" wp14:anchorId="1CD08F60" wp14:editId="08191BA3">
+              <wp:anchor distT="0" distB="0" distL="0" distR="0" simplePos="0" relativeHeight="251678720" behindDoc="0" locked="0" layoutInCell="0" allowOverlap="1" wp14:anchorId="49E117D4" wp14:editId="780A4548">
                 <wp:simplePos x="0" y="0"/>
                 <wp:positionH relativeFrom="margin">
-                  <wp:align>left</wp:align>
+                  <wp:posOffset>12065</wp:posOffset>
                 </wp:positionH>
                 <wp:positionV relativeFrom="paragraph">
-                  <wp:posOffset>14605</wp:posOffset>
+                  <wp:posOffset>184150</wp:posOffset>
                 </wp:positionV>
-                <wp:extent cx="6057900" cy="0"/>
+                <wp:extent cx="5277485" cy="35560"/>
                 <wp:effectExtent l="0" t="0" r="0" b="0"/>
                 <wp:wrapTopAndBottom/>
                 <wp:docPr id="9" name="Freeform 53"/>
-                <wp:cNvGraphicFramePr/>
+                <wp:cNvGraphicFramePr>
+                  <a:graphicFrameLocks xmlns:a="http://schemas.openxmlformats.org/drawingml/2006/main"/>
+                </wp:cNvGraphicFramePr>
                 <a:graphic xmlns:a="http://schemas.openxmlformats.org/drawingml/2006/main">
                   <a:graphicData uri="http://schemas.microsoft.com/office/word/2010/wordprocessingShape">
                     <wps:wsp>
-                      <wps:cNvSpPr/>
+                      <wps:cNvSpPr>
+                        <a:spLocks/>
+                      </wps:cNvSpPr>
                       <wps:spPr bwMode="auto">
                         <a:xfrm>
                           <a:off x="0" y="0"/>
-                          <a:ext cx="6057900" cy="0"/>
+                          <a:ext cx="5277485" cy="35560"/>
                         </a:xfrm>
                         <a:custGeom>
                           <a:avLst/>
@@ -2565,7 +2568,18 @@
                             <a:srgbClr val="9FA1A4"/>
                           </a:solidFill>
                           <a:round/>
+                          <a:headEnd/>
+                          <a:tailEnd/>
                         </a:ln>
+                        <a:extLst>
+                          <a:ext uri="{909E8E84-426E-40DD-AFC4-6F175D3DCCD1}">
+                            <a14:hiddenFill xmlns:a14="http://schemas.microsoft.com/office/drawing/2010/main">
+                              <a:solidFill>
+                                <a:srgbClr val="FFFFFF"/>
+                              </a:solidFill>
+                            </a14:hiddenFill>
+                          </a:ext>
+                        </a:extLst>
                       </wps:spPr>
                       <wps:bodyPr rot="0" vert="horz" wrap="square" lIns="91440" tIns="45720" rIns="91440" bIns="45720" anchor="t" anchorCtr="0" upright="1">
                         <a:noAutofit/>
@@ -2573,18 +2587,20 @@
                     </wps:wsp>
                   </a:graphicData>
                 </a:graphic>
+                <wp14:sizeRelH relativeFrom="page">
+                  <wp14:pctWidth>0</wp14:pctWidth>
+                </wp14:sizeRelH>
+                <wp14:sizeRelV relativeFrom="page">
+                  <wp14:pctHeight>0</wp14:pctHeight>
+                </wp14:sizeRelV>
               </wp:anchor>
             </w:drawing>
           </mc:Choice>
-          <mc:Fallback xmlns:wpsCustomData="http://www.wps.cn/officeDocument/2013/wpsCustomData">
+          <mc:Fallback>
             <w:pict>
-              <v:shape id="Freeform 53" o:spid="_x0000_s1026" o:spt="100" style="position:absolute;left:0pt;margin-top:1.15pt;height:0pt;width:477pt;mso-position-horizontal:left;mso-position-horizontal-relative:margin;mso-wrap-distance-bottom:0pt;mso-wrap-distance-top:0pt;z-index:251667456;mso-width-relative:page;mso-height-relative:page;" filled="f" stroked="t" coordsize="9540,20" o:allowincell="f" o:gfxdata="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" path="m0,0l9540,0e">
-                <v:path o:connectlocs="0,0;6057900,0" o:connectangles="0,0"/>
-                <v:fill on="f" focussize="0,0"/>
-                <v:stroke weight="1pt" color="#9FA1A4" joinstyle="round"/>
-                <v:imagedata o:title=""/>
-                <o:lock v:ext="edit" aspectratio="f"/>
-                <w10:wrap type="topAndBottom"/>
+              <v:shape w14:anchorId="505C092B" id="Freeform 53" o:spid="_x0000_s1026" style="position:absolute;margin-left:.95pt;margin-top:14.5pt;width:415.55pt;height:2.8pt;z-index:251678720;visibility:visible;mso-wrap-style:square;mso-width-percent:0;mso-height-percent:0;mso-wrap-distance-left:0;mso-wrap-distance-top:0;mso-wrap-distance-right:0;mso-wrap-distance-bottom:0;mso-position-horizontal:absolute;mso-position-horizontal-relative:margin;mso-position-vertical:absolute;mso-position-vertical-relative:text;mso-width-percent:0;mso-height-percent:0;mso-width-relative:page;mso-height-relative:page;v-text-anchor:top" coordsize="9540,20" o:gfxdata="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" o:allowincell="f" path="m,l9540,e" filled="f" strokecolor="#9fa1a4" strokeweight="1pt">
+                <v:path arrowok="t" o:connecttype="custom" o:connectlocs="0,0;5277485,0" o:connectangles="0,0"/>
+                <w10:wrap type="topAndBottom" anchorx="margin"/>
               </v:shape>
             </w:pict>
           </mc:Fallback>
@@ -2593,10 +2609,23 @@
     </w:p>
     <w:p>
       <w:pPr>
+        <w:pStyle w:val="af4"/>
+        <w:spacing w:before="11"/>
+        <w:ind w:right="1440"/>
+        <w:rPr>
+          <w:rFonts w:ascii="宋体" w:eastAsia="宋体" w:hAnsi="宋体" w:cs="DTL Argo T" w:hint="eastAsia"/>
+          <w:sz w:val="18"/>
+          <w:szCs w:val="18"/>
+          <w:lang w:eastAsia="zh-CN"/>
+        </w:rPr>
+      </w:pPr>
+    </w:p>
+    <w:p>
+      <w:pPr>
         <w:widowControl/>
         <w:jc w:val="left"/>
         <w:rPr>
-          <w:rFonts w:ascii="宋体" w:eastAsia="宋体" w:hAnsi="宋体" w:cs="DTL Argo T"/>
+          <w:rFonts w:ascii="宋体" w:eastAsia="宋体" w:hAnsi="宋体" w:cs="DTL Argo T" w:hint="eastAsia"/>
           <w:b/>
           <w:bCs/>
           <w:color w:val="45545D"/>
@@ -2631,7 +2660,7 @@
         <w:widowControl/>
         <w:jc w:val="left"/>
         <w:rPr>
-          <w:rFonts w:ascii="宋体" w:eastAsia="宋体" w:hAnsi="宋体" w:cs="DTL Argo T"/>
+          <w:rFonts w:ascii="宋体" w:eastAsia="宋体" w:hAnsi="宋体" w:cs="DTL Argo T" w:hint="eastAsia"/>
           <w:b/>
           <w:bCs/>
           <w:color w:val="45545D"/>
@@ -2646,7 +2675,7 @@
         <w:widowControl/>
         <w:jc w:val="left"/>
         <w:rPr>
-          <w:rFonts w:ascii="宋体" w:eastAsia="宋体" w:hAnsi="宋体" w:cs="DTL Argo T"/>
+          <w:rFonts w:ascii="宋体" w:eastAsia="宋体" w:hAnsi="宋体" w:cs="DTL Argo T" w:hint="eastAsia"/>
           <w:b/>
           <w:bCs/>
           <w:color w:val="45545D"/>
@@ -2654,6 +2683,13 @@
           <w:sz w:val="40"/>
           <w:szCs w:val="40"/>
         </w:rPr>
+        <w:sectPr>
+          <w:pgSz w:w="11906" w:h="16838"/>
+          <w:pgMar w:top="1440" w:right="1800" w:bottom="1440" w:left="1800" w:header="851" w:footer="992" w:gutter="0"/>
+          <w:cols w:space="425"/>
+          <w:titlePg/>
+          <w:docGrid w:type="lines" w:linePitch="312"/>
+        </w:sectPr>
       </w:pPr>
       <w:r>
         <w:rPr>
@@ -2667,6 +2703,13 @@
         </w:rPr>
         <w:br w:type="page"/>
       </w:r>
+    </w:p>
+    <w:p>
+      <w:pPr>
+        <w:rPr>
+          <w:rFonts w:hint="eastAsia"/>
+        </w:rPr>
+      </w:pPr>
     </w:p>
     <w:p>
       <w:pPr>
@@ -2677,7 +2720,7 @@
         <w:ind w:right="-58"/>
         <w:jc w:val="center"/>
         <w:rPr>
-          <w:rFonts w:ascii="宋体" w:eastAsia="宋体" w:hAnsi="宋体" w:cs="DTL Argo T"/>
+          <w:rFonts w:ascii="宋体" w:eastAsia="宋体" w:hAnsi="宋体" w:cs="DTL Argo T" w:hint="eastAsia"/>
           <w:b/>
           <w:bCs/>
           <w:color w:val="45545D"/>
@@ -2695,36 +2738,18 @@
           <w:kern w:val="0"/>
           <w:sz w:val="40"/>
           <w:szCs w:val="40"/>
-        </w:rPr>
-        <w:lastRenderedPageBreak/>
-        <w:t>周期计数</w:t>
-      </w:r>
-      <w:r>
-        <w:rPr>
-          <w:rFonts w:ascii="宋体" w:eastAsia="宋体" w:hAnsi="宋体" w:cs="DTL Argo T" w:hint="eastAsia"/>
-          <w:b/>
-          <w:bCs/>
-          <w:color w:val="45545D"/>
-          <w:kern w:val="0"/>
-          <w:sz w:val="40"/>
-          <w:szCs w:val="40"/>
-        </w:rPr>
-        <w:t>/</w:t>
-      </w:r>
-      <w:r>
-        <w:rPr>
-          <w:rFonts w:ascii="宋体" w:eastAsia="宋体" w:hAnsi="宋体" w:cs="DTL Argo T" w:hint="eastAsia"/>
-          <w:b/>
-          <w:bCs/>
-          <w:color w:val="45545D"/>
-          <w:kern w:val="0"/>
-          <w:sz w:val="40"/>
-          <w:szCs w:val="40"/>
-        </w:rPr>
-        <w:t>行程百分比累积</w:t>
-      </w:r>
-    </w:p>
-    <w:p>
+          <w:specVanish/>
+        </w:rPr>
+        <w:t>周期计数/行程百分比累积</w:t>
+      </w:r>
+    </w:p>
+    <w:p>
+      <w:pPr>
+        <w:rPr>
+          <w:rFonts w:hint="eastAsia"/>
+          <w:specVanish/>
+        </w:rPr>
+      </w:pPr>
       <w:r>
         <w:rPr>
           <w:rFonts w:ascii="宋体" w:eastAsia="宋体" w:hAnsi="宋体"/>
@@ -2735,7 +2760,7 @@
         <mc:AlternateContent>
           <mc:Choice Requires="wps">
             <w:drawing>
-              <wp:anchor distT="0" distB="0" distL="0" distR="0" simplePos="0" relativeHeight="251666432" behindDoc="0" locked="0" layoutInCell="0" allowOverlap="1" wp14:anchorId="4645F3D0" wp14:editId="04A743DD">
+              <wp:anchor distT="0" distB="0" distL="0" distR="0" simplePos="0" relativeHeight="251676672" behindDoc="0" locked="0" layoutInCell="0" allowOverlap="1" wp14:anchorId="10E1F12D" wp14:editId="1C82E841">
                 <wp:simplePos x="0" y="0"/>
                 <wp:positionH relativeFrom="margin">
                   <wp:align>right</wp:align>
@@ -2747,11 +2772,15 @@
                 <wp:effectExtent l="0" t="0" r="0" b="0"/>
                 <wp:wrapTopAndBottom/>
                 <wp:docPr id="75" name="Freeform 53"/>
-                <wp:cNvGraphicFramePr/>
+                <wp:cNvGraphicFramePr>
+                  <a:graphicFrameLocks xmlns:a="http://schemas.openxmlformats.org/drawingml/2006/main"/>
+                </wp:cNvGraphicFramePr>
                 <a:graphic xmlns:a="http://schemas.openxmlformats.org/drawingml/2006/main">
                   <a:graphicData uri="http://schemas.microsoft.com/office/word/2010/wordprocessingShape">
                     <wps:wsp>
-                      <wps:cNvSpPr/>
+                      <wps:cNvSpPr>
+                        <a:spLocks/>
+                      </wps:cNvSpPr>
                       <wps:spPr bwMode="auto">
                         <a:xfrm flipV="1">
                           <a:off x="0" y="0"/>
@@ -2792,7 +2821,18 @@
                             <a:srgbClr val="9FA1A4"/>
                           </a:solidFill>
                           <a:round/>
+                          <a:headEnd/>
+                          <a:tailEnd/>
                         </a:ln>
+                        <a:extLst>
+                          <a:ext uri="{909E8E84-426E-40DD-AFC4-6F175D3DCCD1}">
+                            <a14:hiddenFill xmlns:a14="http://schemas.microsoft.com/office/drawing/2010/main">
+                              <a:solidFill>
+                                <a:srgbClr val="FFFFFF"/>
+                              </a:solidFill>
+                            </a14:hiddenFill>
+                          </a:ext>
+                        </a:extLst>
                       </wps:spPr>
                       <wps:bodyPr rot="0" vert="horz" wrap="square" lIns="91440" tIns="45720" rIns="91440" bIns="45720" anchor="t" anchorCtr="0" upright="1">
                         <a:noAutofit/>
@@ -2800,18 +2840,20 @@
                     </wps:wsp>
                   </a:graphicData>
                 </a:graphic>
+                <wp14:sizeRelH relativeFrom="page">
+                  <wp14:pctWidth>0</wp14:pctWidth>
+                </wp14:sizeRelH>
+                <wp14:sizeRelV relativeFrom="page">
+                  <wp14:pctHeight>0</wp14:pctHeight>
+                </wp14:sizeRelV>
               </wp:anchor>
             </w:drawing>
           </mc:Choice>
-          <mc:Fallback xmlns:wpsCustomData="http://www.wps.cn/officeDocument/2013/wpsCustomData">
+          <mc:Fallback>
             <w:pict>
-              <v:shape id="Freeform 53" o:spid="_x0000_s1026" o:spt="100" style="position:absolute;left:0pt;flip:y;margin-top:16.85pt;height:1.2pt;width:697.2pt;mso-position-horizontal:right;mso-position-horizontal-relative:margin;mso-wrap-distance-bottom:0pt;mso-wrap-distance-top:0pt;z-index:251666432;mso-width-relative:page;mso-height-relative:page;" filled="f" stroked="t" coordsize="9540,20" o:allowincell="f" o:gfxdata="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" path="m0,0l9540,0e">
-                <v:path o:connectlocs="0,0;8854440,0" o:connectangles="0,0"/>
-                <v:fill on="f" focussize="0,0"/>
-                <v:stroke weight="1pt" color="#9FA1A4" joinstyle="round"/>
-                <v:imagedata o:title=""/>
-                <o:lock v:ext="edit" aspectratio="f"/>
-                <w10:wrap type="topAndBottom"/>
+              <v:shape w14:anchorId="2C727CB9" id="Freeform 53" o:spid="_x0000_s1026" style="position:absolute;margin-left:646pt;margin-top:16.85pt;width:697.2pt;height:1.2pt;flip:y;z-index:251676672;visibility:visible;mso-wrap-style:square;mso-width-percent:0;mso-height-percent:0;mso-wrap-distance-left:0;mso-wrap-distance-top:0;mso-wrap-distance-right:0;mso-wrap-distance-bottom:0;mso-position-horizontal:right;mso-position-horizontal-relative:margin;mso-position-vertical:absolute;mso-position-vertical-relative:text;mso-width-percent:0;mso-height-percent:0;mso-width-relative:page;mso-height-relative:page;v-text-anchor:top" coordsize="9540,20" o:gfxdata="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" o:allowincell="f" path="m,l9540,e" filled="f" strokecolor="#9fa1a4" strokeweight="1pt">
+                <v:path arrowok="t" o:connecttype="custom" o:connectlocs="0,0;8854440,0" o:connectangles="0,0"/>
+                <w10:wrap type="topAndBottom" anchorx="margin"/>
               </v:shape>
             </w:pict>
           </mc:Fallback>
@@ -2820,11 +2862,11 @@
     </w:p>
     <w:p>
       <w:pPr>
-        <w:pStyle w:val="a3"/>
+        <w:pStyle w:val="af4"/>
         <w:spacing w:before="11"/>
         <w:ind w:right="1440"/>
         <w:rPr>
-          <w:rFonts w:ascii="宋体" w:eastAsia="宋体" w:hAnsi="宋体" w:cs="DTL Argo T"/>
+          <w:rFonts w:ascii="宋体" w:eastAsia="宋体" w:hAnsi="宋体" w:cs="DTL Argo T" w:hint="eastAsia"/>
           <w:sz w:val="18"/>
           <w:szCs w:val="18"/>
           <w:lang w:eastAsia="zh-CN"/>
@@ -2834,7 +2876,7 @@
     <w:p>
       <w:pPr>
         <w:rPr>
-          <w:rFonts w:ascii="宋体" w:eastAsia="宋体" w:hAnsi="宋体"/>
+          <w:rFonts w:ascii="宋体" w:eastAsia="宋体" w:hAnsi="宋体" w:hint="eastAsia"/>
         </w:rPr>
       </w:pPr>
       <w:r>
@@ -2861,14 +2903,14 @@
     <w:p>
       <w:pPr>
         <w:rPr>
-          <w:rFonts w:ascii="宋体" w:eastAsia="宋体" w:hAnsi="宋体"/>
-        </w:rPr>
-      </w:pPr>
-    </w:p>
-    <w:p>
-      <w:pPr>
-        <w:rPr>
-          <w:rFonts w:ascii="宋体" w:eastAsia="宋体" w:hAnsi="宋体"/>
+          <w:rFonts w:ascii="宋体" w:eastAsia="宋体" w:hAnsi="宋体" w:hint="eastAsia"/>
+        </w:rPr>
+      </w:pPr>
+    </w:p>
+    <w:p>
+      <w:pPr>
+        <w:rPr>
+          <w:rFonts w:ascii="宋体" w:eastAsia="宋体" w:hAnsi="宋体" w:hint="eastAsia"/>
         </w:rPr>
       </w:pPr>
     </w:p>
@@ -2877,7 +2919,7 @@
         <w:widowControl/>
         <w:jc w:val="left"/>
         <w:rPr>
-          <w:rFonts w:ascii="宋体" w:eastAsia="宋体" w:hAnsi="宋体"/>
+          <w:rFonts w:ascii="宋体" w:eastAsia="宋体" w:hAnsi="宋体" w:hint="eastAsia"/>
         </w:rPr>
         <w:sectPr>
           <w:pgSz w:w="16838" w:h="11906" w:orient="landscape"/>
@@ -2899,18 +2941,18 @@
         <w:widowControl/>
         <w:jc w:val="left"/>
         <w:rPr>
-          <w:rFonts w:ascii="宋体" w:eastAsia="宋体" w:hAnsi="宋体"/>
-        </w:rPr>
-      </w:pPr>
-    </w:p>
-    <w:p>
-      <w:pPr>
-        <w:pStyle w:val="a3"/>
+          <w:rFonts w:ascii="宋体" w:eastAsia="宋体" w:hAnsi="宋体" w:hint="eastAsia"/>
+        </w:rPr>
+      </w:pPr>
+    </w:p>
+    <w:p>
+      <w:pPr>
+        <w:pStyle w:val="af4"/>
         <w:tabs>
           <w:tab w:val="left" w:pos="10889"/>
         </w:tabs>
         <w:rPr>
-          <w:rFonts w:ascii="宋体" w:eastAsia="宋体" w:hAnsi="宋体" w:cs="DTL Argo T"/>
+          <w:rFonts w:ascii="宋体" w:eastAsia="宋体" w:hAnsi="宋体" w:cs="DTL Argo T" w:hint="eastAsia"/>
           <w:b/>
           <w:bCs/>
           <w:color w:val="43545C"/>
@@ -2953,14 +2995,14 @@
     <w:p>
       <w:pPr>
         <w:rPr>
-          <w:rFonts w:ascii="宋体" w:eastAsia="宋体" w:hAnsi="宋体"/>
-        </w:rPr>
-      </w:pPr>
-    </w:p>
-    <w:p>
-      <w:pPr>
-        <w:rPr>
-          <w:rFonts w:ascii="宋体" w:eastAsia="宋体" w:hAnsi="宋体"/>
+          <w:rFonts w:ascii="宋体" w:eastAsia="宋体" w:hAnsi="宋体" w:hint="eastAsia"/>
+        </w:rPr>
+      </w:pPr>
+    </w:p>
+    <w:p>
+      <w:pPr>
+        <w:rPr>
+          <w:rFonts w:ascii="宋体" w:eastAsia="宋体" w:hAnsi="宋体" w:hint="eastAsia"/>
         </w:rPr>
       </w:pPr>
       <w:r>
@@ -2987,7 +3029,7 @@
     <w:p>
       <w:pPr>
         <w:rPr>
-          <w:rFonts w:ascii="宋体" w:eastAsia="宋体" w:hAnsi="宋体"/>
+          <w:rFonts w:ascii="宋体" w:eastAsia="宋体" w:hAnsi="宋体" w:hint="eastAsia"/>
         </w:rPr>
       </w:pPr>
     </w:p>
@@ -2996,7 +3038,7 @@
         <w:widowControl/>
         <w:jc w:val="left"/>
         <w:rPr>
-          <w:rFonts w:ascii="宋体" w:eastAsia="宋体" w:hAnsi="宋体"/>
+          <w:rFonts w:ascii="宋体" w:eastAsia="宋体" w:hAnsi="宋体" w:hint="eastAsia"/>
         </w:rPr>
       </w:pPr>
       <w:r>
@@ -3008,12 +3050,12 @@
     </w:p>
     <w:p>
       <w:pPr>
-        <w:pStyle w:val="a3"/>
+        <w:pStyle w:val="af4"/>
         <w:tabs>
           <w:tab w:val="left" w:pos="10889"/>
         </w:tabs>
         <w:rPr>
-          <w:rFonts w:ascii="宋体" w:eastAsia="宋体" w:hAnsi="宋体" w:cs="DTL Argo T"/>
+          <w:rFonts w:ascii="宋体" w:eastAsia="宋体" w:hAnsi="宋体" w:cs="DTL Argo T" w:hint="eastAsia"/>
           <w:b/>
           <w:bCs/>
           <w:color w:val="43545C"/>
@@ -3037,7 +3079,7 @@
           <w:lang w:eastAsia="zh-CN"/>
         </w:rPr>
         <w:lastRenderedPageBreak/>
-        <w:t>总结</w:t>
+        <w:t xml:space="preserve">总结      </w:t>
       </w:r>
       <w:r>
         <w:rPr>
@@ -3051,20 +3093,20 @@
           <w:u w:val="thick" w:color="A0CF67"/>
           <w:lang w:eastAsia="zh-CN"/>
         </w:rPr>
-        <w:t xml:space="preserve">                                 </w:t>
-      </w:r>
-    </w:p>
-    <w:p>
-      <w:pPr>
-        <w:rPr>
-          <w:rFonts w:ascii="宋体" w:eastAsia="宋体" w:hAnsi="宋体"/>
-        </w:rPr>
-      </w:pPr>
-    </w:p>
-    <w:p>
-      <w:pPr>
-        <w:rPr>
-          <w:rFonts w:ascii="宋体" w:eastAsia="宋体" w:hAnsi="宋体"/>
+        <w:t xml:space="preserve">                           </w:t>
+      </w:r>
+    </w:p>
+    <w:p>
+      <w:pPr>
+        <w:rPr>
+          <w:rFonts w:ascii="宋体" w:eastAsia="宋体" w:hAnsi="宋体" w:hint="eastAsia"/>
+        </w:rPr>
+      </w:pPr>
+    </w:p>
+    <w:p>
+      <w:pPr>
+        <w:rPr>
+          <w:rFonts w:ascii="宋体" w:eastAsia="宋体" w:hAnsi="宋体" w:hint="eastAsia"/>
           <w:i/>
           <w:iCs/>
         </w:rPr>
@@ -3081,14 +3123,14 @@
     <w:p>
       <w:pPr>
         <w:rPr>
-          <w:rFonts w:ascii="宋体" w:eastAsia="宋体" w:hAnsi="宋体"/>
-        </w:rPr>
-      </w:pPr>
-    </w:p>
-    <w:p>
-      <w:pPr>
-        <w:rPr>
-          <w:rFonts w:ascii="宋体" w:eastAsia="宋体" w:hAnsi="宋体"/>
+          <w:rFonts w:ascii="宋体" w:eastAsia="宋体" w:hAnsi="宋体" w:hint="eastAsia"/>
+        </w:rPr>
+      </w:pPr>
+    </w:p>
+    <w:p>
+      <w:pPr>
+        <w:rPr>
+          <w:rFonts w:ascii="宋体" w:eastAsia="宋体" w:hAnsi="宋体" w:hint="eastAsia"/>
         </w:rPr>
       </w:pPr>
     </w:p>
@@ -3104,9 +3146,14 @@
 </file>
 
 <file path=word/endnotes.xml><?xml version="1.0" encoding="utf-8"?>
-<w:endnotes xmlns:wpc="http://schemas.microsoft.com/office/word/2010/wordprocessingCanvas" xmlns:cx="http://schemas.microsoft.com/office/drawing/2014/chartex" xmlns:cx1="http://schemas.microsoft.com/office/drawing/2015/9/8/chartex" xmlns:cx2="http://schemas.microsoft.com/office/drawing/2015/10/21/chartex" xmlns:cx3="http://schemas.microsoft.com/office/drawing/2016/5/9/chartex" xmlns:cx4="http://schemas.microsoft.com/office/drawing/2016/5/10/chartex" xmlns:cx5="http://schemas.microsoft.com/office/drawing/2016/5/11/chartex" xmlns:cx6="http://schemas.microsoft.com/office/drawing/2016/5/12/chartex" xmlns:cx7="http://schemas.microsoft.com/office/drawing/2016/5/13/chartex" xmlns:cx8="http://schemas.microsoft.com/office/drawing/2016/5/14/chartex" xmlns:mc="http://schemas.openxmlformats.org/markup-compatibility/2006" xmlns:aink="http://schemas.microsoft.com/office/drawing/2016/ink" xmlns:am3d="http://schemas.microsoft.com/office/drawing/2017/model3d" xmlns:o="urn:schemas-microsoft-com:office:office" xmlns:r="http://schemas.openxmlformats.org/officeDocument/2006/relationships" xmlns:m="http://schemas.openxmlformats.org/officeDocument/2006/math" xmlns:v="urn:schemas-microsoft-com:vml" xmlns:wp14="http://schemas.microsoft.com/office/word/2010/wordprocessingDrawing" xmlns:wp="http://schemas.openxmlformats.org/drawingml/2006/wordprocessingDrawing" xmlns:w10="urn:schemas-microsoft-com:office:word" xmlns:w="http://schemas.openxmlformats.org/wordprocessingml/2006/main" xmlns:w14="http://schemas.microsoft.com/office/word/2010/wordml" xmlns:w15="http://schemas.microsoft.com/office/word/2012/wordml" xmlns:w16cex="http://schemas.microsoft.com/office/word/2018/wordml/cex" xmlns:w16cid="http://schemas.microsoft.com/office/word/2016/wordml/cid" xmlns:w16="http://schemas.microsoft.com/office/word/2018/wordml" xmlns:w16sdtdh="http://schemas.microsoft.com/office/word/2020/wordml/sdtdatahash" xmlns:w16se="http://schemas.microsoft.com/office/word/2015/wordml/symex" xmlns:wpg="http://schemas.microsoft.com/office/word/2010/wordprocessingGroup" xmlns:wpi="http://schemas.microsoft.com/office/word/2010/wordprocessingInk" xmlns:wne="http://schemas.microsoft.com/office/word/2006/wordml" xmlns:wps="http://schemas.microsoft.com/office/word/2010/wordprocessingShape" mc:Ignorable="w14 w15 w16se w16cid w16 w16cex w16sdtdh wp14">
+<w:endnotes xmlns:wpc="http://schemas.microsoft.com/office/word/2010/wordprocessingCanvas" xmlns:cx="http://schemas.microsoft.com/office/drawing/2014/chartex" xmlns:cx1="http://schemas.microsoft.com/office/drawing/2015/9/8/chartex" xmlns:cx2="http://schemas.microsoft.com/office/drawing/2015/10/21/chartex" xmlns:cx3="http://schemas.microsoft.com/office/drawing/2016/5/9/chartex" xmlns:cx4="http://schemas.microsoft.com/office/drawing/2016/5/10/chartex" xmlns:cx5="http://schemas.microsoft.com/office/drawing/2016/5/11/chartex" xmlns:cx6="http://schemas.microsoft.com/office/drawing/2016/5/12/chartex" xmlns:cx7="http://schemas.microsoft.com/office/drawing/2016/5/13/chartex" xmlns:cx8="http://schemas.microsoft.com/office/drawing/2016/5/14/chartex" xmlns:mc="http://schemas.openxmlformats.org/markup-compatibility/2006" xmlns:aink="http://schemas.microsoft.com/office/drawing/2016/ink" xmlns:am3d="http://schemas.microsoft.com/office/drawing/2017/model3d" xmlns:o="urn:schemas-microsoft-com:office:office" xmlns:oel="http://schemas.microsoft.com/office/2019/extlst" xmlns:r="http://schemas.openxmlformats.org/officeDocument/2006/relationships" xmlns:m="http://schemas.openxmlformats.org/officeDocument/2006/math" xmlns:v="urn:schemas-microsoft-com:vml" xmlns:wp14="http://schemas.microsoft.com/office/word/2010/wordprocessingDrawing" xmlns:wp="http://schemas.openxmlformats.org/drawingml/2006/wordprocessingDrawing" xmlns:w10="urn:schemas-microsoft-com:office:word" xmlns:w="http://schemas.openxmlformats.org/wordprocessingml/2006/main" xmlns:w14="http://schemas.microsoft.com/office/word/2010/wordml" xmlns:w15="http://schemas.microsoft.com/office/word/2012/wordml" xmlns:w16cex="http://schemas.microsoft.com/office/word/2018/wordml/cex" xmlns:w16cid="http://schemas.microsoft.com/office/word/2016/wordml/cid" xmlns:w16="http://schemas.microsoft.com/office/word/2018/wordml" xmlns:w16du="http://schemas.microsoft.com/office/word/2023/wordml/word16du" xmlns:w16sdtdh="http://schemas.microsoft.com/office/word/2020/wordml/sdtdatahash" xmlns:w16sdtfl="http://schemas.microsoft.com/office/word/2024/wordml/sdtformatlock" xmlns:w16se="http://schemas.microsoft.com/office/word/2015/wordml/symex" xmlns:wpg="http://schemas.microsoft.com/office/word/2010/wordprocessingGroup" xmlns:wpi="http://schemas.microsoft.com/office/word/2010/wordprocessingInk" xmlns:wne="http://schemas.microsoft.com/office/word/2006/wordml" xmlns:wps="http://schemas.microsoft.com/office/word/2010/wordprocessingShape" mc:Ignorable="w14 w15 w16se w16cid w16 w16cex w16sdtdh w16sdtfl w16du wp14">
   <w:endnote w:type="separator" w:id="-1">
     <w:p>
+      <w:pPr>
+        <w:rPr>
+          <w:rFonts w:hint="eastAsia"/>
+        </w:rPr>
+      </w:pPr>
       <w:r>
         <w:separator/>
       </w:r>
@@ -3114,6 +3161,11 @@
   </w:endnote>
   <w:endnote w:type="continuationSeparator" w:id="0">
     <w:p>
+      <w:pPr>
+        <w:rPr>
+          <w:rFonts w:hint="eastAsia"/>
+        </w:rPr>
+      </w:pPr>
       <w:r>
         <w:continuationSeparator/>
       </w:r>
@@ -3122,10 +3174,439 @@
 </w:endnotes>
 </file>
 
+<file path=word/footer1.xml><?xml version="1.0" encoding="utf-8"?>
+<w:ftr xmlns:wpc="http://schemas.microsoft.com/office/word/2010/wordprocessingCanvas" xmlns:cx="http://schemas.microsoft.com/office/drawing/2014/chartex" xmlns:cx1="http://schemas.microsoft.com/office/drawing/2015/9/8/chartex" xmlns:cx2="http://schemas.microsoft.com/office/drawing/2015/10/21/chartex" xmlns:cx3="http://schemas.microsoft.com/office/drawing/2016/5/9/chartex" xmlns:cx4="http://schemas.microsoft.com/office/drawing/2016/5/10/chartex" xmlns:cx5="http://schemas.microsoft.com/office/drawing/2016/5/11/chartex" xmlns:cx6="http://schemas.microsoft.com/office/drawing/2016/5/12/chartex" xmlns:cx7="http://schemas.microsoft.com/office/drawing/2016/5/13/chartex" xmlns:cx8="http://schemas.microsoft.com/office/drawing/2016/5/14/chartex" xmlns:mc="http://schemas.openxmlformats.org/markup-compatibility/2006" xmlns:aink="http://schemas.microsoft.com/office/drawing/2016/ink" xmlns:am3d="http://schemas.microsoft.com/office/drawing/2017/model3d" xmlns:o="urn:schemas-microsoft-com:office:office" xmlns:oel="http://schemas.microsoft.com/office/2019/extlst" xmlns:r="http://schemas.openxmlformats.org/officeDocument/2006/relationships" xmlns:m="http://schemas.openxmlformats.org/officeDocument/2006/math" xmlns:v="urn:schemas-microsoft-com:vml" xmlns:wp14="http://schemas.microsoft.com/office/word/2010/wordprocessingDrawing" xmlns:wp="http://schemas.openxmlformats.org/drawingml/2006/wordprocessingDrawing" xmlns:w10="urn:schemas-microsoft-com:office:word" xmlns:w="http://schemas.openxmlformats.org/wordprocessingml/2006/main" xmlns:w14="http://schemas.microsoft.com/office/word/2010/wordml" xmlns:w15="http://schemas.microsoft.com/office/word/2012/wordml" xmlns:w16cex="http://schemas.microsoft.com/office/word/2018/wordml/cex" xmlns:w16cid="http://schemas.microsoft.com/office/word/2016/wordml/cid" xmlns:w16="http://schemas.microsoft.com/office/word/2018/wordml" xmlns:w16du="http://schemas.microsoft.com/office/word/2023/wordml/word16du" xmlns:w16sdtdh="http://schemas.microsoft.com/office/word/2020/wordml/sdtdatahash" xmlns:w16sdtfl="http://schemas.microsoft.com/office/word/2024/wordml/sdtformatlock" xmlns:w16se="http://schemas.microsoft.com/office/word/2015/wordml/symex" xmlns:wpg="http://schemas.microsoft.com/office/word/2010/wordprocessingGroup" xmlns:wpi="http://schemas.microsoft.com/office/word/2010/wordprocessingInk" xmlns:wne="http://schemas.microsoft.com/office/word/2006/wordml" xmlns:wps="http://schemas.microsoft.com/office/word/2010/wordprocessingShape" mc:Ignorable="w14 w15 w16se w16cid w16 w16cex w16sdtdh w16sdtfl w16du wp14">
+  <w:sdt>
+    <w:sdtPr>
+      <w:id w:val="-1918633310"/>
+      <w:docPartObj>
+        <w:docPartGallery w:val="Page Numbers (Bottom of Page)"/>
+        <w:docPartUnique/>
+      </w:docPartObj>
+    </w:sdtPr>
+    <w:sdtContent>
+      <w:sdt>
+        <w:sdtPr>
+          <w:id w:val="-1705238520"/>
+          <w:docPartObj>
+            <w:docPartGallery w:val="Page Numbers (Top of Page)"/>
+            <w:docPartUnique/>
+          </w:docPartObj>
+        </w:sdtPr>
+        <w:sdtContent>
+          <w:p>
+            <w:pPr>
+              <w:pStyle w:val="af2"/>
+              <w:jc w:val="right"/>
+              <w:rPr>
+                <w:rFonts w:hint="eastAsia"/>
+              </w:rPr>
+            </w:pPr>
+            <w:r>
+              <w:rPr>
+                <w:lang w:val="zh-CN"/>
+              </w:rPr>
+              <w:t xml:space="preserve"> </w:t>
+            </w:r>
+            <w:r>
+              <w:rPr>
+                <w:b/>
+                <w:bCs/>
+                <w:sz w:val="24"/>
+                <w:szCs w:val="24"/>
+              </w:rPr>
+              <w:fldChar w:fldCharType="begin"/>
+            </w:r>
+            <w:r>
+              <w:rPr>
+                <w:b/>
+                <w:bCs/>
+              </w:rPr>
+              <w:instrText>PAGE</w:instrText>
+            </w:r>
+            <w:r>
+              <w:rPr>
+                <w:b/>
+                <w:bCs/>
+                <w:sz w:val="24"/>
+                <w:szCs w:val="24"/>
+              </w:rPr>
+              <w:fldChar w:fldCharType="separate"/>
+            </w:r>
+            <w:r>
+              <w:rPr>
+                <w:b/>
+                <w:bCs/>
+                <w:lang w:val="zh-CN"/>
+              </w:rPr>
+              <w:t>2</w:t>
+            </w:r>
+            <w:r>
+              <w:rPr>
+                <w:b/>
+                <w:bCs/>
+                <w:sz w:val="24"/>
+                <w:szCs w:val="24"/>
+              </w:rPr>
+              <w:fldChar w:fldCharType="end"/>
+            </w:r>
+            <w:r>
+              <w:rPr>
+                <w:lang w:val="zh-CN"/>
+              </w:rPr>
+              <w:t xml:space="preserve"> / </w:t>
+            </w:r>
+            <w:r>
+              <w:rPr>
+                <w:b/>
+                <w:bCs/>
+                <w:sz w:val="24"/>
+                <w:szCs w:val="24"/>
+              </w:rPr>
+              <w:fldChar w:fldCharType="begin"/>
+            </w:r>
+            <w:r>
+              <w:rPr>
+                <w:b/>
+                <w:bCs/>
+              </w:rPr>
+              <w:instrText>NUMPAGES</w:instrText>
+            </w:r>
+            <w:r>
+              <w:rPr>
+                <w:b/>
+                <w:bCs/>
+                <w:sz w:val="24"/>
+                <w:szCs w:val="24"/>
+              </w:rPr>
+              <w:fldChar w:fldCharType="separate"/>
+            </w:r>
+            <w:r>
+              <w:rPr>
+                <w:b/>
+                <w:bCs/>
+                <w:lang w:val="zh-CN"/>
+              </w:rPr>
+              <w:t>2</w:t>
+            </w:r>
+            <w:r>
+              <w:rPr>
+                <w:b/>
+                <w:bCs/>
+                <w:sz w:val="24"/>
+                <w:szCs w:val="24"/>
+              </w:rPr>
+              <w:fldChar w:fldCharType="end"/>
+            </w:r>
+          </w:p>
+        </w:sdtContent>
+      </w:sdt>
+    </w:sdtContent>
+  </w:sdt>
+  <w:p>
+    <w:pPr>
+      <w:pStyle w:val="af2"/>
+      <w:rPr>
+        <w:rFonts w:hint="eastAsia"/>
+      </w:rPr>
+    </w:pPr>
+    <w:r>
+      <w:rPr>
+        <w:noProof/>
+      </w:rPr>
+      <w:drawing>
+        <wp:anchor distT="0" distB="0" distL="114300" distR="114300" simplePos="0" relativeHeight="251659264" behindDoc="1" locked="0" layoutInCell="1" allowOverlap="1" wp14:anchorId="717FEA52" wp14:editId="736EF626">
+          <wp:simplePos x="0" y="0"/>
+          <wp:positionH relativeFrom="margin">
+            <wp:align>center</wp:align>
+          </wp:positionH>
+          <wp:positionV relativeFrom="paragraph">
+            <wp:posOffset>-296968</wp:posOffset>
+          </wp:positionV>
+          <wp:extent cx="10578627" cy="485140"/>
+          <wp:effectExtent l="0" t="0" r="0" b="0"/>
+          <wp:wrapNone/>
+          <wp:docPr id="1" name="image6.png"/>
+          <wp:cNvGraphicFramePr>
+            <a:graphicFrameLocks xmlns:a="http://schemas.openxmlformats.org/drawingml/2006/main" noChangeAspect="1"/>
+          </wp:cNvGraphicFramePr>
+          <a:graphic xmlns:a="http://schemas.openxmlformats.org/drawingml/2006/main">
+            <a:graphicData uri="http://schemas.openxmlformats.org/drawingml/2006/picture">
+              <pic:pic xmlns:pic="http://schemas.openxmlformats.org/drawingml/2006/picture">
+                <pic:nvPicPr>
+                  <pic:cNvPr id="1" name="image6.png"/>
+                  <pic:cNvPicPr>
+                    <a:picLocks noChangeAspect="1"/>
+                  </pic:cNvPicPr>
+                </pic:nvPicPr>
+                <pic:blipFill>
+                  <a:blip r:embed="rId1" cstate="print">
+                    <a:duotone>
+                      <a:prstClr val="black"/>
+                      <a:schemeClr val="accent3">
+                        <a:tint val="45000"/>
+                        <a:satMod val="400000"/>
+                      </a:schemeClr>
+                    </a:duotone>
+                    <a:extLst>
+                      <a:ext uri="{28A0092B-C50C-407E-A947-70E740481C1C}">
+                        <a14:useLocalDpi xmlns:a14="http://schemas.microsoft.com/office/drawing/2010/main" val="0"/>
+                      </a:ext>
+                    </a:extLst>
+                  </a:blip>
+                  <a:stretch>
+                    <a:fillRect/>
+                  </a:stretch>
+                </pic:blipFill>
+                <pic:spPr>
+                  <a:xfrm>
+                    <a:off x="0" y="0"/>
+                    <a:ext cx="10578627" cy="485140"/>
+                  </a:xfrm>
+                  <a:prstGeom prst="rect">
+                    <a:avLst/>
+                  </a:prstGeom>
+                </pic:spPr>
+              </pic:pic>
+            </a:graphicData>
+          </a:graphic>
+          <wp14:sizeRelH relativeFrom="margin">
+            <wp14:pctWidth>0</wp14:pctWidth>
+          </wp14:sizeRelH>
+          <wp14:sizeRelV relativeFrom="margin">
+            <wp14:pctHeight>0</wp14:pctHeight>
+          </wp14:sizeRelV>
+        </wp:anchor>
+      </w:drawing>
+    </w:r>
+  </w:p>
+</w:ftr>
+</file>
+
+<file path=word/footer2.xml><?xml version="1.0" encoding="utf-8"?>
+<w:ftr xmlns:wpc="http://schemas.microsoft.com/office/word/2010/wordprocessingCanvas" xmlns:cx="http://schemas.microsoft.com/office/drawing/2014/chartex" xmlns:cx1="http://schemas.microsoft.com/office/drawing/2015/9/8/chartex" xmlns:cx2="http://schemas.microsoft.com/office/drawing/2015/10/21/chartex" xmlns:cx3="http://schemas.microsoft.com/office/drawing/2016/5/9/chartex" xmlns:cx4="http://schemas.microsoft.com/office/drawing/2016/5/10/chartex" xmlns:cx5="http://schemas.microsoft.com/office/drawing/2016/5/11/chartex" xmlns:cx6="http://schemas.microsoft.com/office/drawing/2016/5/12/chartex" xmlns:cx7="http://schemas.microsoft.com/office/drawing/2016/5/13/chartex" xmlns:cx8="http://schemas.microsoft.com/office/drawing/2016/5/14/chartex" xmlns:mc="http://schemas.openxmlformats.org/markup-compatibility/2006" xmlns:aink="http://schemas.microsoft.com/office/drawing/2016/ink" xmlns:am3d="http://schemas.microsoft.com/office/drawing/2017/model3d" xmlns:o="urn:schemas-microsoft-com:office:office" xmlns:oel="http://schemas.microsoft.com/office/2019/extlst" xmlns:r="http://schemas.openxmlformats.org/officeDocument/2006/relationships" xmlns:m="http://schemas.openxmlformats.org/officeDocument/2006/math" xmlns:v="urn:schemas-microsoft-com:vml" xmlns:wp14="http://schemas.microsoft.com/office/word/2010/wordprocessingDrawing" xmlns:wp="http://schemas.openxmlformats.org/drawingml/2006/wordprocessingDrawing" xmlns:w10="urn:schemas-microsoft-com:office:word" xmlns:w="http://schemas.openxmlformats.org/wordprocessingml/2006/main" xmlns:w14="http://schemas.microsoft.com/office/word/2010/wordml" xmlns:w15="http://schemas.microsoft.com/office/word/2012/wordml" xmlns:w16cex="http://schemas.microsoft.com/office/word/2018/wordml/cex" xmlns:w16cid="http://schemas.microsoft.com/office/word/2016/wordml/cid" xmlns:w16="http://schemas.microsoft.com/office/word/2018/wordml" xmlns:w16du="http://schemas.microsoft.com/office/word/2023/wordml/word16du" xmlns:w16sdtdh="http://schemas.microsoft.com/office/word/2020/wordml/sdtdatahash" xmlns:w16sdtfl="http://schemas.microsoft.com/office/word/2024/wordml/sdtformatlock" xmlns:w16se="http://schemas.microsoft.com/office/word/2015/wordml/symex" xmlns:wpg="http://schemas.microsoft.com/office/word/2010/wordprocessingGroup" xmlns:wpi="http://schemas.microsoft.com/office/word/2010/wordprocessingInk" xmlns:wne="http://schemas.microsoft.com/office/word/2006/wordml" xmlns:wps="http://schemas.microsoft.com/office/word/2010/wordprocessingShape" mc:Ignorable="w14 w15 w16se w16cid w16 w16cex w16sdtdh w16sdtfl w16du wp14">
+  <w:sdt>
+    <w:sdtPr>
+      <w:id w:val="481897551"/>
+      <w:docPartObj>
+        <w:docPartGallery w:val="Page Numbers (Bottom of Page)"/>
+        <w:docPartUnique/>
+      </w:docPartObj>
+    </w:sdtPr>
+    <w:sdtContent>
+      <w:sdt>
+        <w:sdtPr>
+          <w:id w:val="925700946"/>
+          <w:docPartObj>
+            <w:docPartGallery w:val="Page Numbers (Top of Page)"/>
+            <w:docPartUnique/>
+          </w:docPartObj>
+        </w:sdtPr>
+        <w:sdtContent>
+          <w:p>
+            <w:pPr>
+              <w:pStyle w:val="af2"/>
+              <w:jc w:val="right"/>
+              <w:rPr>
+                <w:rFonts w:hint="eastAsia"/>
+              </w:rPr>
+            </w:pPr>
+            <w:r>
+              <w:rPr>
+                <w:lang w:val="zh-CN"/>
+              </w:rPr>
+              <w:t xml:space="preserve"> </w:t>
+            </w:r>
+            <w:r>
+              <w:rPr>
+                <w:b/>
+                <w:bCs/>
+                <w:sz w:val="24"/>
+                <w:szCs w:val="24"/>
+              </w:rPr>
+              <w:fldChar w:fldCharType="begin"/>
+            </w:r>
+            <w:r>
+              <w:rPr>
+                <w:b/>
+                <w:bCs/>
+              </w:rPr>
+              <w:instrText>PAGE</w:instrText>
+            </w:r>
+            <w:r>
+              <w:rPr>
+                <w:b/>
+                <w:bCs/>
+                <w:sz w:val="24"/>
+                <w:szCs w:val="24"/>
+              </w:rPr>
+              <w:fldChar w:fldCharType="separate"/>
+            </w:r>
+            <w:r>
+              <w:rPr>
+                <w:b/>
+                <w:bCs/>
+                <w:lang w:val="zh-CN"/>
+              </w:rPr>
+              <w:t>2</w:t>
+            </w:r>
+            <w:r>
+              <w:rPr>
+                <w:b/>
+                <w:bCs/>
+                <w:sz w:val="24"/>
+                <w:szCs w:val="24"/>
+              </w:rPr>
+              <w:fldChar w:fldCharType="end"/>
+            </w:r>
+            <w:r>
+              <w:rPr>
+                <w:lang w:val="zh-CN"/>
+              </w:rPr>
+              <w:t xml:space="preserve"> </w:t>
+            </w:r>
+            <w:r>
+              <w:rPr>
+                <w:lang w:val="zh-CN"/>
+              </w:rPr>
+              <w:t xml:space="preserve">/ </w:t>
+            </w:r>
+            <w:r>
+              <w:rPr>
+                <w:b/>
+                <w:bCs/>
+                <w:sz w:val="24"/>
+                <w:szCs w:val="24"/>
+              </w:rPr>
+              <w:fldChar w:fldCharType="begin"/>
+            </w:r>
+            <w:r>
+              <w:rPr>
+                <w:b/>
+                <w:bCs/>
+              </w:rPr>
+              <w:instrText>NUMPAGES</w:instrText>
+            </w:r>
+            <w:r>
+              <w:rPr>
+                <w:b/>
+                <w:bCs/>
+                <w:sz w:val="24"/>
+                <w:szCs w:val="24"/>
+              </w:rPr>
+              <w:fldChar w:fldCharType="separate"/>
+            </w:r>
+            <w:r>
+              <w:rPr>
+                <w:b/>
+                <w:bCs/>
+                <w:lang w:val="zh-CN"/>
+              </w:rPr>
+              <w:t>2</w:t>
+            </w:r>
+            <w:r>
+              <w:rPr>
+                <w:b/>
+                <w:bCs/>
+                <w:sz w:val="24"/>
+                <w:szCs w:val="24"/>
+              </w:rPr>
+              <w:fldChar w:fldCharType="end"/>
+            </w:r>
+          </w:p>
+        </w:sdtContent>
+      </w:sdt>
+    </w:sdtContent>
+  </w:sdt>
+  <w:p>
+    <w:pPr>
+      <w:pStyle w:val="af2"/>
+      <w:rPr>
+        <w:rFonts w:hint="eastAsia"/>
+      </w:rPr>
+    </w:pPr>
+    <w:r>
+      <w:rPr>
+        <w:noProof/>
+      </w:rPr>
+      <w:drawing>
+        <wp:anchor distT="0" distB="0" distL="114300" distR="114300" simplePos="0" relativeHeight="251661312" behindDoc="1" locked="0" layoutInCell="1" allowOverlap="1" wp14:anchorId="4111E684" wp14:editId="65CF8964">
+          <wp:simplePos x="0" y="0"/>
+          <wp:positionH relativeFrom="page">
+            <wp:align>right</wp:align>
+          </wp:positionH>
+          <wp:positionV relativeFrom="paragraph">
+            <wp:posOffset>-306070</wp:posOffset>
+          </wp:positionV>
+          <wp:extent cx="10568940" cy="485775"/>
+          <wp:effectExtent l="0" t="0" r="3810" b="9525"/>
+          <wp:wrapNone/>
+          <wp:docPr id="12" name="image6.png"/>
+          <wp:cNvGraphicFramePr>
+            <a:graphicFrameLocks xmlns:a="http://schemas.openxmlformats.org/drawingml/2006/main" noChangeAspect="1"/>
+          </wp:cNvGraphicFramePr>
+          <a:graphic xmlns:a="http://schemas.openxmlformats.org/drawingml/2006/main">
+            <a:graphicData uri="http://schemas.openxmlformats.org/drawingml/2006/picture">
+              <pic:pic xmlns:pic="http://schemas.openxmlformats.org/drawingml/2006/picture">
+                <pic:nvPicPr>
+                  <pic:cNvPr id="1" name="image6.png"/>
+                  <pic:cNvPicPr>
+                    <a:picLocks noChangeAspect="1"/>
+                  </pic:cNvPicPr>
+                </pic:nvPicPr>
+                <pic:blipFill>
+                  <a:blip r:embed="rId1" cstate="print">
+                    <a:duotone>
+                      <a:prstClr val="black"/>
+                      <a:schemeClr val="accent3">
+                        <a:tint val="45000"/>
+                        <a:satMod val="400000"/>
+                      </a:schemeClr>
+                    </a:duotone>
+                    <a:extLst>
+                      <a:ext uri="{28A0092B-C50C-407E-A947-70E740481C1C}">
+                        <a14:useLocalDpi xmlns:a14="http://schemas.microsoft.com/office/drawing/2010/main" val="0"/>
+                      </a:ext>
+                    </a:extLst>
+                  </a:blip>
+                  <a:stretch>
+                    <a:fillRect/>
+                  </a:stretch>
+                </pic:blipFill>
+                <pic:spPr>
+                  <a:xfrm>
+                    <a:off x="0" y="0"/>
+                    <a:ext cx="10568940" cy="485775"/>
+                  </a:xfrm>
+                  <a:prstGeom prst="rect">
+                    <a:avLst/>
+                  </a:prstGeom>
+                </pic:spPr>
+              </pic:pic>
+            </a:graphicData>
+          </a:graphic>
+          <wp14:sizeRelH relativeFrom="margin">
+            <wp14:pctWidth>0</wp14:pctWidth>
+          </wp14:sizeRelH>
+          <wp14:sizeRelV relativeFrom="margin">
+            <wp14:pctHeight>0</wp14:pctHeight>
+          </wp14:sizeRelV>
+        </wp:anchor>
+      </w:drawing>
+    </w:r>
+  </w:p>
+</w:ftr>
+</file>
+
 <file path=word/footnotes.xml><?xml version="1.0" encoding="utf-8"?>
-<w:footnotes xmlns:wpc="http://schemas.microsoft.com/office/word/2010/wordprocessingCanvas" xmlns:cx="http://schemas.microsoft.com/office/drawing/2014/chartex" xmlns:cx1="http://schemas.microsoft.com/office/drawing/2015/9/8/chartex" xmlns:cx2="http://schemas.microsoft.com/office/drawing/2015/10/21/chartex" xmlns:cx3="http://schemas.microsoft.com/office/drawing/2016/5/9/chartex" xmlns:cx4="http://schemas.microsoft.com/office/drawing/2016/5/10/chartex" xmlns:cx5="http://schemas.microsoft.com/office/drawing/2016/5/11/chartex" xmlns:cx6="http://schemas.microsoft.com/office/drawing/2016/5/12/chartex" xmlns:cx7="http://schemas.microsoft.com/office/drawing/2016/5/13/chartex" xmlns:cx8="http://schemas.microsoft.com/office/drawing/2016/5/14/chartex" xmlns:mc="http://schemas.openxmlformats.org/markup-compatibility/2006" xmlns:aink="http://schemas.microsoft.com/office/drawing/2016/ink" xmlns:am3d="http://schemas.microsoft.com/office/drawing/2017/model3d" xmlns:o="urn:schemas-microsoft-com:office:office" xmlns:r="http://schemas.openxmlformats.org/officeDocument/2006/relationships" xmlns:m="http://schemas.openxmlformats.org/officeDocument/2006/math" xmlns:v="urn:schemas-microsoft-com:vml" xmlns:wp14="http://schemas.microsoft.com/office/word/2010/wordprocessingDrawing" xmlns:wp="http://schemas.openxmlformats.org/drawingml/2006/wordprocessingDrawing" xmlns:w10="urn:schemas-microsoft-com:office:word" xmlns:w="http://schemas.openxmlformats.org/wordprocessingml/2006/main" xmlns:w14="http://schemas.microsoft.com/office/word/2010/wordml" xmlns:w15="http://schemas.microsoft.com/office/word/2012/wordml" xmlns:w16cex="http://schemas.microsoft.com/office/word/2018/wordml/cex" xmlns:w16cid="http://schemas.microsoft.com/office/word/2016/wordml/cid" xmlns:w16="http://schemas.microsoft.com/office/word/2018/wordml" xmlns:w16sdtdh="http://schemas.microsoft.com/office/word/2020/wordml/sdtdatahash" xmlns:w16se="http://schemas.microsoft.com/office/word/2015/wordml/symex" xmlns:wpg="http://schemas.microsoft.com/office/word/2010/wordprocessingGroup" xmlns:wpi="http://schemas.microsoft.com/office/word/2010/wordprocessingInk" xmlns:wne="http://schemas.microsoft.com/office/word/2006/wordml" xmlns:wps="http://schemas.microsoft.com/office/word/2010/wordprocessingShape" mc:Ignorable="w14 w15 w16se w16cid w16 w16cex w16sdtdh wp14">
+<w:footnotes xmlns:wpc="http://schemas.microsoft.com/office/word/2010/wordprocessingCanvas" xmlns:cx="http://schemas.microsoft.com/office/drawing/2014/chartex" xmlns:cx1="http://schemas.microsoft.com/office/drawing/2015/9/8/chartex" xmlns:cx2="http://schemas.microsoft.com/office/drawing/2015/10/21/chartex" xmlns:cx3="http://schemas.microsoft.com/office/drawing/2016/5/9/chartex" xmlns:cx4="http://schemas.microsoft.com/office/drawing/2016/5/10/chartex" xmlns:cx5="http://schemas.microsoft.com/office/drawing/2016/5/11/chartex" xmlns:cx6="http://schemas.microsoft.com/office/drawing/2016/5/12/chartex" xmlns:cx7="http://schemas.microsoft.com/office/drawing/2016/5/13/chartex" xmlns:cx8="http://schemas.microsoft.com/office/drawing/2016/5/14/chartex" xmlns:mc="http://schemas.openxmlformats.org/markup-compatibility/2006" xmlns:aink="http://schemas.microsoft.com/office/drawing/2016/ink" xmlns:am3d="http://schemas.microsoft.com/office/drawing/2017/model3d" xmlns:o="urn:schemas-microsoft-com:office:office" xmlns:oel="http://schemas.microsoft.com/office/2019/extlst" xmlns:r="http://schemas.openxmlformats.org/officeDocument/2006/relationships" xmlns:m="http://schemas.openxmlformats.org/officeDocument/2006/math" xmlns:v="urn:schemas-microsoft-com:vml" xmlns:wp14="http://schemas.microsoft.com/office/word/2010/wordprocessingDrawing" xmlns:wp="http://schemas.openxmlformats.org/drawingml/2006/wordprocessingDrawing" xmlns:w10="urn:schemas-microsoft-com:office:word" xmlns:w="http://schemas.openxmlformats.org/wordprocessingml/2006/main" xmlns:w14="http://schemas.microsoft.com/office/word/2010/wordml" xmlns:w15="http://schemas.microsoft.com/office/word/2012/wordml" xmlns:w16cex="http://schemas.microsoft.com/office/word/2018/wordml/cex" xmlns:w16cid="http://schemas.microsoft.com/office/word/2016/wordml/cid" xmlns:w16="http://schemas.microsoft.com/office/word/2018/wordml" xmlns:w16du="http://schemas.microsoft.com/office/word/2023/wordml/word16du" xmlns:w16sdtdh="http://schemas.microsoft.com/office/word/2020/wordml/sdtdatahash" xmlns:w16sdtfl="http://schemas.microsoft.com/office/word/2024/wordml/sdtformatlock" xmlns:w16se="http://schemas.microsoft.com/office/word/2015/wordml/symex" xmlns:wpg="http://schemas.microsoft.com/office/word/2010/wordprocessingGroup" xmlns:wpi="http://schemas.microsoft.com/office/word/2010/wordprocessingInk" xmlns:wne="http://schemas.microsoft.com/office/word/2006/wordml" xmlns:wps="http://schemas.microsoft.com/office/word/2010/wordprocessingShape" mc:Ignorable="w14 w15 w16se w16cid w16 w16cex w16sdtdh w16sdtfl w16du wp14">
   <w:footnote w:type="separator" w:id="-1">
     <w:p>
+      <w:pPr>
+        <w:rPr>
+          <w:rFonts w:hint="eastAsia"/>
+        </w:rPr>
+      </w:pPr>
       <w:r>
         <w:separator/>
       </w:r>
@@ -3133,6 +3614,11 @@
   </w:footnote>
   <w:footnote w:type="continuationSeparator" w:id="0">
     <w:p>
+      <w:pPr>
+        <w:rPr>
+          <w:rFonts w:hint="eastAsia"/>
+        </w:rPr>
+      </w:pPr>
       <w:r>
         <w:continuationSeparator/>
       </w:r>
@@ -3142,11 +3628,14 @@
 </file>
 
 <file path=word/styles.xml><?xml version="1.0" encoding="utf-8"?>
-<w:styles xmlns:mc="http://schemas.openxmlformats.org/markup-compatibility/2006" xmlns:r="http://schemas.openxmlformats.org/officeDocument/2006/relationships" xmlns:w="http://schemas.openxmlformats.org/wordprocessingml/2006/main" xmlns:w14="http://schemas.microsoft.com/office/word/2010/wordml" xmlns:w15="http://schemas.microsoft.com/office/word/2012/wordml" xmlns:w16cex="http://schemas.microsoft.com/office/word/2018/wordml/cex" xmlns:w16cid="http://schemas.microsoft.com/office/word/2016/wordml/cid" xmlns:w16="http://schemas.microsoft.com/office/word/2018/wordml" xmlns:w16sdtdh="http://schemas.microsoft.com/office/word/2020/wordml/sdtdatahash" xmlns:w16se="http://schemas.microsoft.com/office/word/2015/wordml/symex" mc:Ignorable="w14 w15 w16se w16cid w16 w16cex w16sdtdh">
+<w:styles xmlns:mc="http://schemas.openxmlformats.org/markup-compatibility/2006" xmlns:r="http://schemas.openxmlformats.org/officeDocument/2006/relationships" xmlns:w="http://schemas.openxmlformats.org/wordprocessingml/2006/main" xmlns:w14="http://schemas.microsoft.com/office/word/2010/wordml" xmlns:w15="http://schemas.microsoft.com/office/word/2012/wordml" xmlns:w16cex="http://schemas.microsoft.com/office/word/2018/wordml/cex" xmlns:w16cid="http://schemas.microsoft.com/office/word/2016/wordml/cid" xmlns:w16="http://schemas.microsoft.com/office/word/2018/wordml" xmlns:w16du="http://schemas.microsoft.com/office/word/2023/wordml/word16du" xmlns:w16sdtdh="http://schemas.microsoft.com/office/word/2020/wordml/sdtdatahash" xmlns:w16sdtfl="http://schemas.microsoft.com/office/word/2024/wordml/sdtformatlock" xmlns:w16se="http://schemas.microsoft.com/office/word/2015/wordml/symex" mc:Ignorable="w14 w15 w16se w16cid w16 w16cex w16sdtdh w16sdtfl w16du">
   <w:docDefaults>
     <w:rPrDefault>
       <w:rPr>
         <w:rFonts w:asciiTheme="minorHAnsi" w:eastAsiaTheme="minorEastAsia" w:hAnsiTheme="minorHAnsi" w:cstheme="minorBidi"/>
+        <w:kern w:val="2"/>
+        <w:sz w:val="21"/>
+        <w:szCs w:val="22"/>
         <w:lang w:val="en-US" w:eastAsia="zh-CN" w:bidi="ar-SA"/>
       </w:rPr>
     </w:rPrDefault>
@@ -3156,7 +3645,7 @@
     <w:lsdException w:name="Normal" w:uiPriority="0" w:qFormat="1"/>
     <w:lsdException w:name="heading 1" w:uiPriority="9" w:qFormat="1"/>
     <w:lsdException w:name="heading 2" w:semiHidden="1" w:uiPriority="9" w:unhideWhenUsed="1" w:qFormat="1"/>
-    <w:lsdException w:name="heading 3" w:uiPriority="1" w:unhideWhenUsed="1" w:qFormat="1"/>
+    <w:lsdException w:name="heading 3" w:semiHidden="1" w:uiPriority="1" w:unhideWhenUsed="1" w:qFormat="1"/>
     <w:lsdException w:name="heading 4" w:semiHidden="1" w:uiPriority="9" w:unhideWhenUsed="1" w:qFormat="1"/>
     <w:lsdException w:name="heading 5" w:semiHidden="1" w:uiPriority="9" w:unhideWhenUsed="1" w:qFormat="1"/>
     <w:lsdException w:name="heading 6" w:semiHidden="1" w:uiPriority="9" w:unhideWhenUsed="1" w:qFormat="1"/>
@@ -3184,8 +3673,8 @@
     <w:lsdException w:name="Normal Indent" w:semiHidden="1" w:unhideWhenUsed="1"/>
     <w:lsdException w:name="footnote text" w:semiHidden="1" w:unhideWhenUsed="1"/>
     <w:lsdException w:name="annotation text" w:semiHidden="1" w:unhideWhenUsed="1"/>
-    <w:lsdException w:name="header" w:unhideWhenUsed="1"/>
-    <w:lsdException w:name="footer" w:unhideWhenUsed="1"/>
+    <w:lsdException w:name="header" w:semiHidden="1" w:unhideWhenUsed="1"/>
+    <w:lsdException w:name="footer" w:semiHidden="1" w:unhideWhenUsed="1"/>
     <w:lsdException w:name="index heading" w:semiHidden="1" w:unhideWhenUsed="1"/>
     <w:lsdException w:name="caption" w:semiHidden="1" w:uiPriority="35" w:unhideWhenUsed="1" w:qFormat="1"/>
     <w:lsdException w:name="table of figures" w:semiHidden="1" w:unhideWhenUsed="1"/>
@@ -3219,7 +3708,7 @@
     <w:lsdException w:name="Closing" w:semiHidden="1" w:unhideWhenUsed="1"/>
     <w:lsdException w:name="Signature" w:semiHidden="1" w:unhideWhenUsed="1"/>
     <w:lsdException w:name="Default Paragraph Font" w:semiHidden="1" w:uiPriority="1" w:unhideWhenUsed="1"/>
-    <w:lsdException w:name="Body Text" w:uiPriority="1" w:qFormat="1"/>
+    <w:lsdException w:name="Body Text" w:semiHidden="1" w:uiPriority="1" w:unhideWhenUsed="1" w:qFormat="1"/>
     <w:lsdException w:name="Body Text Indent" w:semiHidden="1" w:unhideWhenUsed="1"/>
     <w:lsdException w:name="List Continue" w:semiHidden="1" w:unhideWhenUsed="1"/>
     <w:lsdException w:name="List Continue 2" w:semiHidden="1" w:unhideWhenUsed="1"/>
@@ -3238,7 +3727,7 @@
     <w:lsdException w:name="Body Text Indent 2" w:semiHidden="1" w:unhideWhenUsed="1"/>
     <w:lsdException w:name="Body Text Indent 3" w:semiHidden="1" w:unhideWhenUsed="1"/>
     <w:lsdException w:name="Block Text" w:semiHidden="1" w:unhideWhenUsed="1"/>
-    <w:lsdException w:name="Hyperlink" w:unhideWhenUsed="1"/>
+    <w:lsdException w:name="Hyperlink" w:semiHidden="1" w:unhideWhenUsed="1"/>
     <w:lsdException w:name="FollowedHyperlink" w:semiHidden="1" w:unhideWhenUsed="1"/>
     <w:lsdException w:name="Strong" w:uiPriority="22" w:qFormat="1"/>
     <w:lsdException w:name="Emphasis" w:uiPriority="20" w:qFormat="1"/>
@@ -3310,6 +3799,7 @@
     <w:lsdException w:name="Table Grid" w:uiPriority="39"/>
     <w:lsdException w:name="Table Theme" w:semiHidden="1" w:unhideWhenUsed="1"/>
     <w:lsdException w:name="Placeholder Text" w:semiHidden="1"/>
+    <w:lsdException w:name="No Spacing" w:uiPriority="1" w:qFormat="1"/>
     <w:lsdException w:name="Light Shading" w:uiPriority="60"/>
     <w:lsdException w:name="Light List" w:uiPriority="61"/>
     <w:lsdException w:name="Light Grid" w:uiPriority="62"/>
@@ -3532,15 +4022,11 @@
   <w:style w:type="paragraph" w:default="1" w:styleId="a">
     <w:name w:val="Normal"/>
     <w:qFormat/>
+    <w:rsid w:val="00D911C5"/>
     <w:pPr>
       <w:widowControl w:val="0"/>
       <w:jc w:val="both"/>
     </w:pPr>
-    <w:rPr>
-      <w:kern w:val="2"/>
-      <w:sz w:val="21"/>
-      <w:szCs w:val="22"/>
-    </w:rPr>
   </w:style>
   <w:style w:type="paragraph" w:styleId="1">
     <w:name w:val="heading 1"/>
@@ -3549,6 +4035,7 @@
     <w:link w:val="10"/>
     <w:uiPriority w:val="9"/>
     <w:qFormat/>
+    <w:rsid w:val="00184D52"/>
     <w:pPr>
       <w:keepNext/>
       <w:keepLines/>
@@ -3571,6 +4058,7 @@
     <w:semiHidden/>
     <w:unhideWhenUsed/>
     <w:qFormat/>
+    <w:rsid w:val="00184D52"/>
     <w:pPr>
       <w:keepNext/>
       <w:keepLines/>
@@ -3592,6 +4080,7 @@
     <w:uiPriority w:val="1"/>
     <w:unhideWhenUsed/>
     <w:qFormat/>
+    <w:rsid w:val="00184D52"/>
     <w:pPr>
       <w:keepNext/>
       <w:keepLines/>
@@ -3614,6 +4103,7 @@
     <w:semiHidden/>
     <w:unhideWhenUsed/>
     <w:qFormat/>
+    <w:rsid w:val="00184D52"/>
     <w:pPr>
       <w:keepNext/>
       <w:keepLines/>
@@ -3636,6 +4126,7 @@
     <w:semiHidden/>
     <w:unhideWhenUsed/>
     <w:qFormat/>
+    <w:rsid w:val="00184D52"/>
     <w:pPr>
       <w:keepNext/>
       <w:keepLines/>
@@ -3658,6 +4149,7 @@
     <w:semiHidden/>
     <w:unhideWhenUsed/>
     <w:qFormat/>
+    <w:rsid w:val="00184D52"/>
     <w:pPr>
       <w:keepNext/>
       <w:keepLines/>
@@ -3680,6 +4172,7 @@
     <w:semiHidden/>
     <w:unhideWhenUsed/>
     <w:qFormat/>
+    <w:rsid w:val="00184D52"/>
     <w:pPr>
       <w:keepNext/>
       <w:keepLines/>
@@ -3702,6 +4195,7 @@
     <w:semiHidden/>
     <w:unhideWhenUsed/>
     <w:qFormat/>
+    <w:rsid w:val="00184D52"/>
     <w:pPr>
       <w:keepNext/>
       <w:keepLines/>
@@ -3721,6 +4215,7 @@
     <w:semiHidden/>
     <w:unhideWhenUsed/>
     <w:qFormat/>
+    <w:rsid w:val="00184D52"/>
     <w:pPr>
       <w:keepNext/>
       <w:keepLines/>
@@ -3758,87 +4253,134 @@
     <w:semiHidden/>
     <w:unhideWhenUsed/>
   </w:style>
-  <w:style w:type="paragraph" w:styleId="a3">
-    <w:name w:val="Body Text"/>
-    <w:basedOn w:val="a"/>
-    <w:link w:val="a4"/>
-    <w:uiPriority w:val="1"/>
-    <w:qFormat/>
-    <w:pPr>
-      <w:jc w:val="left"/>
-    </w:pPr>
+  <w:style w:type="character" w:customStyle="1" w:styleId="10">
+    <w:name w:val="标题 1 字符"/>
+    <w:basedOn w:val="a0"/>
+    <w:link w:val="1"/>
+    <w:uiPriority w:val="9"/>
+    <w:rsid w:val="00184D52"/>
     <w:rPr>
-      <w:rFonts w:ascii="DTL Argo T Light" w:hAnsi="DTL Argo T Light" w:cs="DTL Argo T Light"/>
-      <w:kern w:val="0"/>
-      <w:sz w:val="24"/>
-      <w:szCs w:val="24"/>
-      <w:lang w:eastAsia="en-US"/>
+      <w:rFonts w:asciiTheme="majorHAnsi" w:eastAsiaTheme="majorEastAsia" w:hAnsiTheme="majorHAnsi" w:cstheme="majorBidi"/>
+      <w:color w:val="0F4761" w:themeColor="accent1" w:themeShade="BF"/>
+      <w:sz w:val="48"/>
+      <w:szCs w:val="48"/>
     </w:rPr>
   </w:style>
-  <w:style w:type="paragraph" w:styleId="a5">
-    <w:name w:val="footer"/>
-    <w:basedOn w:val="a"/>
-    <w:link w:val="a6"/>
-    <w:uiPriority w:val="99"/>
-    <w:unhideWhenUsed/>
-    <w:pPr>
-      <w:tabs>
-        <w:tab w:val="center" w:pos="4153"/>
-        <w:tab w:val="right" w:pos="8306"/>
-      </w:tabs>
-      <w:snapToGrid w:val="0"/>
-      <w:jc w:val="left"/>
-    </w:pPr>
+  <w:style w:type="character" w:customStyle="1" w:styleId="20">
+    <w:name w:val="标题 2 字符"/>
+    <w:basedOn w:val="a0"/>
+    <w:link w:val="2"/>
+    <w:uiPriority w:val="9"/>
+    <w:semiHidden/>
+    <w:rsid w:val="00184D52"/>
     <w:rPr>
-      <w:sz w:val="18"/>
-      <w:szCs w:val="18"/>
+      <w:rFonts w:asciiTheme="majorHAnsi" w:eastAsiaTheme="majorEastAsia" w:hAnsiTheme="majorHAnsi" w:cstheme="majorBidi"/>
+      <w:color w:val="0F4761" w:themeColor="accent1" w:themeShade="BF"/>
+      <w:sz w:val="40"/>
+      <w:szCs w:val="40"/>
     </w:rPr>
   </w:style>
-  <w:style w:type="paragraph" w:styleId="a7">
-    <w:name w:val="header"/>
-    <w:basedOn w:val="a"/>
-    <w:link w:val="a8"/>
-    <w:uiPriority w:val="99"/>
-    <w:unhideWhenUsed/>
-    <w:pPr>
-      <w:tabs>
-        <w:tab w:val="center" w:pos="4153"/>
-        <w:tab w:val="right" w:pos="8306"/>
-      </w:tabs>
-      <w:snapToGrid w:val="0"/>
-      <w:jc w:val="center"/>
-    </w:pPr>
+  <w:style w:type="character" w:customStyle="1" w:styleId="30">
+    <w:name w:val="标题 3 字符"/>
+    <w:basedOn w:val="a0"/>
+    <w:link w:val="3"/>
+    <w:uiPriority w:val="1"/>
+    <w:rsid w:val="00184D52"/>
     <w:rPr>
-      <w:sz w:val="18"/>
-      <w:szCs w:val="18"/>
+      <w:rFonts w:asciiTheme="majorHAnsi" w:eastAsiaTheme="majorEastAsia" w:hAnsiTheme="majorHAnsi" w:cstheme="majorBidi"/>
+      <w:color w:val="0F4761" w:themeColor="accent1" w:themeShade="BF"/>
+      <w:sz w:val="32"/>
+      <w:szCs w:val="32"/>
     </w:rPr>
   </w:style>
-  <w:style w:type="paragraph" w:styleId="a9">
-    <w:name w:val="Subtitle"/>
-    <w:basedOn w:val="a"/>
-    <w:next w:val="a"/>
-    <w:link w:val="aa"/>
-    <w:uiPriority w:val="11"/>
-    <w:qFormat/>
-    <w:pPr>
-      <w:spacing w:after="160"/>
-      <w:jc w:val="center"/>
-    </w:pPr>
+  <w:style w:type="character" w:customStyle="1" w:styleId="40">
+    <w:name w:val="标题 4 字符"/>
+    <w:basedOn w:val="a0"/>
+    <w:link w:val="4"/>
+    <w:uiPriority w:val="9"/>
+    <w:semiHidden/>
+    <w:rsid w:val="00184D52"/>
     <w:rPr>
-      <w:rFonts w:asciiTheme="majorHAnsi" w:eastAsiaTheme="majorEastAsia" w:hAnsiTheme="majorHAnsi" w:cstheme="majorBidi"/>
-      <w:color w:val="595959" w:themeColor="text1" w:themeTint="A6"/>
-      <w:spacing w:val="15"/>
+      <w:rFonts w:cstheme="majorBidi"/>
+      <w:color w:val="0F4761" w:themeColor="accent1" w:themeShade="BF"/>
       <w:sz w:val="28"/>
       <w:szCs w:val="28"/>
     </w:rPr>
   </w:style>
-  <w:style w:type="paragraph" w:styleId="ab">
+  <w:style w:type="character" w:customStyle="1" w:styleId="50">
+    <w:name w:val="标题 5 字符"/>
+    <w:basedOn w:val="a0"/>
+    <w:link w:val="5"/>
+    <w:uiPriority w:val="9"/>
+    <w:semiHidden/>
+    <w:rsid w:val="00184D52"/>
+    <w:rPr>
+      <w:rFonts w:cstheme="majorBidi"/>
+      <w:color w:val="0F4761" w:themeColor="accent1" w:themeShade="BF"/>
+      <w:sz w:val="24"/>
+      <w:szCs w:val="24"/>
+    </w:rPr>
+  </w:style>
+  <w:style w:type="character" w:customStyle="1" w:styleId="60">
+    <w:name w:val="标题 6 字符"/>
+    <w:basedOn w:val="a0"/>
+    <w:link w:val="6"/>
+    <w:uiPriority w:val="9"/>
+    <w:semiHidden/>
+    <w:rsid w:val="00184D52"/>
+    <w:rPr>
+      <w:rFonts w:cstheme="majorBidi"/>
+      <w:b/>
+      <w:bCs/>
+      <w:color w:val="0F4761" w:themeColor="accent1" w:themeShade="BF"/>
+    </w:rPr>
+  </w:style>
+  <w:style w:type="character" w:customStyle="1" w:styleId="70">
+    <w:name w:val="标题 7 字符"/>
+    <w:basedOn w:val="a0"/>
+    <w:link w:val="7"/>
+    <w:uiPriority w:val="9"/>
+    <w:semiHidden/>
+    <w:rsid w:val="00184D52"/>
+    <w:rPr>
+      <w:rFonts w:cstheme="majorBidi"/>
+      <w:b/>
+      <w:bCs/>
+      <w:color w:val="595959" w:themeColor="text1" w:themeTint="A6"/>
+    </w:rPr>
+  </w:style>
+  <w:style w:type="character" w:customStyle="1" w:styleId="80">
+    <w:name w:val="标题 8 字符"/>
+    <w:basedOn w:val="a0"/>
+    <w:link w:val="8"/>
+    <w:uiPriority w:val="9"/>
+    <w:semiHidden/>
+    <w:rsid w:val="00184D52"/>
+    <w:rPr>
+      <w:rFonts w:cstheme="majorBidi"/>
+      <w:color w:val="595959" w:themeColor="text1" w:themeTint="A6"/>
+    </w:rPr>
+  </w:style>
+  <w:style w:type="character" w:customStyle="1" w:styleId="90">
+    <w:name w:val="标题 9 字符"/>
+    <w:basedOn w:val="a0"/>
+    <w:link w:val="9"/>
+    <w:uiPriority w:val="9"/>
+    <w:semiHidden/>
+    <w:rsid w:val="00184D52"/>
+    <w:rPr>
+      <w:rFonts w:eastAsiaTheme="majorEastAsia" w:cstheme="majorBidi"/>
+      <w:color w:val="595959" w:themeColor="text1" w:themeTint="A6"/>
+    </w:rPr>
+  </w:style>
+  <w:style w:type="paragraph" w:styleId="a3">
     <w:name w:val="Title"/>
     <w:basedOn w:val="a"/>
     <w:next w:val="a"/>
-    <w:link w:val="ac"/>
+    <w:link w:val="a4"/>
     <w:uiPriority w:val="10"/>
     <w:qFormat/>
+    <w:rsid w:val="00184D52"/>
     <w:pPr>
       <w:spacing w:after="80"/>
       <w:contextualSpacing/>
@@ -3852,132 +4394,12 @@
       <w:szCs w:val="56"/>
     </w:rPr>
   </w:style>
-  <w:style w:type="character" w:styleId="ad">
-    <w:name w:val="Hyperlink"/>
-    <w:basedOn w:val="a0"/>
-    <w:uiPriority w:val="99"/>
-    <w:unhideWhenUsed/>
-    <w:rPr>
-      <w:color w:val="467886" w:themeColor="hyperlink"/>
-      <w:u w:val="single"/>
-    </w:rPr>
-  </w:style>
-  <w:style w:type="character" w:customStyle="1" w:styleId="10">
-    <w:name w:val="标题 1 字符"/>
-    <w:basedOn w:val="a0"/>
-    <w:link w:val="1"/>
-    <w:uiPriority w:val="9"/>
-    <w:rPr>
-      <w:rFonts w:asciiTheme="majorHAnsi" w:eastAsiaTheme="majorEastAsia" w:hAnsiTheme="majorHAnsi" w:cstheme="majorBidi"/>
-      <w:color w:val="0F4761" w:themeColor="accent1" w:themeShade="BF"/>
-      <w:sz w:val="48"/>
-      <w:szCs w:val="48"/>
-    </w:rPr>
-  </w:style>
-  <w:style w:type="character" w:customStyle="1" w:styleId="20">
-    <w:name w:val="标题 2 字符"/>
-    <w:basedOn w:val="a0"/>
-    <w:link w:val="2"/>
-    <w:uiPriority w:val="9"/>
-    <w:semiHidden/>
-    <w:rPr>
-      <w:rFonts w:asciiTheme="majorHAnsi" w:eastAsiaTheme="majorEastAsia" w:hAnsiTheme="majorHAnsi" w:cstheme="majorBidi"/>
-      <w:color w:val="0F4761" w:themeColor="accent1" w:themeShade="BF"/>
-      <w:sz w:val="40"/>
-      <w:szCs w:val="40"/>
-    </w:rPr>
-  </w:style>
-  <w:style w:type="character" w:customStyle="1" w:styleId="30">
-    <w:name w:val="标题 3 字符"/>
-    <w:basedOn w:val="a0"/>
-    <w:link w:val="3"/>
-    <w:uiPriority w:val="1"/>
-    <w:rPr>
-      <w:rFonts w:asciiTheme="majorHAnsi" w:eastAsiaTheme="majorEastAsia" w:hAnsiTheme="majorHAnsi" w:cstheme="majorBidi"/>
-      <w:color w:val="0F4761" w:themeColor="accent1" w:themeShade="BF"/>
-      <w:sz w:val="32"/>
-      <w:szCs w:val="32"/>
-    </w:rPr>
-  </w:style>
-  <w:style w:type="character" w:customStyle="1" w:styleId="40">
-    <w:name w:val="标题 4 字符"/>
-    <w:basedOn w:val="a0"/>
-    <w:link w:val="4"/>
-    <w:uiPriority w:val="9"/>
-    <w:semiHidden/>
-    <w:rPr>
-      <w:rFonts w:cstheme="majorBidi"/>
-      <w:color w:val="0F4761" w:themeColor="accent1" w:themeShade="BF"/>
-      <w:sz w:val="28"/>
-      <w:szCs w:val="28"/>
-    </w:rPr>
-  </w:style>
-  <w:style w:type="character" w:customStyle="1" w:styleId="50">
-    <w:name w:val="标题 5 字符"/>
-    <w:basedOn w:val="a0"/>
-    <w:link w:val="5"/>
-    <w:uiPriority w:val="9"/>
-    <w:semiHidden/>
-    <w:rPr>
-      <w:rFonts w:cstheme="majorBidi"/>
-      <w:color w:val="0F4761" w:themeColor="accent1" w:themeShade="BF"/>
-      <w:sz w:val="24"/>
-      <w:szCs w:val="24"/>
-    </w:rPr>
-  </w:style>
-  <w:style w:type="character" w:customStyle="1" w:styleId="60">
-    <w:name w:val="标题 6 字符"/>
-    <w:basedOn w:val="a0"/>
-    <w:link w:val="6"/>
-    <w:uiPriority w:val="9"/>
-    <w:semiHidden/>
-    <w:rPr>
-      <w:rFonts w:cstheme="majorBidi"/>
-      <w:b/>
-      <w:bCs/>
-      <w:color w:val="0F4761" w:themeColor="accent1" w:themeShade="BF"/>
-    </w:rPr>
-  </w:style>
-  <w:style w:type="character" w:customStyle="1" w:styleId="70">
-    <w:name w:val="标题 7 字符"/>
-    <w:basedOn w:val="a0"/>
-    <w:link w:val="7"/>
-    <w:uiPriority w:val="9"/>
-    <w:semiHidden/>
-    <w:rPr>
-      <w:rFonts w:cstheme="majorBidi"/>
-      <w:b/>
-      <w:bCs/>
-      <w:color w:val="595959" w:themeColor="text1" w:themeTint="A6"/>
-    </w:rPr>
-  </w:style>
-  <w:style w:type="character" w:customStyle="1" w:styleId="80">
-    <w:name w:val="标题 8 字符"/>
-    <w:basedOn w:val="a0"/>
-    <w:link w:val="8"/>
-    <w:uiPriority w:val="9"/>
-    <w:semiHidden/>
-    <w:rPr>
-      <w:rFonts w:cstheme="majorBidi"/>
-      <w:color w:val="595959" w:themeColor="text1" w:themeTint="A6"/>
-    </w:rPr>
-  </w:style>
-  <w:style w:type="character" w:customStyle="1" w:styleId="90">
-    <w:name w:val="标题 9 字符"/>
-    <w:basedOn w:val="a0"/>
-    <w:link w:val="9"/>
-    <w:uiPriority w:val="9"/>
-    <w:semiHidden/>
-    <w:rPr>
-      <w:rFonts w:eastAsiaTheme="majorEastAsia" w:cstheme="majorBidi"/>
-      <w:color w:val="595959" w:themeColor="text1" w:themeTint="A6"/>
-    </w:rPr>
-  </w:style>
-  <w:style w:type="character" w:customStyle="1" w:styleId="ac">
+  <w:style w:type="character" w:customStyle="1" w:styleId="a4">
     <w:name w:val="标题 字符"/>
     <w:basedOn w:val="a0"/>
-    <w:link w:val="ab"/>
+    <w:link w:val="a3"/>
     <w:uiPriority w:val="10"/>
+    <w:rsid w:val="00184D52"/>
     <w:rPr>
       <w:rFonts w:asciiTheme="majorHAnsi" w:eastAsiaTheme="majorEastAsia" w:hAnsiTheme="majorHAnsi" w:cstheme="majorBidi"/>
       <w:spacing w:val="-10"/>
@@ -3986,11 +4408,21 @@
       <w:szCs w:val="56"/>
     </w:rPr>
   </w:style>
-  <w:style w:type="character" w:customStyle="1" w:styleId="aa">
-    <w:name w:val="副标题 字符"/>
-    <w:basedOn w:val="a0"/>
-    <w:link w:val="a9"/>
+  <w:style w:type="paragraph" w:styleId="a5">
+    <w:name w:val="Subtitle"/>
+    <w:basedOn w:val="a"/>
+    <w:next w:val="a"/>
+    <w:link w:val="a6"/>
     <w:uiPriority w:val="11"/>
+    <w:qFormat/>
+    <w:rsid w:val="00184D52"/>
+    <w:pPr>
+      <w:numPr>
+        <w:ilvl w:val="1"/>
+      </w:numPr>
+      <w:spacing w:after="160"/>
+      <w:jc w:val="center"/>
+    </w:pPr>
     <w:rPr>
       <w:rFonts w:asciiTheme="majorHAnsi" w:eastAsiaTheme="majorEastAsia" w:hAnsiTheme="majorHAnsi" w:cstheme="majorBidi"/>
       <w:color w:val="595959" w:themeColor="text1" w:themeTint="A6"/>
@@ -3999,13 +4431,28 @@
       <w:szCs w:val="28"/>
     </w:rPr>
   </w:style>
-  <w:style w:type="paragraph" w:styleId="ae">
+  <w:style w:type="character" w:customStyle="1" w:styleId="a6">
+    <w:name w:val="副标题 字符"/>
+    <w:basedOn w:val="a0"/>
+    <w:link w:val="a5"/>
+    <w:uiPriority w:val="11"/>
+    <w:rsid w:val="00184D52"/>
+    <w:rPr>
+      <w:rFonts w:asciiTheme="majorHAnsi" w:eastAsiaTheme="majorEastAsia" w:hAnsiTheme="majorHAnsi" w:cstheme="majorBidi"/>
+      <w:color w:val="595959" w:themeColor="text1" w:themeTint="A6"/>
+      <w:spacing w:val="15"/>
+      <w:sz w:val="28"/>
+      <w:szCs w:val="28"/>
+    </w:rPr>
+  </w:style>
+  <w:style w:type="paragraph" w:styleId="a7">
     <w:name w:val="Quote"/>
     <w:basedOn w:val="a"/>
     <w:next w:val="a"/>
-    <w:link w:val="af"/>
+    <w:link w:val="a8"/>
     <w:uiPriority w:val="29"/>
     <w:qFormat/>
+    <w:rsid w:val="00184D52"/>
     <w:pPr>
       <w:spacing w:before="160" w:after="160"/>
       <w:jc w:val="center"/>
@@ -4016,45 +4463,49 @@
       <w:color w:val="404040" w:themeColor="text1" w:themeTint="BF"/>
     </w:rPr>
   </w:style>
-  <w:style w:type="character" w:customStyle="1" w:styleId="af">
+  <w:style w:type="character" w:customStyle="1" w:styleId="a8">
     <w:name w:val="引用 字符"/>
     <w:basedOn w:val="a0"/>
-    <w:link w:val="ae"/>
+    <w:link w:val="a7"/>
     <w:uiPriority w:val="29"/>
+    <w:rsid w:val="00184D52"/>
     <w:rPr>
       <w:i/>
       <w:iCs/>
       <w:color w:val="404040" w:themeColor="text1" w:themeTint="BF"/>
     </w:rPr>
   </w:style>
-  <w:style w:type="paragraph" w:styleId="af0">
+  <w:style w:type="paragraph" w:styleId="a9">
     <w:name w:val="List Paragraph"/>
     <w:basedOn w:val="a"/>
     <w:uiPriority w:val="34"/>
     <w:qFormat/>
+    <w:rsid w:val="00184D52"/>
     <w:pPr>
       <w:ind w:left="720"/>
       <w:contextualSpacing/>
     </w:pPr>
   </w:style>
-  <w:style w:type="character" w:customStyle="1" w:styleId="11">
-    <w:name w:val="明显强调1"/>
+  <w:style w:type="character" w:styleId="aa">
+    <w:name w:val="Intense Emphasis"/>
     <w:basedOn w:val="a0"/>
     <w:uiPriority w:val="21"/>
     <w:qFormat/>
+    <w:rsid w:val="00184D52"/>
     <w:rPr>
       <w:i/>
       <w:iCs/>
       <w:color w:val="0F4761" w:themeColor="accent1" w:themeShade="BF"/>
     </w:rPr>
   </w:style>
-  <w:style w:type="paragraph" w:styleId="af1">
+  <w:style w:type="paragraph" w:styleId="ab">
     <w:name w:val="Intense Quote"/>
     <w:basedOn w:val="a"/>
     <w:next w:val="a"/>
-    <w:link w:val="af2"/>
+    <w:link w:val="ac"/>
     <w:uiPriority w:val="30"/>
     <w:qFormat/>
+    <w:rsid w:val="00184D52"/>
     <w:pPr>
       <w:pBdr>
         <w:top w:val="single" w:sz="4" w:space="10" w:color="0F4761" w:themeColor="accent1" w:themeShade="BF"/>
@@ -4070,22 +4521,24 @@
       <w:color w:val="0F4761" w:themeColor="accent1" w:themeShade="BF"/>
     </w:rPr>
   </w:style>
-  <w:style w:type="character" w:customStyle="1" w:styleId="af2">
+  <w:style w:type="character" w:customStyle="1" w:styleId="ac">
     <w:name w:val="明显引用 字符"/>
     <w:basedOn w:val="a0"/>
-    <w:link w:val="af1"/>
+    <w:link w:val="ab"/>
     <w:uiPriority w:val="30"/>
+    <w:rsid w:val="00184D52"/>
     <w:rPr>
       <w:i/>
       <w:iCs/>
       <w:color w:val="0F4761" w:themeColor="accent1" w:themeShade="BF"/>
     </w:rPr>
   </w:style>
-  <w:style w:type="character" w:customStyle="1" w:styleId="12">
-    <w:name w:val="明显参考1"/>
+  <w:style w:type="character" w:styleId="ad">
+    <w:name w:val="Intense Reference"/>
     <w:basedOn w:val="a0"/>
     <w:uiPriority w:val="32"/>
     <w:qFormat/>
+    <w:rsid w:val="00184D52"/>
     <w:rPr>
       <w:b/>
       <w:bCs/>
@@ -4094,49 +4547,131 @@
       <w:spacing w:val="5"/>
     </w:rPr>
   </w:style>
-  <w:style w:type="character" w:customStyle="1" w:styleId="13">
-    <w:name w:val="未处理的提及1"/>
+  <w:style w:type="character" w:styleId="ae">
+    <w:name w:val="Hyperlink"/>
+    <w:basedOn w:val="a0"/>
+    <w:uiPriority w:val="99"/>
+    <w:unhideWhenUsed/>
+    <w:rsid w:val="00184D52"/>
+    <w:rPr>
+      <w:color w:val="467886" w:themeColor="hyperlink"/>
+      <w:u w:val="single"/>
+    </w:rPr>
+  </w:style>
+  <w:style w:type="character" w:styleId="af">
+    <w:name w:val="Unresolved Mention"/>
     <w:basedOn w:val="a0"/>
     <w:uiPriority w:val="99"/>
     <w:semiHidden/>
     <w:unhideWhenUsed/>
+    <w:rsid w:val="00184D52"/>
     <w:rPr>
       <w:color w:val="605E5C"/>
       <w:shd w:val="clear" w:color="auto" w:fill="E1DFDD"/>
     </w:rPr>
   </w:style>
-  <w:style w:type="character" w:customStyle="1" w:styleId="a8">
-    <w:name w:val="页眉 字符"/>
-    <w:basedOn w:val="a0"/>
-    <w:link w:val="a7"/>
+  <w:style w:type="paragraph" w:styleId="af0">
+    <w:name w:val="header"/>
+    <w:basedOn w:val="a"/>
+    <w:link w:val="af1"/>
     <w:uiPriority w:val="99"/>
+    <w:unhideWhenUsed/>
+    <w:rsid w:val="00184D52"/>
+    <w:pPr>
+      <w:tabs>
+        <w:tab w:val="center" w:pos="4153"/>
+        <w:tab w:val="right" w:pos="8306"/>
+      </w:tabs>
+      <w:snapToGrid w:val="0"/>
+      <w:jc w:val="center"/>
+    </w:pPr>
     <w:rPr>
       <w:sz w:val="18"/>
       <w:szCs w:val="18"/>
     </w:rPr>
   </w:style>
-  <w:style w:type="character" w:customStyle="1" w:styleId="a6">
-    <w:name w:val="页脚 字符"/>
+  <w:style w:type="character" w:customStyle="1" w:styleId="af1">
+    <w:name w:val="页眉 字符"/>
     <w:basedOn w:val="a0"/>
-    <w:link w:val="a5"/>
+    <w:link w:val="af0"/>
     <w:uiPriority w:val="99"/>
+    <w:rsid w:val="00184D52"/>
     <w:rPr>
       <w:sz w:val="18"/>
       <w:szCs w:val="18"/>
     </w:rPr>
   </w:style>
-  <w:style w:type="character" w:customStyle="1" w:styleId="a4">
-    <w:name w:val="正文文本 字符"/>
+  <w:style w:type="paragraph" w:styleId="af2">
+    <w:name w:val="footer"/>
+    <w:basedOn w:val="a"/>
+    <w:link w:val="af3"/>
+    <w:uiPriority w:val="99"/>
+    <w:unhideWhenUsed/>
+    <w:rsid w:val="00184D52"/>
+    <w:pPr>
+      <w:tabs>
+        <w:tab w:val="center" w:pos="4153"/>
+        <w:tab w:val="right" w:pos="8306"/>
+      </w:tabs>
+      <w:snapToGrid w:val="0"/>
+      <w:jc w:val="left"/>
+    </w:pPr>
+    <w:rPr>
+      <w:sz w:val="18"/>
+      <w:szCs w:val="18"/>
+    </w:rPr>
+  </w:style>
+  <w:style w:type="character" w:customStyle="1" w:styleId="af3">
+    <w:name w:val="页脚 字符"/>
     <w:basedOn w:val="a0"/>
-    <w:link w:val="a3"/>
+    <w:link w:val="af2"/>
+    <w:uiPriority w:val="99"/>
+    <w:rsid w:val="00184D52"/>
+    <w:rPr>
+      <w:sz w:val="18"/>
+      <w:szCs w:val="18"/>
+    </w:rPr>
+  </w:style>
+  <w:style w:type="paragraph" w:styleId="af4">
+    <w:name w:val="Body Text"/>
+    <w:basedOn w:val="a"/>
+    <w:link w:val="af5"/>
     <w:uiPriority w:val="1"/>
+    <w:qFormat/>
+    <w:rsid w:val="00A41007"/>
+    <w:pPr>
+      <w:jc w:val="left"/>
+    </w:pPr>
     <w:rPr>
       <w:rFonts w:ascii="DTL Argo T Light" w:hAnsi="DTL Argo T Light" w:cs="DTL Argo T Light"/>
       <w:kern w:val="0"/>
       <w:sz w:val="24"/>
       <w:szCs w:val="24"/>
       <w:lang w:eastAsia="en-US"/>
+      <w:specVanish/>
     </w:rPr>
+  </w:style>
+  <w:style w:type="character" w:customStyle="1" w:styleId="af5">
+    <w:name w:val="正文文本 字符"/>
+    <w:basedOn w:val="a0"/>
+    <w:link w:val="af4"/>
+    <w:uiPriority w:val="1"/>
+    <w:rsid w:val="00A41007"/>
+    <w:rPr>
+      <w:rFonts w:ascii="DTL Argo T Light" w:hAnsi="DTL Argo T Light" w:cs="DTL Argo T Light"/>
+      <w:kern w:val="0"/>
+      <w:sz w:val="24"/>
+      <w:szCs w:val="24"/>
+      <w:lang w:eastAsia="en-US"/>
+      <w:specVanish/>
+    </w:rPr>
+  </w:style>
+  <w:style w:type="paragraph" w:styleId="af6">
+    <w:name w:val="Revision"/>
+    <w:hidden/>
+    <w:uiPriority w:val="99"/>
+    <w:semiHidden/>
+    <w:rsid w:val="00BD2F06"/>
   </w:style>
 </w:styles>
 </file>
@@ -4184,7 +4719,7 @@
     </a:clrScheme>
     <a:fontScheme name="Office">
       <a:majorFont>
-        <a:latin typeface="等线 Light"/>
+        <a:latin typeface="等线 Light" panose="020F0302020204030204"/>
         <a:ea typeface=""/>
         <a:cs typeface=""/>
         <a:font script="Jpan" typeface="游ゴシック Light"/>
@@ -4217,9 +4752,26 @@
         <a:font script="Viet" typeface="Times New Roman"/>
         <a:font script="Uigh" typeface="Microsoft Uighur"/>
         <a:font script="Geor" typeface="Sylfaen"/>
+        <a:font script="Armn" typeface="Arial"/>
+        <a:font script="Bugi" typeface="Leelawadee UI"/>
+        <a:font script="Bopo" typeface="Microsoft JhengHei"/>
+        <a:font script="Java" typeface="Javanese Text"/>
+        <a:font script="Lisu" typeface="Segoe UI"/>
+        <a:font script="Mymr" typeface="Myanmar Text"/>
+        <a:font script="Nkoo" typeface="Ebrima"/>
+        <a:font script="Olck" typeface="Nirmala UI"/>
+        <a:font script="Osma" typeface="Ebrima"/>
+        <a:font script="Phag" typeface="Phagspa"/>
+        <a:font script="Syrn" typeface="Estrangelo Edessa"/>
+        <a:font script="Syrj" typeface="Estrangelo Edessa"/>
+        <a:font script="Syre" typeface="Estrangelo Edessa"/>
+        <a:font script="Sora" typeface="Nirmala UI"/>
+        <a:font script="Tale" typeface="Microsoft Tai Le"/>
+        <a:font script="Talu" typeface="Microsoft New Tai Lue"/>
+        <a:font script="Tfng" typeface="Ebrima"/>
       </a:majorFont>
       <a:minorFont>
-        <a:latin typeface="等线"/>
+        <a:latin typeface="等线" panose="020F0502020204030204"/>
         <a:ea typeface=""/>
         <a:cs typeface=""/>
         <a:font script="Jpan" typeface="游明朝"/>
@@ -4252,6 +4804,23 @@
         <a:font script="Viet" typeface="Arial"/>
         <a:font script="Uigh" typeface="Microsoft Uighur"/>
         <a:font script="Geor" typeface="Sylfaen"/>
+        <a:font script="Armn" typeface="Arial"/>
+        <a:font script="Bugi" typeface="Leelawadee UI"/>
+        <a:font script="Bopo" typeface="Microsoft JhengHei"/>
+        <a:font script="Java" typeface="Javanese Text"/>
+        <a:font script="Lisu" typeface="Segoe UI"/>
+        <a:font script="Mymr" typeface="Myanmar Text"/>
+        <a:font script="Nkoo" typeface="Ebrima"/>
+        <a:font script="Olck" typeface="Nirmala UI"/>
+        <a:font script="Osma" typeface="Ebrima"/>
+        <a:font script="Phag" typeface="Phagspa"/>
+        <a:font script="Syrn" typeface="Estrangelo Edessa"/>
+        <a:font script="Syrj" typeface="Estrangelo Edessa"/>
+        <a:font script="Syre" typeface="Estrangelo Edessa"/>
+        <a:font script="Sora" typeface="Nirmala UI"/>
+        <a:font script="Tale" typeface="Microsoft Tai Le"/>
+        <a:font script="Talu" typeface="Microsoft New Tai Lue"/>
+        <a:font script="Tfng" typeface="Ebrima"/>
       </a:minorFont>
     </a:fontScheme>
     <a:fmtScheme name="Office">
@@ -4394,5 +4963,22 @@
   </a:themeElements>
   <a:objectDefaults/>
   <a:extraClrSchemeLst/>
+  <a:extLst>
+    <a:ext uri="{05A4C25C-085E-4340-85A3-A5531E510DB2}">
+      <thm15:themeFamily xmlns:thm15="http://schemas.microsoft.com/office/thememl/2012/main" name="Office Theme" id="{62F939B6-93AF-4DB8-9C6B-D6C7DFDC589F}" vid="{4A3C46E8-61CC-4603-A589-7422A47A8E4A}"/>
+    </a:ext>
+  </a:extLst>
 </a:theme>
+</file>
+
+<file path=customXml/item1.xml><?xml version="1.0" encoding="utf-8"?>
+<b:Sources xmlns:b="http://schemas.openxmlformats.org/officeDocument/2006/bibliography" xmlns="http://schemas.openxmlformats.org/officeDocument/2006/bibliography" SelectedStyle="\APASixthEditionOfficeOnline.xsl" StyleName="APA" Version="6"/>
+</file>
+
+<file path=customXml/itemProps1.xml><?xml version="1.0" encoding="utf-8"?>
+<ds:datastoreItem xmlns:ds="http://schemas.openxmlformats.org/officeDocument/2006/customXml" ds:itemID="{FE1F1279-7E7E-4C90-9FE5-2893F8946524}">
+  <ds:schemaRefs>
+    <ds:schemaRef ds:uri="http://schemas.openxmlformats.org/officeDocument/2006/bibliography"/>
+  </ds:schemaRefs>
+</ds:datastoreItem>
 </file>
</xml_diff>

<commit_message>
chore(config): 🔨 再次更新 vcm 报告 docx 模板
Why: 上版模板需微调, 二次替换
</commit_message>
<xml_diff>
--- a/public/vcm_report_template_cn.docx
+++ b/public/vcm_report_template_cn.docx
@@ -822,7 +822,6 @@
           <w:szCs w:val="32"/>
         </w:rPr>
       </w:pPr>
-      <w:proofErr w:type="gramStart"/>
       <w:r>
         <w:rPr>
           <w:rFonts w:ascii="宋体" w:eastAsia="宋体" w:hAnsi="宋体" w:hint="eastAsia"/>
@@ -832,7 +831,6 @@
         </w:rPr>
         <w:t>星优阀</w:t>
       </w:r>
-      <w:proofErr w:type="gramEnd"/>
       <w:r>
         <w:rPr>
           <w:rFonts w:ascii="微软雅黑" w:eastAsia="微软雅黑" w:hAnsi="微软雅黑" w:cs="微软雅黑" w:hint="eastAsia"/>
@@ -1273,25 +1271,7 @@
           <w:bCs/>
           <w:color w:val="4C4D4F"/>
         </w:rPr>
-        <w:t>需要注意 - 将控制阀组件的状况定义为“轻微影响”表示存在基本操作，但存在抑制因素。抑制因素包括性能明显下降的指示、发现可能退化的已知指标以及设置、调整或校准不当的指示。这些情况需要详细监控和/或持续关注，以便稍后确定维护和/或其他故障排除。这些情况不太可能导致立即运行停机并确定需要</w:t>
-      </w:r>
-      <w:proofErr w:type="gramStart"/>
-      <w:r>
-        <w:rPr>
-          <w:rFonts w:ascii="宋体" w:eastAsia="宋体" w:hAnsi="宋体" w:cs="DTL Argo T" w:hint="eastAsia"/>
-          <w:bCs/>
-          <w:color w:val="4C4D4F"/>
-        </w:rPr>
-        <w:t>尽快或</w:t>
-      </w:r>
-      <w:proofErr w:type="gramEnd"/>
-      <w:r>
-        <w:rPr>
-          <w:rFonts w:ascii="宋体" w:eastAsia="宋体" w:hAnsi="宋体" w:cs="DTL Argo T" w:hint="eastAsia"/>
-          <w:bCs/>
-          <w:color w:val="4C4D4F"/>
-        </w:rPr>
-        <w:t>尽早进行维护。</w:t>
+        <w:t>需要注意 - 将控制阀组件的状况定义为“轻微影响”表示存在基本操作，但存在抑制因素。抑制因素包括性能明显下降的指示、发现可能退化的已知指标以及设置、调整或校准不当的指示。这些情况需要详细监控和/或持续关注，以便稍后确定维护和/或其他故障排除。这些情况不太可能导致立即运行停机并确定需要尽快或尽早进行维护。</w:t>
       </w:r>
     </w:p>
     <w:p>
@@ -1724,19 +1704,11 @@
         <w:t>chart_valves_health_overview</w:t>
       </w:r>
       <w:proofErr w:type="spellEnd"/>
-      <w:proofErr w:type="gramStart"/>
-      <w:r>
-        <w:rPr>
-          <w:rFonts w:ascii="宋体" w:eastAsia="宋体" w:hAnsi="宋体" w:hint="eastAsia"/>
-        </w:rPr>
-        <w:t>}}{</w:t>
-      </w:r>
-      <w:proofErr w:type="gramEnd"/>
-      <w:r>
-        <w:rPr>
-          <w:rFonts w:ascii="宋体" w:eastAsia="宋体" w:hAnsi="宋体" w:hint="eastAsia"/>
-        </w:rPr>
-        <w:t>{</w:t>
+      <w:r>
+        <w:rPr>
+          <w:rFonts w:ascii="宋体" w:eastAsia="宋体" w:hAnsi="宋体" w:hint="eastAsia"/>
+        </w:rPr>
+        <w:t>}}{{</w:t>
       </w:r>
       <w:proofErr w:type="spellStart"/>
       <w:r>
@@ -2355,7 +2327,7 @@
     </w:p>
     <w:p>
       <w:pPr>
-        <w:jc w:val="left"/>
+        <w:jc w:val="center"/>
         <w:rPr>
           <w:rFonts w:ascii="宋体" w:eastAsia="宋体" w:hAnsi="宋体" w:hint="eastAsia"/>
         </w:rPr>
@@ -2437,18 +2409,6 @@
           <w:docGrid w:type="lines" w:linePitch="312"/>
         </w:sectPr>
       </w:pPr>
-      <w:r>
-        <w:rPr>
-          <w:rFonts w:ascii="宋体" w:eastAsia="宋体" w:hAnsi="宋体" w:cs="DTL Argo T" w:hint="eastAsia"/>
-          <w:b/>
-          <w:bCs/>
-          <w:color w:val="45545D"/>
-          <w:kern w:val="0"/>
-          <w:sz w:val="40"/>
-          <w:szCs w:val="40"/>
-        </w:rPr>
-        <w:br w:type="page"/>
-      </w:r>
     </w:p>
     <w:p>
       <w:pPr>
@@ -2691,18 +2651,6 @@
           <w:docGrid w:type="lines" w:linePitch="312"/>
         </w:sectPr>
       </w:pPr>
-      <w:r>
-        <w:rPr>
-          <w:rFonts w:ascii="宋体" w:eastAsia="宋体" w:hAnsi="宋体" w:cs="DTL Argo T" w:hint="eastAsia"/>
-          <w:b/>
-          <w:bCs/>
-          <w:color w:val="45545D"/>
-          <w:kern w:val="0"/>
-          <w:sz w:val="40"/>
-          <w:szCs w:val="40"/>
-        </w:rPr>
-        <w:br w:type="page"/>
-      </w:r>
     </w:p>
     <w:p>
       <w:pPr>
@@ -2929,12 +2877,6 @@
           <w:docGrid w:type="lines" w:linePitch="312"/>
         </w:sectPr>
       </w:pPr>
-      <w:r>
-        <w:rPr>
-          <w:rFonts w:ascii="宋体" w:eastAsia="宋体" w:hAnsi="宋体" w:hint="eastAsia"/>
-        </w:rPr>
-        <w:br w:type="page"/>
-      </w:r>
     </w:p>
     <w:p>
       <w:pPr>

</xml_diff>